<commit_message>
Fix S-12 document validation and DOCX generation
- Fix required validation for court, suspect/reported person, investigator leader, seized items, and carbon copies
- Fix S-12 DOCX court recipient and investigator rank
- Fix UU Khusus and Additional Law validation and persistence
- Group Pasal references by Undang-Undang in DOCX output
- Update default references and preserve LP/Sprindik references
- Fix Tembusan, signatory, and S-12 form consistency
- Add reported person pivot relation for non-suspect cases
</commit_message>
<xml_diff>
--- a/public/word-template/surat_permintaan_izin_penyitaan.docx
+++ b/public/word-template/surat_permintaan_izin_penyitaan.docx
@@ -73,7 +73,7 @@
                       <w:lang w:val="en-US"/>
                     </w:rPr>
                     <w:drawing>
-                      <wp:inline distT="0" distB="0" distL="0" distR="0" wp14:anchorId="1D461AF8" wp14:editId="11621AEB">
+                      <wp:inline distT="0" distB="0" distL="0" distR="0" wp14:anchorId="1D461AF8" wp14:editId="24A51686">
                         <wp:extent cx="738127" cy="690404"/>
                         <wp:effectExtent l="0" t="0" r="5080" b="0"/>
                         <wp:docPr id="6" name="Picture 6"/>
@@ -797,27 +797,7 @@
                 <w:szCs w:val="24"/>
                 <w:u w:val="single"/>
               </w:rPr>
-              <w:t xml:space="preserve"> </w:t>
-            </w:r>
-            <w:proofErr w:type="spellStart"/>
-            <w:r>
-              <w:rPr>
-                <w:rFonts w:ascii="Arial Narrow" w:hAnsi="Arial Narrow"/>
-                <w:sz w:val="24"/>
-                <w:szCs w:val="24"/>
-                <w:u w:val="single"/>
-              </w:rPr>
-              <w:t>izin</w:t>
-            </w:r>
-            <w:proofErr w:type="spellEnd"/>
-            <w:r>
-              <w:rPr>
-                <w:rFonts w:ascii="Arial Narrow" w:hAnsi="Arial Narrow"/>
-                <w:sz w:val="24"/>
-                <w:szCs w:val="24"/>
-                <w:u w:val="single"/>
-              </w:rPr>
-              <w:t xml:space="preserve"> </w:t>
+              <w:t xml:space="preserve"> izin </w:t>
             </w:r>
             <w:proofErr w:type="spellStart"/>
             <w:r>
@@ -1088,6 +1068,14 @@
                 <w:szCs w:val="24"/>
               </w:rPr>
             </w:pPr>
+            <w:r>
+              <w:rPr>
+                <w:rFonts w:ascii="Arial Narrow" w:hAnsi="Arial Narrow"/>
+                <w:sz w:val="24"/>
+                <w:szCs w:val="24"/>
+              </w:rPr>
+              <w:t xml:space="preserve">KETUA </w:t>
+            </w:r>
             <w:r>
               <w:rPr>
                 <w:rFonts w:ascii="Arial Narrow" w:hAnsi="Arial Narrow"/>
@@ -1680,7 +1668,6 @@
           </w:tcPr>
           <w:p>
             <w:pPr>
-              <w:jc w:val="left"/>
               <w:rPr>
                 <w:rFonts w:ascii="Arial Narrow" w:eastAsia="Times New Roman" w:hAnsi="Arial Narrow" w:cs="Fira Code"/>
                 <w:sz w:val="24"/>
@@ -1697,7 +1684,29 @@
                 <w:shd w:val="clear" w:color="auto" w:fill="FFFFFF"/>
                 <w:lang w:eastAsia="en-ID"/>
               </w:rPr>
-              <w:t>${referenceIteration}</w:t>
+              <w:t>${</w:t>
+            </w:r>
+            <w:proofErr w:type="spellStart"/>
+            <w:r>
+              <w:rPr>
+                <w:rFonts w:ascii="Arial Narrow" w:eastAsia="Times New Roman" w:hAnsi="Arial Narrow" w:cs="Fira Code"/>
+                <w:sz w:val="24"/>
+                <w:szCs w:val="24"/>
+                <w:shd w:val="clear" w:color="auto" w:fill="FFFFFF"/>
+                <w:lang w:eastAsia="en-ID"/>
+              </w:rPr>
+              <w:t>referenceIteration</w:t>
+            </w:r>
+            <w:proofErr w:type="spellEnd"/>
+            <w:r>
+              <w:rPr>
+                <w:rFonts w:ascii="Arial Narrow" w:eastAsia="Times New Roman" w:hAnsi="Arial Narrow" w:cs="Fira Code"/>
+                <w:sz w:val="24"/>
+                <w:szCs w:val="24"/>
+                <w:shd w:val="clear" w:color="auto" w:fill="FFFFFF"/>
+                <w:lang w:eastAsia="en-ID"/>
+              </w:rPr>
+              <w:t>}</w:t>
             </w:r>
           </w:p>
         </w:tc>
@@ -1725,7 +1734,29 @@
                 <w:shd w:val="clear" w:color="auto" w:fill="FFFFFF"/>
                 <w:lang w:eastAsia="en-ID"/>
               </w:rPr>
-              <w:t>${referenceName}</w:t>
+              <w:t>${</w:t>
+            </w:r>
+            <w:proofErr w:type="spellStart"/>
+            <w:r>
+              <w:rPr>
+                <w:rFonts w:ascii="Arial Narrow" w:eastAsia="Times New Roman" w:hAnsi="Arial Narrow" w:cs="Fira Code"/>
+                <w:sz w:val="24"/>
+                <w:szCs w:val="24"/>
+                <w:shd w:val="clear" w:color="auto" w:fill="FFFFFF"/>
+                <w:lang w:eastAsia="en-ID"/>
+              </w:rPr>
+              <w:t>referenceName</w:t>
+            </w:r>
+            <w:proofErr w:type="spellEnd"/>
+            <w:r>
+              <w:rPr>
+                <w:rFonts w:ascii="Arial Narrow" w:eastAsia="Times New Roman" w:hAnsi="Arial Narrow" w:cs="Fira Code"/>
+                <w:sz w:val="24"/>
+                <w:szCs w:val="24"/>
+                <w:shd w:val="clear" w:color="auto" w:fill="FFFFFF"/>
+                <w:lang w:eastAsia="en-ID"/>
+              </w:rPr>
+              <w:t>}</w:t>
             </w:r>
           </w:p>
         </w:tc>
@@ -2504,10 +2535,20 @@
               <w:t>}</w:t>
             </w:r>
           </w:p>
+          <w:p>
+            <w:pPr>
+              <w:jc w:val="both"/>
+              <w:rPr>
+                <w:rFonts w:ascii="Arial Narrow" w:hAnsi="Arial Narrow" w:cs="Arial"/>
+                <w:sz w:val="24"/>
+                <w:szCs w:val="24"/>
+              </w:rPr>
+            </w:pPr>
+          </w:p>
           <w:tbl>
             <w:tblPr>
               <w:tblStyle w:val="TableGrid"/>
-              <w:tblW w:w="7282" w:type="dxa"/>
+              <w:tblW w:w="9684" w:type="dxa"/>
               <w:tblBorders>
                 <w:top w:val="none" w:sz="0" w:space="0" w:color="auto"/>
                 <w:left w:val="none" w:sz="0" w:space="0" w:color="auto"/>
@@ -2527,7 +2568,7 @@
               <w:gridCol w:w="450"/>
               <w:gridCol w:w="1802"/>
               <w:gridCol w:w="79"/>
-              <w:gridCol w:w="4951"/>
+              <w:gridCol w:w="7353"/>
             </w:tblGrid>
             <w:tr>
               <w:tc>
@@ -2536,6 +2577,7 @@
                 </w:tcPr>
                 <w:p>
                   <w:pPr>
+                    <w:spacing w:line="276" w:lineRule="auto"/>
                     <w:jc w:val="both"/>
                     <w:rPr>
                       <w:rFonts w:ascii="Arial Narrow" w:eastAsia="Times New Roman" w:hAnsi="Arial Narrow" w:cs="Fira Code"/>
@@ -2562,6 +2604,7 @@
                 </w:tcPr>
                 <w:p>
                   <w:pPr>
+                    <w:spacing w:line="276" w:lineRule="auto"/>
                     <w:jc w:val="both"/>
                     <w:rPr>
                       <w:rFonts w:ascii="Arial Narrow" w:eastAsia="Times New Roman" w:hAnsi="Arial Narrow" w:cs="Fira Code"/>
@@ -2589,6 +2632,7 @@
                 </w:tcPr>
                 <w:p>
                   <w:pPr>
+                    <w:spacing w:line="276" w:lineRule="auto"/>
                     <w:jc w:val="both"/>
                     <w:rPr>
                       <w:rFonts w:ascii="Arial Narrow" w:eastAsia="Times New Roman" w:hAnsi="Arial Narrow" w:cs="Fira Code"/>
@@ -2612,10 +2656,11 @@
               </w:tc>
               <w:tc>
                 <w:tcPr>
-                  <w:tcW w:w="4951" w:type="dxa"/>
+                  <w:tcW w:w="7353" w:type="dxa"/>
                 </w:tcPr>
                 <w:p>
                   <w:pPr>
+                    <w:spacing w:line="276" w:lineRule="auto"/>
                     <w:jc w:val="both"/>
                     <w:rPr>
                       <w:rFonts w:ascii="Arial Narrow" w:eastAsia="Times New Roman" w:hAnsi="Arial Narrow" w:cs="Fira Code"/>
@@ -2667,6 +2712,7 @@
                 </w:tcPr>
                 <w:p>
                   <w:pPr>
+                    <w:spacing w:line="276" w:lineRule="auto"/>
                     <w:jc w:val="both"/>
                     <w:rPr>
                       <w:rFonts w:ascii="Arial Narrow" w:eastAsia="Times New Roman" w:hAnsi="Arial Narrow" w:cs="Fira Code"/>
@@ -2694,6 +2740,7 @@
                 </w:tcPr>
                 <w:p>
                   <w:pPr>
+                    <w:spacing w:line="276" w:lineRule="auto"/>
                     <w:jc w:val="both"/>
                     <w:rPr>
                       <w:rFonts w:ascii="Arial Narrow" w:eastAsia="Times New Roman" w:hAnsi="Arial Narrow" w:cs="Fira Code"/>
@@ -2745,6 +2792,7 @@
                 </w:tcPr>
                 <w:p>
                   <w:pPr>
+                    <w:spacing w:line="276" w:lineRule="auto"/>
                     <w:jc w:val="both"/>
                     <w:rPr>
                       <w:rFonts w:ascii="Arial Narrow" w:eastAsia="Times New Roman" w:hAnsi="Arial Narrow" w:cs="Fira Code"/>
@@ -2768,10 +2816,11 @@
               </w:tc>
               <w:tc>
                 <w:tcPr>
-                  <w:tcW w:w="4951" w:type="dxa"/>
+                  <w:tcW w:w="7353" w:type="dxa"/>
                 </w:tcPr>
                 <w:p>
                   <w:pPr>
+                    <w:spacing w:line="276" w:lineRule="auto"/>
                     <w:jc w:val="both"/>
                     <w:rPr>
                       <w:rFonts w:ascii="Arial Narrow" w:eastAsia="Times New Roman" w:hAnsi="Arial Narrow" w:cs="Fira Code"/>
@@ -2823,6 +2872,7 @@
                 </w:tcPr>
                 <w:p>
                   <w:pPr>
+                    <w:spacing w:line="276" w:lineRule="auto"/>
                     <w:jc w:val="both"/>
                     <w:rPr>
                       <w:rFonts w:ascii="Arial Narrow" w:eastAsia="Times New Roman" w:hAnsi="Arial Narrow" w:cs="Fira Code"/>
@@ -2850,6 +2900,7 @@
                 </w:tcPr>
                 <w:p>
                   <w:pPr>
+                    <w:spacing w:line="276" w:lineRule="auto"/>
                     <w:jc w:val="both"/>
                     <w:rPr>
                       <w:rFonts w:ascii="Arial Narrow" w:eastAsia="Times New Roman" w:hAnsi="Arial Narrow" w:cs="Fira Code"/>
@@ -2879,6 +2930,7 @@
                 </w:tcPr>
                 <w:p>
                   <w:pPr>
+                    <w:spacing w:line="276" w:lineRule="auto"/>
                     <w:jc w:val="both"/>
                     <w:rPr>
                       <w:rFonts w:ascii="Arial Narrow" w:eastAsia="Times New Roman" w:hAnsi="Arial Narrow" w:cs="Fira Code"/>
@@ -2902,10 +2954,11 @@
               </w:tc>
               <w:tc>
                 <w:tcPr>
-                  <w:tcW w:w="4951" w:type="dxa"/>
+                  <w:tcW w:w="7353" w:type="dxa"/>
                 </w:tcPr>
                 <w:p>
                   <w:pPr>
+                    <w:spacing w:line="276" w:lineRule="auto"/>
                     <w:jc w:val="both"/>
                     <w:rPr>
                       <w:rFonts w:ascii="Arial Narrow" w:eastAsia="Times New Roman" w:hAnsi="Arial Narrow" w:cs="Fira Code"/>
@@ -2957,6 +3010,7 @@
                 </w:tcPr>
                 <w:p>
                   <w:pPr>
+                    <w:spacing w:line="276" w:lineRule="auto"/>
                     <w:jc w:val="both"/>
                     <w:rPr>
                       <w:rFonts w:ascii="Arial Narrow" w:eastAsia="Times New Roman" w:hAnsi="Arial Narrow" w:cs="Fira Code"/>
@@ -2984,6 +3038,7 @@
                 </w:tcPr>
                 <w:p>
                   <w:pPr>
+                    <w:spacing w:line="276" w:lineRule="auto"/>
                     <w:jc w:val="both"/>
                     <w:rPr>
                       <w:rFonts w:ascii="Arial Narrow" w:eastAsia="Times New Roman" w:hAnsi="Arial Narrow" w:cs="Fira Code"/>
@@ -3023,6 +3078,7 @@
                 </w:tcPr>
                 <w:p>
                   <w:pPr>
+                    <w:spacing w:line="276" w:lineRule="auto"/>
                     <w:jc w:val="both"/>
                     <w:rPr>
                       <w:rFonts w:ascii="Arial Narrow" w:eastAsia="Times New Roman" w:hAnsi="Arial Narrow" w:cs="Fira Code"/>
@@ -3046,10 +3102,11 @@
               </w:tc>
               <w:tc>
                 <w:tcPr>
-                  <w:tcW w:w="4951" w:type="dxa"/>
+                  <w:tcW w:w="7353" w:type="dxa"/>
                 </w:tcPr>
                 <w:p>
                   <w:pPr>
+                    <w:spacing w:line="276" w:lineRule="auto"/>
                     <w:jc w:val="both"/>
                     <w:rPr>
                       <w:rFonts w:ascii="Arial Narrow" w:eastAsia="Times New Roman" w:hAnsi="Arial Narrow" w:cs="Fira Code"/>
@@ -3111,6 +3168,7 @@
                 </w:tcPr>
                 <w:p>
                   <w:pPr>
+                    <w:spacing w:line="276" w:lineRule="auto"/>
                     <w:jc w:val="both"/>
                     <w:rPr>
                       <w:rFonts w:ascii="Arial Narrow" w:eastAsia="Times New Roman" w:hAnsi="Arial Narrow" w:cs="Fira Code"/>
@@ -3138,6 +3196,7 @@
                 </w:tcPr>
                 <w:p>
                   <w:pPr>
+                    <w:spacing w:line="276" w:lineRule="auto"/>
                     <w:jc w:val="both"/>
                     <w:rPr>
                       <w:rFonts w:ascii="Arial Narrow" w:eastAsia="Times New Roman" w:hAnsi="Arial Narrow" w:cs="Fira Code"/>
@@ -3211,6 +3270,7 @@
                 </w:tcPr>
                 <w:p>
                   <w:pPr>
+                    <w:spacing w:line="276" w:lineRule="auto"/>
                     <w:jc w:val="both"/>
                     <w:rPr>
                       <w:rFonts w:ascii="Arial Narrow" w:eastAsia="Times New Roman" w:hAnsi="Arial Narrow" w:cs="Fira Code"/>
@@ -3234,10 +3294,11 @@
               </w:tc>
               <w:tc>
                 <w:tcPr>
-                  <w:tcW w:w="4951" w:type="dxa"/>
+                  <w:tcW w:w="7353" w:type="dxa"/>
                 </w:tcPr>
                 <w:p>
                   <w:pPr>
+                    <w:spacing w:line="276" w:lineRule="auto"/>
                     <w:jc w:val="both"/>
                     <w:rPr>
                       <w:rFonts w:ascii="Arial Narrow" w:eastAsia="Times New Roman" w:hAnsi="Arial Narrow" w:cs="Fira Code"/>
@@ -3331,6 +3392,7 @@
                 </w:tcPr>
                 <w:p>
                   <w:pPr>
+                    <w:spacing w:line="276" w:lineRule="auto"/>
                     <w:jc w:val="both"/>
                     <w:rPr>
                       <w:rFonts w:ascii="Arial Narrow" w:eastAsia="Times New Roman" w:hAnsi="Arial Narrow" w:cs="Fira Code"/>
@@ -3358,6 +3420,7 @@
                 </w:tcPr>
                 <w:p>
                   <w:pPr>
+                    <w:spacing w:line="276" w:lineRule="auto"/>
                     <w:jc w:val="both"/>
                     <w:rPr>
                       <w:rFonts w:ascii="Arial Narrow" w:eastAsia="Times New Roman" w:hAnsi="Arial Narrow" w:cs="Fira Code"/>
@@ -3387,6 +3450,7 @@
                 </w:tcPr>
                 <w:p>
                   <w:pPr>
+                    <w:spacing w:line="276" w:lineRule="auto"/>
                     <w:jc w:val="both"/>
                     <w:rPr>
                       <w:rFonts w:ascii="Arial Narrow" w:eastAsia="Times New Roman" w:hAnsi="Arial Narrow" w:cs="Fira Code"/>
@@ -3410,10 +3474,11 @@
               </w:tc>
               <w:tc>
                 <w:tcPr>
-                  <w:tcW w:w="4951" w:type="dxa"/>
+                  <w:tcW w:w="7353" w:type="dxa"/>
                 </w:tcPr>
                 <w:p>
                   <w:pPr>
+                    <w:spacing w:line="276" w:lineRule="auto"/>
                     <w:jc w:val="both"/>
                     <w:rPr>
                       <w:rFonts w:ascii="Arial Narrow" w:eastAsia="Times New Roman" w:hAnsi="Arial Narrow" w:cs="Fira Code"/>
@@ -3465,6 +3530,7 @@
                 </w:tcPr>
                 <w:p>
                   <w:pPr>
+                    <w:spacing w:line="276" w:lineRule="auto"/>
                     <w:jc w:val="both"/>
                     <w:rPr>
                       <w:rFonts w:ascii="Arial Narrow" w:eastAsia="Times New Roman" w:hAnsi="Arial Narrow" w:cs="Fira Code"/>
@@ -3492,6 +3558,7 @@
                 </w:tcPr>
                 <w:p>
                   <w:pPr>
+                    <w:spacing w:line="276" w:lineRule="auto"/>
                     <w:jc w:val="both"/>
                     <w:rPr>
                       <w:rFonts w:ascii="Arial Narrow" w:eastAsia="Times New Roman" w:hAnsi="Arial Narrow" w:cs="Fira Code"/>
@@ -3519,6 +3586,7 @@
                 </w:tcPr>
                 <w:p>
                   <w:pPr>
+                    <w:spacing w:line="276" w:lineRule="auto"/>
                     <w:jc w:val="both"/>
                     <w:rPr>
                       <w:rFonts w:ascii="Arial Narrow" w:eastAsia="Times New Roman" w:hAnsi="Arial Narrow" w:cs="Fira Code"/>
@@ -3542,10 +3610,11 @@
               </w:tc>
               <w:tc>
                 <w:tcPr>
-                  <w:tcW w:w="4951" w:type="dxa"/>
+                  <w:tcW w:w="7353" w:type="dxa"/>
                 </w:tcPr>
                 <w:p>
                   <w:pPr>
+                    <w:spacing w:line="276" w:lineRule="auto"/>
                     <w:jc w:val="both"/>
                     <w:rPr>
                       <w:rFonts w:ascii="Arial Narrow" w:eastAsia="Times New Roman" w:hAnsi="Arial Narrow" w:cs="Fira Code"/>
@@ -3607,6 +3676,7 @@
                 </w:tcPr>
                 <w:p>
                   <w:pPr>
+                    <w:spacing w:line="276" w:lineRule="auto"/>
                     <w:jc w:val="both"/>
                     <w:rPr>
                       <w:rFonts w:ascii="Arial Narrow" w:eastAsia="Times New Roman" w:hAnsi="Arial Narrow" w:cs="Fira Code"/>
@@ -3634,6 +3704,7 @@
                 </w:tcPr>
                 <w:p>
                   <w:pPr>
+                    <w:spacing w:line="276" w:lineRule="auto"/>
                     <w:jc w:val="both"/>
                     <w:rPr>
                       <w:rFonts w:ascii="Arial Narrow" w:eastAsia="Times New Roman" w:hAnsi="Arial Narrow" w:cs="Fira Code"/>
@@ -3663,6 +3734,7 @@
                 </w:tcPr>
                 <w:p>
                   <w:pPr>
+                    <w:spacing w:line="276" w:lineRule="auto"/>
                     <w:jc w:val="both"/>
                     <w:rPr>
                       <w:rFonts w:ascii="Arial Narrow" w:eastAsia="Times New Roman" w:hAnsi="Arial Narrow" w:cs="Fira Code"/>
@@ -3686,23 +3758,15 @@
               </w:tc>
               <w:tc>
                 <w:tcPr>
-                  <w:tcW w:w="4951" w:type="dxa"/>
+                  <w:tcW w:w="7353" w:type="dxa"/>
                 </w:tcPr>
                 <w:p>
                   <w:pPr>
                     <w:tabs>
                       <w:tab w:val="left" w:pos="559"/>
                     </w:tabs>
+                    <w:spacing w:line="276" w:lineRule="auto"/>
                     <w:jc w:val="both"/>
-                    <w:rPr>
-                      <w:rFonts w:ascii="Arial Narrow" w:eastAsia="Times New Roman" w:hAnsi="Arial Narrow" w:cs="Fira Code"/>
-                      <w:sz w:val="24"/>
-                      <w:szCs w:val="24"/>
-                      <w:shd w:val="clear" w:color="auto" w:fill="FFFFFF"/>
-                      <w:lang w:eastAsia="en-ID"/>
-                    </w:rPr>
-                  </w:pPr>
-                  <w:r>
                     <w:rPr>
                       <w:rFonts w:ascii="Arial Narrow" w:eastAsia="Arial Narrow" w:hAnsi="Arial Narrow"/>
                       <w:bCs/>
@@ -3710,9 +3774,7 @@
                       <w:sz w:val="24"/>
                       <w:szCs w:val="24"/>
                     </w:rPr>
-                    <w:t>${</w:t>
-                  </w:r>
-                  <w:proofErr w:type="spellStart"/>
+                  </w:pPr>
                   <w:r>
                     <w:rPr>
                       <w:rFonts w:ascii="Arial Narrow" w:eastAsia="Arial Narrow" w:hAnsi="Arial Narrow"/>
@@ -3721,8 +3783,9 @@
                       <w:sz w:val="24"/>
                       <w:szCs w:val="24"/>
                     </w:rPr>
-                    <w:t>suspect</w:t>
-                  </w:r>
+                    <w:t>${</w:t>
+                  </w:r>
+                  <w:proofErr w:type="spellStart"/>
                   <w:r>
                     <w:rPr>
                       <w:rFonts w:ascii="Arial Narrow" w:eastAsia="Arial Narrow" w:hAnsi="Arial Narrow"/>
@@ -3731,7 +3794,7 @@
                       <w:sz w:val="24"/>
                       <w:szCs w:val="24"/>
                     </w:rPr>
-                    <w:t>Full</w:t>
+                    <w:t>suspect</w:t>
                   </w:r>
                   <w:r>
                     <w:rPr>
@@ -3741,9 +3804,8 @@
                       <w:sz w:val="24"/>
                       <w:szCs w:val="24"/>
                     </w:rPr>
-                    <w:t>Address</w:t>
-                  </w:r>
-                  <w:proofErr w:type="spellEnd"/>
+                    <w:t>Full</w:t>
+                  </w:r>
                   <w:r>
                     <w:rPr>
                       <w:rFonts w:ascii="Arial Narrow" w:eastAsia="Arial Narrow" w:hAnsi="Arial Narrow"/>
@@ -3752,8 +3814,34 @@
                       <w:sz w:val="24"/>
                       <w:szCs w:val="24"/>
                     </w:rPr>
+                    <w:t>Address</w:t>
+                  </w:r>
+                  <w:proofErr w:type="spellEnd"/>
+                  <w:r>
+                    <w:rPr>
+                      <w:rFonts w:ascii="Arial Narrow" w:eastAsia="Arial Narrow" w:hAnsi="Arial Narrow"/>
+                      <w:bCs/>
+                      <w:color w:val="000000"/>
+                      <w:sz w:val="24"/>
+                      <w:szCs w:val="24"/>
+                    </w:rPr>
                     <w:t>}</w:t>
                   </w:r>
+                </w:p>
+                <w:p>
+                  <w:pPr>
+                    <w:tabs>
+                      <w:tab w:val="left" w:pos="559"/>
+                    </w:tabs>
+                    <w:jc w:val="both"/>
+                    <w:rPr>
+                      <w:rFonts w:ascii="Arial Narrow" w:eastAsia="Times New Roman" w:hAnsi="Arial Narrow" w:cs="Fira Code"/>
+                      <w:sz w:val="24"/>
+                      <w:szCs w:val="24"/>
+                      <w:shd w:val="clear" w:color="auto" w:fill="FFFFFF"/>
+                      <w:lang w:eastAsia="en-ID"/>
+                    </w:rPr>
+                  </w:pPr>
                 </w:p>
               </w:tc>
             </w:tr>
@@ -4321,7 +4409,7 @@
                 <w:sz w:val="24"/>
                 <w:szCs w:val="24"/>
               </w:rPr>
-              <w:t>poin</w:t>
+              <w:t>dengan</w:t>
             </w:r>
             <w:proofErr w:type="spellEnd"/>
             <w:r>
@@ -4341,17 +4429,17 @@
                 <w:sz w:val="24"/>
                 <w:szCs w:val="24"/>
               </w:rPr>
-              <w:t>satu</w:t>
-            </w:r>
-            <w:proofErr w:type="spellEnd"/>
-            <w:r>
-              <w:rPr>
-                <w:rFonts w:ascii="Arial Narrow" w:hAnsi="Arial Narrow" w:cs="Arial"/>
-                <w:color w:val="000000"/>
-                <w:sz w:val="24"/>
-                <w:szCs w:val="24"/>
-              </w:rPr>
-              <w:t xml:space="preserve"> dan dua </w:t>
+              <w:t>hal</w:t>
+            </w:r>
+            <w:proofErr w:type="spellEnd"/>
+            <w:r>
+              <w:rPr>
+                <w:rFonts w:ascii="Arial Narrow" w:hAnsi="Arial Narrow" w:cs="Arial"/>
+                <w:color w:val="000000"/>
+                <w:sz w:val="24"/>
+                <w:szCs w:val="24"/>
+              </w:rPr>
+              <w:t xml:space="preserve"> </w:t>
             </w:r>
             <w:proofErr w:type="spellStart"/>
             <w:r>
@@ -4371,7 +4459,36 @@
                 <w:sz w:val="24"/>
                 <w:szCs w:val="24"/>
               </w:rPr>
-              <w:t xml:space="preserve">, Bersama </w:t>
+              <w:t xml:space="preserve">, </w:t>
+            </w:r>
+            <w:proofErr w:type="spellStart"/>
+            <w:r>
+              <w:rPr>
+                <w:rFonts w:ascii="Arial Narrow" w:hAnsi="Arial Narrow" w:cs="Arial"/>
+                <w:color w:val="000000"/>
+                <w:sz w:val="24"/>
+                <w:szCs w:val="24"/>
+              </w:rPr>
+              <w:t>b</w:t>
+            </w:r>
+            <w:r>
+              <w:rPr>
+                <w:rFonts w:ascii="Arial Narrow" w:hAnsi="Arial Narrow" w:cs="Arial"/>
+                <w:color w:val="000000"/>
+                <w:sz w:val="24"/>
+                <w:szCs w:val="24"/>
+              </w:rPr>
+              <w:t>ersama</w:t>
+            </w:r>
+            <w:proofErr w:type="spellEnd"/>
+            <w:r>
+              <w:rPr>
+                <w:rFonts w:ascii="Arial Narrow" w:hAnsi="Arial Narrow" w:cs="Arial"/>
+                <w:color w:val="000000"/>
+                <w:sz w:val="24"/>
+                <w:szCs w:val="24"/>
+              </w:rPr>
+              <w:t xml:space="preserve"> </w:t>
             </w:r>
             <w:proofErr w:type="spellStart"/>
             <w:r>
@@ -4621,7 +4738,16 @@
                 <w:sz w:val="24"/>
                 <w:szCs w:val="24"/>
               </w:rPr>
-              <w:t>Tindak</w:t>
+              <w:t>t</w:t>
+            </w:r>
+            <w:r>
+              <w:rPr>
+                <w:rFonts w:ascii="Arial Narrow" w:hAnsi="Arial Narrow" w:cs="Arial"/>
+                <w:color w:val="000000"/>
+                <w:sz w:val="24"/>
+                <w:szCs w:val="24"/>
+              </w:rPr>
+              <w:t>indak</w:t>
             </w:r>
             <w:proofErr w:type="spellEnd"/>
             <w:r>
@@ -4641,7 +4767,16 @@
                 <w:sz w:val="24"/>
                 <w:szCs w:val="24"/>
               </w:rPr>
-              <w:t>Pidana</w:t>
+              <w:t>p</w:t>
+            </w:r>
+            <w:r>
+              <w:rPr>
+                <w:rFonts w:ascii="Arial Narrow" w:hAnsi="Arial Narrow" w:cs="Arial"/>
+                <w:color w:val="000000"/>
+                <w:sz w:val="24"/>
+                <w:szCs w:val="24"/>
+              </w:rPr>
+              <w:t>idana</w:t>
             </w:r>
             <w:proofErr w:type="spellEnd"/>
             <w:r>
@@ -4831,17 +4966,17 @@
                 <w:sz w:val="24"/>
                 <w:szCs w:val="24"/>
               </w:rPr>
-              <w:t xml:space="preserve">. Agar </w:t>
-            </w:r>
-            <w:proofErr w:type="spellStart"/>
-            <w:r>
-              <w:rPr>
-                <w:rFonts w:ascii="Arial Narrow" w:hAnsi="Arial Narrow" w:cs="Arial"/>
-                <w:color w:val="000000"/>
-                <w:sz w:val="24"/>
-                <w:szCs w:val="24"/>
-              </w:rPr>
-              <w:t>lebih</w:t>
+              <w:t xml:space="preserve">. </w:t>
+            </w:r>
+            <w:proofErr w:type="spellStart"/>
+            <w:r>
+              <w:rPr>
+                <w:rFonts w:ascii="Arial Narrow" w:hAnsi="Arial Narrow" w:cs="Arial"/>
+                <w:color w:val="000000"/>
+                <w:sz w:val="24"/>
+                <w:szCs w:val="24"/>
+              </w:rPr>
+              <w:t>Untuk</w:t>
             </w:r>
             <w:proofErr w:type="spellEnd"/>
             <w:r>
@@ -4881,6 +5016,35 @@
                 <w:sz w:val="24"/>
                 <w:szCs w:val="24"/>
               </w:rPr>
+              <w:t>berkomunikasi</w:t>
+            </w:r>
+            <w:proofErr w:type="spellEnd"/>
+            <w:r>
+              <w:rPr>
+                <w:rFonts w:ascii="Arial Narrow" w:hAnsi="Arial Narrow" w:cs="Arial"/>
+                <w:color w:val="000000"/>
+                <w:sz w:val="24"/>
+                <w:szCs w:val="24"/>
+              </w:rPr>
+              <w:t xml:space="preserve"> </w:t>
+            </w:r>
+            <w:r>
+              <w:rPr>
+                <w:rFonts w:ascii="Arial Narrow" w:hAnsi="Arial Narrow" w:cs="Arial"/>
+                <w:color w:val="000000"/>
+                <w:sz w:val="24"/>
+                <w:szCs w:val="24"/>
+              </w:rPr>
+              <w:t xml:space="preserve">dan </w:t>
+            </w:r>
+            <w:proofErr w:type="spellStart"/>
+            <w:r>
+              <w:rPr>
+                <w:rFonts w:ascii="Arial Narrow" w:hAnsi="Arial Narrow" w:cs="Arial"/>
+                <w:color w:val="000000"/>
+                <w:sz w:val="24"/>
+                <w:szCs w:val="24"/>
+              </w:rPr>
               <w:t>berkoordinasi</w:t>
             </w:r>
             <w:proofErr w:type="spellEnd"/>
@@ -4891,26 +5055,6 @@
                 <w:sz w:val="24"/>
                 <w:szCs w:val="24"/>
               </w:rPr>
-              <w:t xml:space="preserve"> dan </w:t>
-            </w:r>
-            <w:proofErr w:type="spellStart"/>
-            <w:r>
-              <w:rPr>
-                <w:rFonts w:ascii="Arial Narrow" w:hAnsi="Arial Narrow" w:cs="Arial"/>
-                <w:color w:val="000000"/>
-                <w:sz w:val="24"/>
-                <w:szCs w:val="24"/>
-              </w:rPr>
-              <w:t>berkomunikasi</w:t>
-            </w:r>
-            <w:proofErr w:type="spellEnd"/>
-            <w:r>
-              <w:rPr>
-                <w:rFonts w:ascii="Arial Narrow" w:hAnsi="Arial Narrow" w:cs="Arial"/>
-                <w:color w:val="000000"/>
-                <w:sz w:val="24"/>
-                <w:szCs w:val="24"/>
-              </w:rPr>
               <w:t xml:space="preserve"> </w:t>
             </w:r>
             <w:proofErr w:type="spellStart"/>
@@ -4953,14 +5097,25 @@
               </w:rPr>
               <w:t xml:space="preserve"> </w:t>
             </w:r>
-            <w:r>
-              <w:rPr>
-                <w:rFonts w:ascii="Arial Narrow" w:hAnsi="Arial Narrow" w:cs="Arial"/>
-                <w:color w:val="000000"/>
-                <w:sz w:val="24"/>
-                <w:szCs w:val="24"/>
-              </w:rPr>
-              <w:t xml:space="preserve">penyidik </w:t>
+            <w:proofErr w:type="spellStart"/>
+            <w:r>
+              <w:rPr>
+                <w:rFonts w:ascii="Arial Narrow" w:hAnsi="Arial Narrow" w:cs="Arial"/>
+                <w:color w:val="000000"/>
+                <w:sz w:val="24"/>
+                <w:szCs w:val="24"/>
+              </w:rPr>
+              <w:t>penyidik</w:t>
+            </w:r>
+            <w:proofErr w:type="spellEnd"/>
+            <w:r>
+              <w:rPr>
+                <w:rFonts w:ascii="Arial Narrow" w:hAnsi="Arial Narrow" w:cs="Arial"/>
+                <w:color w:val="000000"/>
+                <w:sz w:val="24"/>
+                <w:szCs w:val="24"/>
+              </w:rPr>
+              <w:t xml:space="preserve"> </w:t>
             </w:r>
             <w:proofErr w:type="spellStart"/>
             <w:r>
@@ -5062,69 +5217,17 @@
               </w:rPr>
               <w:t>}.</w:t>
             </w:r>
-          </w:p>
-        </w:tc>
-      </w:tr>
-    </w:tbl>
-    <w:p>
-      <w:r>
-        <w:br w:type="page"/>
-      </w:r>
-    </w:p>
-    <w:tbl>
-      <w:tblPr>
-        <w:tblStyle w:val="TableGrid"/>
-        <w:tblW w:w="19137" w:type="dxa"/>
-        <w:tblBorders>
-          <w:top w:val="none" w:sz="0" w:space="0" w:color="auto"/>
-          <w:left w:val="none" w:sz="0" w:space="0" w:color="auto"/>
-          <w:bottom w:val="none" w:sz="0" w:space="0" w:color="auto"/>
-          <w:right w:val="none" w:sz="0" w:space="0" w:color="auto"/>
-          <w:insideH w:val="none" w:sz="0" w:space="0" w:color="auto"/>
-          <w:insideV w:val="none" w:sz="0" w:space="0" w:color="auto"/>
-        </w:tblBorders>
-        <w:tblLayout w:type="fixed"/>
-        <w:tblCellMar>
-          <w:left w:w="0" w:type="dxa"/>
-          <w:right w:w="0" w:type="dxa"/>
-        </w:tblCellMar>
-        <w:tblLook w:val="04A0" w:firstRow="1" w:lastRow="0" w:firstColumn="1" w:lastColumn="0" w:noHBand="0" w:noVBand="1"/>
-      </w:tblPr>
-      <w:tblGrid>
-        <w:gridCol w:w="284"/>
-        <w:gridCol w:w="18840"/>
-        <w:gridCol w:w="13"/>
-      </w:tblGrid>
-      <w:tr>
-        <w:tc>
-          <w:tcPr>
-            <w:tcW w:w="19137" w:type="dxa"/>
-            <w:gridSpan w:val="3"/>
-          </w:tcPr>
-          <w:p>
-            <w:pPr>
-              <w:tabs>
-                <w:tab w:val="left" w:pos="1152"/>
-              </w:tabs>
-              <w:jc w:val="both"/>
-              <w:rPr>
-                <w:rFonts w:ascii="Arial Narrow" w:hAnsi="Arial Narrow" w:cs="Arial"/>
-                <w:color w:val="000000"/>
-                <w:sz w:val="24"/>
-                <w:szCs w:val="24"/>
-              </w:rPr>
-            </w:pPr>
           </w:p>
         </w:tc>
       </w:tr>
       <w:tr>
         <w:trPr>
           <w:gridAfter w:val="1"/>
-          <w:wAfter w:w="13" w:type="dxa"/>
+          <w:wAfter w:w="9356" w:type="dxa"/>
         </w:trPr>
         <w:tc>
           <w:tcPr>
-            <w:tcW w:w="284" w:type="dxa"/>
+            <w:tcW w:w="226" w:type="dxa"/>
           </w:tcPr>
           <w:p>
             <w:pPr>
@@ -5137,28 +5240,18 @@
                 <w:lang w:eastAsia="en-ID"/>
               </w:rPr>
             </w:pPr>
-            <w:r>
-              <w:rPr>
-                <w:rFonts w:ascii="Arial Narrow" w:eastAsia="Times New Roman" w:hAnsi="Arial Narrow" w:cs="Fira Code"/>
-                <w:sz w:val="24"/>
-                <w:szCs w:val="24"/>
-                <w:shd w:val="clear" w:color="auto" w:fill="FFFFFF"/>
-                <w:lang w:eastAsia="en-ID"/>
-              </w:rPr>
-              <w:t>4.</w:t>
-            </w:r>
           </w:p>
         </w:tc>
         <w:tc>
           <w:tcPr>
-            <w:tcW w:w="18840" w:type="dxa"/>
+            <w:tcW w:w="9697" w:type="dxa"/>
+            <w:gridSpan w:val="3"/>
           </w:tcPr>
           <w:p>
             <w:pPr>
               <w:tabs>
                 <w:tab w:val="left" w:pos="1152"/>
               </w:tabs>
-              <w:ind w:left="-4"/>
               <w:jc w:val="both"/>
               <w:rPr>
                 <w:rFonts w:ascii="Arial Narrow" w:hAnsi="Arial Narrow" w:cs="Arial"/>
@@ -5167,6 +5260,59 @@
                 <w:szCs w:val="24"/>
               </w:rPr>
             </w:pPr>
+          </w:p>
+        </w:tc>
+      </w:tr>
+      <w:tr>
+        <w:trPr>
+          <w:gridAfter w:val="1"/>
+          <w:wAfter w:w="9356" w:type="dxa"/>
+        </w:trPr>
+        <w:tc>
+          <w:tcPr>
+            <w:tcW w:w="226" w:type="dxa"/>
+          </w:tcPr>
+          <w:p>
+            <w:pPr>
+              <w:jc w:val="both"/>
+              <w:rPr>
+                <w:rFonts w:ascii="Arial Narrow" w:eastAsia="Times New Roman" w:hAnsi="Arial Narrow" w:cs="Fira Code"/>
+                <w:sz w:val="24"/>
+                <w:szCs w:val="24"/>
+                <w:shd w:val="clear" w:color="auto" w:fill="FFFFFF"/>
+                <w:lang w:eastAsia="en-ID"/>
+              </w:rPr>
+            </w:pPr>
+            <w:r>
+              <w:rPr>
+                <w:rFonts w:ascii="Arial Narrow" w:eastAsia="Times New Roman" w:hAnsi="Arial Narrow" w:cs="Fira Code"/>
+                <w:sz w:val="24"/>
+                <w:szCs w:val="24"/>
+                <w:shd w:val="clear" w:color="auto" w:fill="FFFFFF"/>
+                <w:lang w:eastAsia="en-ID"/>
+              </w:rPr>
+              <w:t>4.</w:t>
+            </w:r>
+          </w:p>
+        </w:tc>
+        <w:tc>
+          <w:tcPr>
+            <w:tcW w:w="9697" w:type="dxa"/>
+            <w:gridSpan w:val="3"/>
+          </w:tcPr>
+          <w:p>
+            <w:pPr>
+              <w:tabs>
+                <w:tab w:val="left" w:pos="1152"/>
+              </w:tabs>
+              <w:jc w:val="both"/>
+              <w:rPr>
+                <w:rFonts w:ascii="Arial Narrow" w:hAnsi="Arial Narrow" w:cs="Arial"/>
+                <w:color w:val="000000"/>
+                <w:sz w:val="24"/>
+                <w:szCs w:val="24"/>
+              </w:rPr>
+            </w:pPr>
             <w:proofErr w:type="spellStart"/>
             <w:r>
               <w:rPr>
@@ -5236,6 +5382,126 @@
                 <w:szCs w:val="24"/>
               </w:rPr>
               <w:t>maklum</w:t>
+            </w:r>
+            <w:proofErr w:type="spellEnd"/>
+            <w:r>
+              <w:rPr>
+                <w:rFonts w:ascii="Arial Narrow" w:hAnsi="Arial Narrow" w:cs="Arial"/>
+                <w:color w:val="000000"/>
+                <w:sz w:val="24"/>
+                <w:szCs w:val="24"/>
+              </w:rPr>
+              <w:t xml:space="preserve">, </w:t>
+            </w:r>
+            <w:proofErr w:type="spellStart"/>
+            <w:r>
+              <w:rPr>
+                <w:rFonts w:ascii="Arial Narrow" w:hAnsi="Arial Narrow" w:cs="Arial"/>
+                <w:color w:val="000000"/>
+                <w:sz w:val="24"/>
+                <w:szCs w:val="24"/>
+              </w:rPr>
+              <w:t>atas</w:t>
+            </w:r>
+            <w:proofErr w:type="spellEnd"/>
+            <w:r>
+              <w:rPr>
+                <w:rFonts w:ascii="Arial Narrow" w:hAnsi="Arial Narrow" w:cs="Arial"/>
+                <w:color w:val="000000"/>
+                <w:sz w:val="24"/>
+                <w:szCs w:val="24"/>
+              </w:rPr>
+              <w:t xml:space="preserve"> </w:t>
+            </w:r>
+            <w:proofErr w:type="spellStart"/>
+            <w:r>
+              <w:rPr>
+                <w:rFonts w:ascii="Arial Narrow" w:hAnsi="Arial Narrow" w:cs="Arial"/>
+                <w:color w:val="000000"/>
+                <w:sz w:val="24"/>
+                <w:szCs w:val="24"/>
+              </w:rPr>
+              <w:t>perhatian</w:t>
+            </w:r>
+            <w:proofErr w:type="spellEnd"/>
+            <w:r>
+              <w:rPr>
+                <w:rFonts w:ascii="Arial Narrow" w:hAnsi="Arial Narrow" w:cs="Arial"/>
+                <w:color w:val="000000"/>
+                <w:sz w:val="24"/>
+                <w:szCs w:val="24"/>
+              </w:rPr>
+              <w:t xml:space="preserve"> dan </w:t>
+            </w:r>
+            <w:proofErr w:type="spellStart"/>
+            <w:r>
+              <w:rPr>
+                <w:rFonts w:ascii="Arial Narrow" w:hAnsi="Arial Narrow" w:cs="Arial"/>
+                <w:color w:val="000000"/>
+                <w:sz w:val="24"/>
+                <w:szCs w:val="24"/>
+              </w:rPr>
+              <w:t>kerjasamanya</w:t>
+            </w:r>
+            <w:proofErr w:type="spellEnd"/>
+            <w:r>
+              <w:rPr>
+                <w:rFonts w:ascii="Arial Narrow" w:hAnsi="Arial Narrow" w:cs="Arial"/>
+                <w:color w:val="000000"/>
+                <w:sz w:val="24"/>
+                <w:szCs w:val="24"/>
+              </w:rPr>
+              <w:t xml:space="preserve"> </w:t>
+            </w:r>
+            <w:proofErr w:type="spellStart"/>
+            <w:r>
+              <w:rPr>
+                <w:rFonts w:ascii="Arial Narrow" w:hAnsi="Arial Narrow" w:cs="Arial"/>
+                <w:color w:val="000000"/>
+                <w:sz w:val="24"/>
+                <w:szCs w:val="24"/>
+              </w:rPr>
+              <w:t>diucapkan</w:t>
+            </w:r>
+            <w:proofErr w:type="spellEnd"/>
+            <w:r>
+              <w:rPr>
+                <w:rFonts w:ascii="Arial Narrow" w:hAnsi="Arial Narrow" w:cs="Arial"/>
+                <w:color w:val="000000"/>
+                <w:sz w:val="24"/>
+                <w:szCs w:val="24"/>
+              </w:rPr>
+              <w:t xml:space="preserve"> </w:t>
+            </w:r>
+            <w:proofErr w:type="spellStart"/>
+            <w:r>
+              <w:rPr>
+                <w:rFonts w:ascii="Arial Narrow" w:hAnsi="Arial Narrow" w:cs="Arial"/>
+                <w:color w:val="000000"/>
+                <w:sz w:val="24"/>
+                <w:szCs w:val="24"/>
+              </w:rPr>
+              <w:t>terima</w:t>
+            </w:r>
+            <w:proofErr w:type="spellEnd"/>
+            <w:r>
+              <w:rPr>
+                <w:rFonts w:ascii="Arial Narrow" w:hAnsi="Arial Narrow" w:cs="Arial"/>
+                <w:color w:val="000000"/>
+                <w:sz w:val="24"/>
+                <w:szCs w:val="24"/>
+              </w:rPr>
+              <w:t xml:space="preserve"> </w:t>
+            </w:r>
+            <w:proofErr w:type="spellStart"/>
+            <w:r>
+              <w:rPr>
+                <w:rFonts w:ascii="Arial Narrow" w:hAnsi="Arial Narrow" w:cs="Arial"/>
+                <w:color w:val="000000"/>
+                <w:sz w:val="24"/>
+                <w:szCs w:val="24"/>
+              </w:rPr>
+              <w:t>kasih</w:t>
             </w:r>
             <w:proofErr w:type="spellEnd"/>
             <w:r>
@@ -5251,6 +5517,7 @@
         </w:tc>
       </w:tr>
     </w:tbl>
+    <w:p/>
     <w:tbl>
       <w:tblPr>
         <w:tblStyle w:val="TableGrid"/>
@@ -5686,6 +5953,7 @@
                       <w:sz w:val="24"/>
                       <w:szCs w:val="24"/>
                     </w:rPr>
+                    <w:lastRenderedPageBreak/>
                     <w:t>${</w:t>
                   </w:r>
                   <w:proofErr w:type="spellStart"/>
@@ -5740,6 +6008,7 @@
                       <w:sz w:val="24"/>
                       <w:szCs w:val="24"/>
                     </w:rPr>
+                    <w:lastRenderedPageBreak/>
                     <w:t>${</w:t>
                   </w:r>
                   <w:proofErr w:type="spellStart"/>
@@ -6271,14 +6540,7 @@
               <w:rFonts w:ascii="Arial Narrow" w:hAnsi="Arial Narrow"/>
               <w:noProof/>
             </w:rPr>
-            <w:t xml:space="preserve">PERMINTAAN </w:t>
-          </w:r>
-          <w:r>
-            <w:rPr>
-              <w:rFonts w:ascii="Arial Narrow" w:hAnsi="Arial Narrow"/>
-              <w:noProof/>
-            </w:rPr>
-            <w:t>IZIN PENYITAAN</w:t>
+            <w:t>PERMINTAAN IZIN PENYITAAN</w:t>
           </w:r>
         </w:p>
       </w:tc>

</xml_diff>

<commit_message>
Perbaikan bug dan tampilan form S-12 dan S-13
- Perbaikan pengelompokan Pasal berdasarkan UU pada dokumen S-12.
- Menghapus fallback "Tanpa UU" pada output DOCX S-12.
- Perbaikan handling relasi CrimeConstitution pada pembentukan Pasal/UU.
- Perbaikan data kewarganegaraan tersangka dan terlapor pada S-12 dan S-13.
- Perbaikan alignment tabel Pasal pada form Edit S-12.
- Perbaikan alignment label Pengadilan Negeri Tujuan pada form Create dan Edit S-12.
</commit_message>
<xml_diff>
--- a/public/word-template/surat_permintaan_izin_penyitaan.docx
+++ b/public/word-template/surat_permintaan_izin_penyitaan.docx
@@ -73,7 +73,7 @@
                       <w:lang w:val="en-US"/>
                     </w:rPr>
                     <w:drawing>
-                      <wp:inline distT="0" distB="0" distL="0" distR="0" wp14:anchorId="1D461AF8" wp14:editId="24A51686">
+                      <wp:inline distT="0" distB="0" distL="0" distR="0" wp14:anchorId="1D461AF8" wp14:editId="61BA9A21">
                         <wp:extent cx="738127" cy="690404"/>
                         <wp:effectExtent l="0" t="0" r="5080" b="0"/>
                         <wp:docPr id="6" name="Picture 6"/>
@@ -161,7 +161,6 @@
                     </w:rPr>
                     <w:t>${</w:t>
                   </w:r>
-                  <w:proofErr w:type="spellStart"/>
                   <w:r>
                     <w:rPr>
                       <w:rFonts w:ascii="Arial Narrow" w:hAnsi="Arial Narrow"/>
@@ -170,7 +169,6 @@
                     </w:rPr>
                     <w:t>daerahPoliceFullName</w:t>
                   </w:r>
-                  <w:proofErr w:type="spellEnd"/>
                   <w:r>
                     <w:rPr>
                       <w:rFonts w:ascii="Arial Narrow" w:hAnsi="Arial Narrow"/>
@@ -190,7 +188,6 @@
                     </w:rPr>
                     <w:t>${</w:t>
                   </w:r>
-                  <w:proofErr w:type="spellStart"/>
                   <w:r>
                     <w:rPr>
                       <w:rFonts w:ascii="Arial Narrow" w:hAnsi="Arial Narrow"/>
@@ -199,7 +196,6 @@
                     </w:rPr>
                     <w:t>resorPoliceFullName</w:t>
                   </w:r>
-                  <w:proofErr w:type="spellEnd"/>
                   <w:r>
                     <w:rPr>
                       <w:rFonts w:ascii="Arial Narrow" w:hAnsi="Arial Narrow"/>
@@ -219,7 +215,6 @@
                     </w:rPr>
                     <w:t>${</w:t>
                   </w:r>
-                  <w:proofErr w:type="spellStart"/>
                   <w:r>
                     <w:rPr>
                       <w:rFonts w:ascii="Arial Narrow" w:hAnsi="Arial Narrow"/>
@@ -228,7 +223,6 @@
                     </w:rPr>
                     <w:t>resorPoliceAddress</w:t>
                   </w:r>
-                  <w:proofErr w:type="spellEnd"/>
                   <w:r>
                     <w:rPr>
                       <w:rFonts w:ascii="Arial Narrow" w:hAnsi="Arial Narrow"/>
@@ -329,7 +323,6 @@
               </w:rPr>
               <w:t>${</w:t>
             </w:r>
-            <w:proofErr w:type="spellStart"/>
             <w:r>
               <w:rPr>
                 <w:rFonts w:ascii="Arial Narrow" w:hAnsi="Arial Narrow" w:cs="Consolas"/>
@@ -339,7 +332,6 @@
               </w:rPr>
               <w:t>documentLocation</w:t>
             </w:r>
-            <w:proofErr w:type="spellEnd"/>
             <w:r>
               <w:rPr>
                 <w:rFonts w:ascii="Arial Narrow" w:hAnsi="Arial Narrow" w:cs="Consolas"/>
@@ -349,7 +341,6 @@
               </w:rPr>
               <w:t>}, ${</w:t>
             </w:r>
-            <w:proofErr w:type="spellStart"/>
             <w:r>
               <w:rPr>
                 <w:rFonts w:ascii="Arial Narrow" w:hAnsi="Arial Narrow" w:cs="Consolas"/>
@@ -359,7 +350,6 @@
               </w:rPr>
               <w:t>documentDate</w:t>
             </w:r>
-            <w:proofErr w:type="spellEnd"/>
             <w:r>
               <w:rPr>
                 <w:rFonts w:ascii="Arial Narrow" w:hAnsi="Arial Narrow" w:cs="Consolas"/>
@@ -469,7 +459,6 @@
                 <w:szCs w:val="24"/>
               </w:rPr>
             </w:pPr>
-            <w:proofErr w:type="spellStart"/>
             <w:r>
               <w:rPr>
                 <w:rFonts w:ascii="Arial Narrow" w:hAnsi="Arial Narrow"/>
@@ -478,7 +467,6 @@
               </w:rPr>
               <w:t>Nomor</w:t>
             </w:r>
-            <w:proofErr w:type="spellEnd"/>
           </w:p>
         </w:tc>
         <w:tc>
@@ -522,25 +510,7 @@
                 <w:sz w:val="24"/>
                 <w:szCs w:val="24"/>
               </w:rPr>
-              <w:t>${</w:t>
-            </w:r>
-            <w:proofErr w:type="spellStart"/>
-            <w:r>
-              <w:rPr>
-                <w:rFonts w:ascii="Arial Narrow" w:hAnsi="Arial Narrow"/>
-                <w:sz w:val="24"/>
-                <w:szCs w:val="24"/>
-              </w:rPr>
-              <w:t>documentNumber</w:t>
-            </w:r>
-            <w:proofErr w:type="spellEnd"/>
-            <w:r>
-              <w:rPr>
-                <w:rFonts w:ascii="Arial Narrow" w:hAnsi="Arial Narrow"/>
-                <w:sz w:val="24"/>
-                <w:szCs w:val="24"/>
-              </w:rPr>
-              <w:t>}</w:t>
+              <w:t>${documentNumber}</w:t>
             </w:r>
           </w:p>
         </w:tc>
@@ -573,7 +543,6 @@
                 <w:szCs w:val="24"/>
               </w:rPr>
             </w:pPr>
-            <w:proofErr w:type="spellStart"/>
             <w:r>
               <w:rPr>
                 <w:rFonts w:ascii="Arial Narrow" w:hAnsi="Arial Narrow"/>
@@ -582,7 +551,6 @@
               </w:rPr>
               <w:t>Klasifikasi</w:t>
             </w:r>
-            <w:proofErr w:type="spellEnd"/>
           </w:p>
         </w:tc>
         <w:tc>
@@ -627,25 +595,7 @@
                 <w:sz w:val="24"/>
                 <w:szCs w:val="24"/>
               </w:rPr>
-              <w:t>${</w:t>
-            </w:r>
-            <w:proofErr w:type="spellStart"/>
-            <w:r>
-              <w:rPr>
-                <w:rFonts w:ascii="Arial Narrow" w:hAnsi="Arial Narrow"/>
-                <w:sz w:val="24"/>
-                <w:szCs w:val="24"/>
-              </w:rPr>
-              <w:t>documentClassificationName</w:t>
-            </w:r>
-            <w:proofErr w:type="spellEnd"/>
-            <w:r>
-              <w:rPr>
-                <w:rFonts w:ascii="Arial Narrow" w:hAnsi="Arial Narrow"/>
-                <w:sz w:val="24"/>
-                <w:szCs w:val="24"/>
-              </w:rPr>
-              <w:t>}</w:t>
+              <w:t>${documentClassificationName}</w:t>
             </w:r>
           </w:p>
         </w:tc>
@@ -779,7 +729,6 @@
                 <w:u w:val="single"/>
               </w:rPr>
             </w:pPr>
-            <w:proofErr w:type="spellStart"/>
             <w:r>
               <w:rPr>
                 <w:rFonts w:ascii="Arial Narrow" w:hAnsi="Arial Narrow"/>
@@ -787,49 +736,44 @@
                 <w:szCs w:val="24"/>
                 <w:u w:val="single"/>
               </w:rPr>
-              <w:t>permohonan</w:t>
-            </w:r>
-            <w:proofErr w:type="spellEnd"/>
-            <w:r>
+              <w:t>permohonan izin penyitaan</w:t>
+            </w:r>
+          </w:p>
+        </w:tc>
+        <w:tc>
+          <w:tcPr>
+            <w:tcW w:w="142" w:type="dxa"/>
+          </w:tcPr>
+          <w:p>
+            <w:pPr>
               <w:rPr>
                 <w:rFonts w:ascii="Arial Narrow" w:hAnsi="Arial Narrow"/>
                 <w:sz w:val="24"/>
                 <w:szCs w:val="24"/>
                 <w:u w:val="single"/>
               </w:rPr>
-              <w:t xml:space="preserve"> izin </w:t>
-            </w:r>
-            <w:proofErr w:type="spellStart"/>
-            <w:r>
+            </w:pPr>
+          </w:p>
+        </w:tc>
+        <w:tc>
+          <w:tcPr>
+            <w:tcW w:w="425" w:type="dxa"/>
+          </w:tcPr>
+          <w:p>
+            <w:pPr>
+              <w:jc w:val="both"/>
               <w:rPr>
                 <w:rFonts w:ascii="Arial Narrow" w:hAnsi="Arial Narrow"/>
                 <w:sz w:val="24"/>
                 <w:szCs w:val="24"/>
                 <w:u w:val="single"/>
               </w:rPr>
-              <w:t>penyitaan</w:t>
-            </w:r>
-            <w:proofErr w:type="spellEnd"/>
-          </w:p>
-        </w:tc>
-        <w:tc>
-          <w:tcPr>
-            <w:tcW w:w="142" w:type="dxa"/>
-          </w:tcPr>
-          <w:p>
-            <w:pPr>
-              <w:rPr>
-                <w:rFonts w:ascii="Arial Narrow" w:hAnsi="Arial Narrow"/>
-                <w:sz w:val="24"/>
-                <w:szCs w:val="24"/>
-                <w:u w:val="single"/>
-              </w:rPr>
-            </w:pPr>
-          </w:p>
-        </w:tc>
-        <w:tc>
-          <w:tcPr>
-            <w:tcW w:w="425" w:type="dxa"/>
+            </w:pPr>
+          </w:p>
+        </w:tc>
+        <w:tc>
+          <w:tcPr>
+            <w:tcW w:w="3969" w:type="dxa"/>
           </w:tcPr>
           <w:p>
             <w:pPr>
@@ -838,25 +782,8 @@
                 <w:rFonts w:ascii="Arial Narrow" w:hAnsi="Arial Narrow"/>
                 <w:sz w:val="24"/>
                 <w:szCs w:val="24"/>
-                <w:u w:val="single"/>
-              </w:rPr>
-            </w:pPr>
-          </w:p>
-        </w:tc>
-        <w:tc>
-          <w:tcPr>
-            <w:tcW w:w="3969" w:type="dxa"/>
-          </w:tcPr>
-          <w:p>
-            <w:pPr>
-              <w:jc w:val="both"/>
-              <w:rPr>
-                <w:rFonts w:ascii="Arial Narrow" w:hAnsi="Arial Narrow"/>
-                <w:sz w:val="24"/>
-                <w:szCs w:val="24"/>
-              </w:rPr>
-            </w:pPr>
-            <w:proofErr w:type="spellStart"/>
+              </w:rPr>
+            </w:pPr>
             <w:r>
               <w:rPr>
                 <w:rFonts w:ascii="Arial Narrow" w:hAnsi="Arial Narrow"/>
@@ -865,7 +792,6 @@
               </w:rPr>
               <w:t>Kepada</w:t>
             </w:r>
-            <w:proofErr w:type="spellEnd"/>
           </w:p>
         </w:tc>
       </w:tr>
@@ -1035,23 +961,13 @@
                 <w:szCs w:val="24"/>
               </w:rPr>
             </w:pPr>
-            <w:proofErr w:type="spellStart"/>
-            <w:r>
-              <w:rPr>
-                <w:rFonts w:ascii="Arial Narrow" w:hAnsi="Arial Narrow"/>
-                <w:sz w:val="24"/>
-                <w:szCs w:val="24"/>
-              </w:rPr>
-              <w:t>Yth</w:t>
-            </w:r>
-            <w:proofErr w:type="spellEnd"/>
-            <w:r>
-              <w:rPr>
-                <w:rFonts w:ascii="Arial Narrow" w:hAnsi="Arial Narrow"/>
-                <w:sz w:val="24"/>
-                <w:szCs w:val="24"/>
-              </w:rPr>
-              <w:t>.</w:t>
+            <w:r>
+              <w:rPr>
+                <w:rFonts w:ascii="Arial Narrow" w:hAnsi="Arial Narrow"/>
+                <w:sz w:val="24"/>
+                <w:szCs w:val="24"/>
+              </w:rPr>
+              <w:t>Yth.</w:t>
             </w:r>
           </w:p>
         </w:tc>
@@ -1084,7 +1000,6 @@
               </w:rPr>
               <w:t>${</w:t>
             </w:r>
-            <w:proofErr w:type="spellStart"/>
             <w:r>
               <w:rPr>
                 <w:rFonts w:ascii="Arial Narrow" w:hAnsi="Arial Narrow"/>
@@ -1101,7 +1016,6 @@
               </w:rPr>
               <w:t>Name</w:t>
             </w:r>
-            <w:proofErr w:type="spellEnd"/>
             <w:r>
               <w:rPr>
                 <w:rFonts w:ascii="Arial Narrow" w:hAnsi="Arial Narrow"/>
@@ -1497,7 +1411,6 @@
               </w:rPr>
               <w:t>${</w:t>
             </w:r>
-            <w:proofErr w:type="spellStart"/>
             <w:r>
               <w:rPr>
                 <w:rFonts w:ascii="Arial Narrow" w:hAnsi="Arial Narrow"/>
@@ -1516,7 +1429,6 @@
               </w:rPr>
               <w:t>Location</w:t>
             </w:r>
-            <w:proofErr w:type="spellEnd"/>
             <w:r>
               <w:rPr>
                 <w:rFonts w:ascii="Arial Narrow" w:hAnsi="Arial Narrow"/>
@@ -1617,7 +1529,6 @@
                 <w:lang w:eastAsia="en-ID"/>
               </w:rPr>
             </w:pPr>
-            <w:proofErr w:type="spellStart"/>
             <w:r>
               <w:rPr>
                 <w:rFonts w:ascii="Arial Narrow" w:eastAsia="Times New Roman" w:hAnsi="Arial Narrow" w:cs="Fira Code"/>
@@ -1627,7 +1538,6 @@
               </w:rPr>
               <w:t>Rujukan</w:t>
             </w:r>
-            <w:proofErr w:type="spellEnd"/>
             <w:r>
               <w:rPr>
                 <w:rFonts w:ascii="Arial Narrow" w:eastAsia="Times New Roman" w:hAnsi="Arial Narrow" w:cs="Fira Code"/>
@@ -1684,10 +1594,18 @@
                 <w:shd w:val="clear" w:color="auto" w:fill="FFFFFF"/>
                 <w:lang w:eastAsia="en-ID"/>
               </w:rPr>
-              <w:t>${</w:t>
-            </w:r>
-            <w:proofErr w:type="spellStart"/>
-            <w:r>
+              <w:t>${referenceIteration}</w:t>
+            </w:r>
+          </w:p>
+        </w:tc>
+        <w:tc>
+          <w:tcPr>
+            <w:tcW w:w="9214" w:type="dxa"/>
+            <w:gridSpan w:val="2"/>
+          </w:tcPr>
+          <w:p>
+            <w:pPr>
+              <w:jc w:val="both"/>
               <w:rPr>
                 <w:rFonts w:ascii="Arial Narrow" w:eastAsia="Times New Roman" w:hAnsi="Arial Narrow" w:cs="Fira Code"/>
                 <w:sz w:val="24"/>
@@ -1695,9 +1613,7 @@
                 <w:shd w:val="clear" w:color="auto" w:fill="FFFFFF"/>
                 <w:lang w:eastAsia="en-ID"/>
               </w:rPr>
-              <w:t>referenceIteration</w:t>
-            </w:r>
-            <w:proofErr w:type="spellEnd"/>
+            </w:pPr>
             <w:r>
               <w:rPr>
                 <w:rFonts w:ascii="Arial Narrow" w:eastAsia="Times New Roman" w:hAnsi="Arial Narrow" w:cs="Fira Code"/>
@@ -1706,57 +1622,7 @@
                 <w:shd w:val="clear" w:color="auto" w:fill="FFFFFF"/>
                 <w:lang w:eastAsia="en-ID"/>
               </w:rPr>
-              <w:t>}</w:t>
-            </w:r>
-          </w:p>
-        </w:tc>
-        <w:tc>
-          <w:tcPr>
-            <w:tcW w:w="9214" w:type="dxa"/>
-            <w:gridSpan w:val="2"/>
-          </w:tcPr>
-          <w:p>
-            <w:pPr>
-              <w:jc w:val="both"/>
-              <w:rPr>
-                <w:rFonts w:ascii="Arial Narrow" w:eastAsia="Times New Roman" w:hAnsi="Arial Narrow" w:cs="Fira Code"/>
-                <w:sz w:val="24"/>
-                <w:szCs w:val="24"/>
-                <w:shd w:val="clear" w:color="auto" w:fill="FFFFFF"/>
-                <w:lang w:eastAsia="en-ID"/>
-              </w:rPr>
-            </w:pPr>
-            <w:r>
-              <w:rPr>
-                <w:rFonts w:ascii="Arial Narrow" w:eastAsia="Times New Roman" w:hAnsi="Arial Narrow" w:cs="Fira Code"/>
-                <w:sz w:val="24"/>
-                <w:szCs w:val="24"/>
-                <w:shd w:val="clear" w:color="auto" w:fill="FFFFFF"/>
-                <w:lang w:eastAsia="en-ID"/>
-              </w:rPr>
-              <w:t>${</w:t>
-            </w:r>
-            <w:proofErr w:type="spellStart"/>
-            <w:r>
-              <w:rPr>
-                <w:rFonts w:ascii="Arial Narrow" w:eastAsia="Times New Roman" w:hAnsi="Arial Narrow" w:cs="Fira Code"/>
-                <w:sz w:val="24"/>
-                <w:szCs w:val="24"/>
-                <w:shd w:val="clear" w:color="auto" w:fill="FFFFFF"/>
-                <w:lang w:eastAsia="en-ID"/>
-              </w:rPr>
-              <w:t>referenceName</w:t>
-            </w:r>
-            <w:proofErr w:type="spellEnd"/>
-            <w:r>
-              <w:rPr>
-                <w:rFonts w:ascii="Arial Narrow" w:eastAsia="Times New Roman" w:hAnsi="Arial Narrow" w:cs="Fira Code"/>
-                <w:sz w:val="24"/>
-                <w:szCs w:val="24"/>
-                <w:shd w:val="clear" w:color="auto" w:fill="FFFFFF"/>
-                <w:lang w:eastAsia="en-ID"/>
-              </w:rPr>
-              <w:t>}</w:t>
+              <w:t>${referenceName}</w:t>
             </w:r>
           </w:p>
         </w:tc>
@@ -1832,544 +1698,158 @@
                 <w:szCs w:val="24"/>
               </w:rPr>
             </w:pPr>
-            <w:proofErr w:type="spellStart"/>
             <w:r>
               <w:rPr>
                 <w:rFonts w:ascii="Arial Narrow" w:hAnsi="Arial Narrow" w:cs="Arial"/>
                 <w:sz w:val="24"/>
                 <w:szCs w:val="24"/>
               </w:rPr>
-              <w:t>Sehubungan</w:t>
-            </w:r>
-            <w:proofErr w:type="spellEnd"/>
+              <w:t>Sehubungan dengan rujukan di atas, diberitahukan kepada K</w:t>
+            </w:r>
             <w:r>
               <w:rPr>
                 <w:rFonts w:ascii="Arial Narrow" w:hAnsi="Arial Narrow" w:cs="Arial"/>
                 <w:sz w:val="24"/>
                 <w:szCs w:val="24"/>
               </w:rPr>
+              <w:t>etua</w:t>
+            </w:r>
+            <w:r>
+              <w:rPr>
+                <w:rFonts w:ascii="Arial Narrow" w:hAnsi="Arial Narrow" w:cs="Arial"/>
+                <w:sz w:val="24"/>
+                <w:szCs w:val="24"/>
+              </w:rPr>
+              <w:t xml:space="preserve"> bahwa </w:t>
+            </w:r>
+            <w:r>
+              <w:rPr>
+                <w:rFonts w:ascii="Arial Narrow" w:hAnsi="Arial Narrow" w:cs="Arial"/>
+                <w:sz w:val="24"/>
+                <w:szCs w:val="24"/>
+              </w:rPr>
+              <w:t>P</w:t>
+            </w:r>
+            <w:r>
+              <w:rPr>
+                <w:rFonts w:ascii="Arial Narrow" w:hAnsi="Arial Narrow" w:cs="Arial"/>
+                <w:sz w:val="24"/>
+                <w:szCs w:val="24"/>
+              </w:rPr>
+              <w:t xml:space="preserve">enyidik </w:t>
+            </w:r>
+            <w:r>
+              <w:rPr>
+                <w:rFonts w:ascii="Arial Narrow" w:hAnsi="Arial Narrow" w:cs="Arial"/>
+                <w:sz w:val="24"/>
+                <w:szCs w:val="24"/>
+              </w:rPr>
+              <w:t>${</w:t>
+            </w:r>
+            <w:r>
+              <w:rPr>
+                <w:rFonts w:ascii="Arial Narrow" w:hAnsi="Arial Narrow" w:cs="Arial"/>
+                <w:sz w:val="24"/>
+                <w:szCs w:val="24"/>
+              </w:rPr>
+              <w:t>workUnitName</w:t>
+            </w:r>
+            <w:r>
+              <w:rPr>
+                <w:rFonts w:ascii="Arial Narrow" w:hAnsi="Arial Narrow" w:cs="Arial"/>
+                <w:sz w:val="24"/>
+                <w:szCs w:val="24"/>
+              </w:rPr>
+              <w:t>}</w:t>
+            </w:r>
+            <w:r>
+              <w:rPr>
+                <w:rFonts w:ascii="Arial Narrow" w:hAnsi="Arial Narrow" w:cs="Arial"/>
+                <w:sz w:val="24"/>
+                <w:szCs w:val="24"/>
+              </w:rPr>
               <w:t xml:space="preserve"> </w:t>
             </w:r>
-            <w:proofErr w:type="spellStart"/>
             <w:r>
               <w:rPr>
                 <w:rFonts w:ascii="Arial Narrow" w:hAnsi="Arial Narrow" w:cs="Arial"/>
                 <w:sz w:val="24"/>
                 <w:szCs w:val="24"/>
               </w:rPr>
-              <w:t>dengan</w:t>
-            </w:r>
-            <w:proofErr w:type="spellEnd"/>
+              <w:t xml:space="preserve">sedang menangani perkara Tindak Pidana ${crimeClass} sebagaimana dimaksud dalam ${CrimeConstitution}, </w:t>
+            </w:r>
             <w:r>
               <w:rPr>
                 <w:rFonts w:ascii="Arial Narrow" w:hAnsi="Arial Narrow" w:cs="Arial"/>
                 <w:sz w:val="24"/>
                 <w:szCs w:val="24"/>
               </w:rPr>
+              <w:t xml:space="preserve">yang terjadi di </w:t>
+            </w:r>
+            <w:r>
+              <w:rPr>
+                <w:rFonts w:ascii="Arial Narrow" w:hAnsi="Arial Narrow" w:cs="Arial"/>
+                <w:sz w:val="24"/>
+                <w:szCs w:val="24"/>
+              </w:rPr>
+              <w:t>${accidentRoad}</w:t>
+            </w:r>
+            <w:r>
+              <w:rPr>
+                <w:rFonts w:ascii="Arial Narrow" w:hAnsi="Arial Narrow" w:cs="Arial"/>
+                <w:sz w:val="24"/>
+                <w:szCs w:val="24"/>
+              </w:rPr>
+              <w:t xml:space="preserve">, </w:t>
+            </w:r>
+            <w:r>
+              <w:rPr>
+                <w:rFonts w:ascii="Arial Narrow" w:hAnsi="Arial Narrow" w:cs="Arial"/>
+                <w:sz w:val="24"/>
+                <w:szCs w:val="24"/>
+              </w:rPr>
+              <w:t>(p</w:t>
+            </w:r>
+            <w:r>
+              <w:rPr>
+                <w:rFonts w:ascii="Arial Narrow" w:hAnsi="Arial Narrow" w:cs="Arial"/>
+                <w:sz w:val="24"/>
+                <w:szCs w:val="24"/>
+              </w:rPr>
+              <w:t>ada</w:t>
+            </w:r>
+            <w:r>
+              <w:rPr>
+                <w:rFonts w:ascii="Arial Narrow" w:hAnsi="Arial Narrow" w:cs="Arial"/>
+                <w:sz w:val="24"/>
+                <w:szCs w:val="24"/>
+              </w:rPr>
+              <w:t xml:space="preserve"> hari ${accidentDay}</w:t>
+            </w:r>
+            <w:r>
+              <w:rPr>
+                <w:rFonts w:ascii="Arial Narrow" w:hAnsi="Arial Narrow" w:cs="Arial"/>
+                <w:sz w:val="24"/>
+                <w:szCs w:val="24"/>
+              </w:rPr>
               <w:t xml:space="preserve"> </w:t>
             </w:r>
-            <w:proofErr w:type="spellStart"/>
             <w:r>
               <w:rPr>
                 <w:rFonts w:ascii="Arial Narrow" w:hAnsi="Arial Narrow" w:cs="Arial"/>
                 <w:sz w:val="24"/>
                 <w:szCs w:val="24"/>
               </w:rPr>
-              <w:t>rujukan</w:t>
-            </w:r>
-            <w:proofErr w:type="spellEnd"/>
+              <w:t>t</w:t>
+            </w:r>
             <w:r>
               <w:rPr>
                 <w:rFonts w:ascii="Arial Narrow" w:hAnsi="Arial Narrow" w:cs="Arial"/>
                 <w:sz w:val="24"/>
                 <w:szCs w:val="24"/>
               </w:rPr>
-              <w:t xml:space="preserve"> di </w:t>
-            </w:r>
-            <w:proofErr w:type="spellStart"/>
-            <w:r>
-              <w:rPr>
-                <w:rFonts w:ascii="Arial Narrow" w:hAnsi="Arial Narrow" w:cs="Arial"/>
-                <w:sz w:val="24"/>
-                <w:szCs w:val="24"/>
-              </w:rPr>
-              <w:t>atas</w:t>
-            </w:r>
-            <w:proofErr w:type="spellEnd"/>
-            <w:r>
-              <w:rPr>
-                <w:rFonts w:ascii="Arial Narrow" w:hAnsi="Arial Narrow" w:cs="Arial"/>
-                <w:sz w:val="24"/>
-                <w:szCs w:val="24"/>
-              </w:rPr>
-              <w:t xml:space="preserve">, </w:t>
-            </w:r>
-            <w:proofErr w:type="spellStart"/>
-            <w:r>
-              <w:rPr>
-                <w:rFonts w:ascii="Arial Narrow" w:hAnsi="Arial Narrow" w:cs="Arial"/>
-                <w:sz w:val="24"/>
-                <w:szCs w:val="24"/>
-              </w:rPr>
-              <w:t>diberitahukan</w:t>
-            </w:r>
-            <w:proofErr w:type="spellEnd"/>
-            <w:r>
-              <w:rPr>
-                <w:rFonts w:ascii="Arial Narrow" w:hAnsi="Arial Narrow" w:cs="Arial"/>
-                <w:sz w:val="24"/>
-                <w:szCs w:val="24"/>
-              </w:rPr>
-              <w:t xml:space="preserve"> </w:t>
-            </w:r>
-            <w:proofErr w:type="spellStart"/>
-            <w:r>
-              <w:rPr>
-                <w:rFonts w:ascii="Arial Narrow" w:hAnsi="Arial Narrow" w:cs="Arial"/>
-                <w:sz w:val="24"/>
-                <w:szCs w:val="24"/>
-              </w:rPr>
-              <w:t>kepada</w:t>
-            </w:r>
-            <w:proofErr w:type="spellEnd"/>
-            <w:r>
-              <w:rPr>
-                <w:rFonts w:ascii="Arial Narrow" w:hAnsi="Arial Narrow" w:cs="Arial"/>
-                <w:sz w:val="24"/>
-                <w:szCs w:val="24"/>
-              </w:rPr>
-              <w:t xml:space="preserve"> </w:t>
-            </w:r>
-            <w:proofErr w:type="spellStart"/>
-            <w:r>
-              <w:rPr>
-                <w:rFonts w:ascii="Arial Narrow" w:hAnsi="Arial Narrow" w:cs="Arial"/>
-                <w:sz w:val="24"/>
-                <w:szCs w:val="24"/>
-              </w:rPr>
-              <w:t>K</w:t>
-            </w:r>
-            <w:r>
-              <w:rPr>
-                <w:rFonts w:ascii="Arial Narrow" w:hAnsi="Arial Narrow" w:cs="Arial"/>
-                <w:sz w:val="24"/>
-                <w:szCs w:val="24"/>
-              </w:rPr>
-              <w:t>etua</w:t>
-            </w:r>
-            <w:proofErr w:type="spellEnd"/>
-            <w:r>
-              <w:rPr>
-                <w:rFonts w:ascii="Arial Narrow" w:hAnsi="Arial Narrow" w:cs="Arial"/>
-                <w:sz w:val="24"/>
-                <w:szCs w:val="24"/>
-              </w:rPr>
-              <w:t xml:space="preserve"> </w:t>
-            </w:r>
-            <w:proofErr w:type="spellStart"/>
-            <w:r>
-              <w:rPr>
-                <w:rFonts w:ascii="Arial Narrow" w:hAnsi="Arial Narrow" w:cs="Arial"/>
-                <w:sz w:val="24"/>
-                <w:szCs w:val="24"/>
-              </w:rPr>
-              <w:t>bahwa</w:t>
-            </w:r>
-            <w:proofErr w:type="spellEnd"/>
-            <w:r>
-              <w:rPr>
-                <w:rFonts w:ascii="Arial Narrow" w:hAnsi="Arial Narrow" w:cs="Arial"/>
-                <w:sz w:val="24"/>
-                <w:szCs w:val="24"/>
-              </w:rPr>
-              <w:t xml:space="preserve"> </w:t>
-            </w:r>
-            <w:proofErr w:type="spellStart"/>
-            <w:r>
-              <w:rPr>
-                <w:rFonts w:ascii="Arial Narrow" w:hAnsi="Arial Narrow" w:cs="Arial"/>
-                <w:sz w:val="24"/>
-                <w:szCs w:val="24"/>
-              </w:rPr>
-              <w:t>P</w:t>
-            </w:r>
-            <w:r>
-              <w:rPr>
-                <w:rFonts w:ascii="Arial Narrow" w:hAnsi="Arial Narrow" w:cs="Arial"/>
-                <w:sz w:val="24"/>
-                <w:szCs w:val="24"/>
-              </w:rPr>
-              <w:t>enyidik</w:t>
-            </w:r>
-            <w:proofErr w:type="spellEnd"/>
-            <w:r>
-              <w:rPr>
-                <w:rFonts w:ascii="Arial Narrow" w:hAnsi="Arial Narrow" w:cs="Arial"/>
-                <w:sz w:val="24"/>
-                <w:szCs w:val="24"/>
-              </w:rPr>
-              <w:t xml:space="preserve"> </w:t>
-            </w:r>
-            <w:r>
-              <w:rPr>
-                <w:rFonts w:ascii="Arial Narrow" w:hAnsi="Arial Narrow" w:cs="Arial"/>
-                <w:sz w:val="24"/>
-                <w:szCs w:val="24"/>
-              </w:rPr>
-              <w:t>${</w:t>
-            </w:r>
-            <w:proofErr w:type="spellStart"/>
-            <w:r>
-              <w:rPr>
-                <w:rFonts w:ascii="Arial Narrow" w:hAnsi="Arial Narrow" w:cs="Arial"/>
-                <w:sz w:val="24"/>
-                <w:szCs w:val="24"/>
-              </w:rPr>
-              <w:t>workUnitName</w:t>
-            </w:r>
-            <w:proofErr w:type="spellEnd"/>
-            <w:r>
-              <w:rPr>
-                <w:rFonts w:ascii="Arial Narrow" w:hAnsi="Arial Narrow" w:cs="Arial"/>
-                <w:sz w:val="24"/>
-                <w:szCs w:val="24"/>
-              </w:rPr>
-              <w:t>}</w:t>
-            </w:r>
-            <w:r>
-              <w:rPr>
-                <w:rFonts w:ascii="Arial Narrow" w:hAnsi="Arial Narrow" w:cs="Arial"/>
-                <w:sz w:val="24"/>
-                <w:szCs w:val="24"/>
-              </w:rPr>
-              <w:t xml:space="preserve"> </w:t>
-            </w:r>
-            <w:proofErr w:type="spellStart"/>
-            <w:r>
-              <w:rPr>
-                <w:rFonts w:ascii="Arial Narrow" w:hAnsi="Arial Narrow" w:cs="Arial"/>
-                <w:sz w:val="24"/>
-                <w:szCs w:val="24"/>
-              </w:rPr>
-              <w:t>sedang</w:t>
-            </w:r>
-            <w:proofErr w:type="spellEnd"/>
-            <w:r>
-              <w:rPr>
-                <w:rFonts w:ascii="Arial Narrow" w:hAnsi="Arial Narrow" w:cs="Arial"/>
-                <w:sz w:val="24"/>
-                <w:szCs w:val="24"/>
-              </w:rPr>
-              <w:t xml:space="preserve"> </w:t>
-            </w:r>
-            <w:proofErr w:type="spellStart"/>
-            <w:r>
-              <w:rPr>
-                <w:rFonts w:ascii="Arial Narrow" w:hAnsi="Arial Narrow" w:cs="Arial"/>
-                <w:sz w:val="24"/>
-                <w:szCs w:val="24"/>
-              </w:rPr>
-              <w:t>menangani</w:t>
-            </w:r>
-            <w:proofErr w:type="spellEnd"/>
-            <w:r>
-              <w:rPr>
-                <w:rFonts w:ascii="Arial Narrow" w:hAnsi="Arial Narrow" w:cs="Arial"/>
-                <w:sz w:val="24"/>
-                <w:szCs w:val="24"/>
-              </w:rPr>
-              <w:t xml:space="preserve"> </w:t>
-            </w:r>
-            <w:proofErr w:type="spellStart"/>
-            <w:r>
-              <w:rPr>
-                <w:rFonts w:ascii="Arial Narrow" w:hAnsi="Arial Narrow" w:cs="Arial"/>
-                <w:sz w:val="24"/>
-                <w:szCs w:val="24"/>
-              </w:rPr>
-              <w:t>perkara</w:t>
-            </w:r>
-            <w:proofErr w:type="spellEnd"/>
-            <w:r>
-              <w:rPr>
-                <w:rFonts w:ascii="Arial Narrow" w:hAnsi="Arial Narrow" w:cs="Arial"/>
-                <w:sz w:val="24"/>
-                <w:szCs w:val="24"/>
-              </w:rPr>
-              <w:t xml:space="preserve"> </w:t>
-            </w:r>
-            <w:proofErr w:type="spellStart"/>
-            <w:r>
-              <w:rPr>
-                <w:rFonts w:ascii="Arial Narrow" w:hAnsi="Arial Narrow" w:cs="Arial"/>
-                <w:sz w:val="24"/>
-                <w:szCs w:val="24"/>
-              </w:rPr>
-              <w:t>Tindak</w:t>
-            </w:r>
-            <w:proofErr w:type="spellEnd"/>
-            <w:r>
-              <w:rPr>
-                <w:rFonts w:ascii="Arial Narrow" w:hAnsi="Arial Narrow" w:cs="Arial"/>
-                <w:sz w:val="24"/>
-                <w:szCs w:val="24"/>
-              </w:rPr>
-              <w:t xml:space="preserve"> </w:t>
-            </w:r>
-            <w:proofErr w:type="spellStart"/>
-            <w:r>
-              <w:rPr>
-                <w:rFonts w:ascii="Arial Narrow" w:hAnsi="Arial Narrow" w:cs="Arial"/>
-                <w:sz w:val="24"/>
-                <w:szCs w:val="24"/>
-              </w:rPr>
-              <w:t>Pidana</w:t>
-            </w:r>
-            <w:proofErr w:type="spellEnd"/>
-            <w:r>
-              <w:rPr>
-                <w:rFonts w:ascii="Arial Narrow" w:hAnsi="Arial Narrow" w:cs="Arial"/>
-                <w:sz w:val="24"/>
-                <w:szCs w:val="24"/>
-              </w:rPr>
-              <w:t xml:space="preserve"> ${</w:t>
-            </w:r>
-            <w:proofErr w:type="spellStart"/>
-            <w:r>
-              <w:rPr>
-                <w:rFonts w:ascii="Arial Narrow" w:hAnsi="Arial Narrow" w:cs="Arial"/>
-                <w:sz w:val="24"/>
-                <w:szCs w:val="24"/>
-              </w:rPr>
-              <w:t>crimeClass</w:t>
-            </w:r>
-            <w:proofErr w:type="spellEnd"/>
-            <w:r>
-              <w:rPr>
-                <w:rFonts w:ascii="Arial Narrow" w:hAnsi="Arial Narrow" w:cs="Arial"/>
-                <w:sz w:val="24"/>
-                <w:szCs w:val="24"/>
-              </w:rPr>
-              <w:t xml:space="preserve">} </w:t>
-            </w:r>
-            <w:proofErr w:type="spellStart"/>
-            <w:r>
-              <w:rPr>
-                <w:rFonts w:ascii="Arial Narrow" w:hAnsi="Arial Narrow" w:cs="Arial"/>
-                <w:sz w:val="24"/>
-                <w:szCs w:val="24"/>
-              </w:rPr>
-              <w:t>sebagaimana</w:t>
-            </w:r>
-            <w:proofErr w:type="spellEnd"/>
-            <w:r>
-              <w:rPr>
-                <w:rFonts w:ascii="Arial Narrow" w:hAnsi="Arial Narrow" w:cs="Arial"/>
-                <w:sz w:val="24"/>
-                <w:szCs w:val="24"/>
-              </w:rPr>
-              <w:t xml:space="preserve"> </w:t>
-            </w:r>
-            <w:proofErr w:type="spellStart"/>
-            <w:r>
-              <w:rPr>
-                <w:rFonts w:ascii="Arial Narrow" w:hAnsi="Arial Narrow" w:cs="Arial"/>
-                <w:sz w:val="24"/>
-                <w:szCs w:val="24"/>
-              </w:rPr>
-              <w:t>dimaksud</w:t>
-            </w:r>
-            <w:proofErr w:type="spellEnd"/>
-            <w:r>
-              <w:rPr>
-                <w:rFonts w:ascii="Arial Narrow" w:hAnsi="Arial Narrow" w:cs="Arial"/>
-                <w:sz w:val="24"/>
-                <w:szCs w:val="24"/>
-              </w:rPr>
-              <w:t xml:space="preserve"> </w:t>
-            </w:r>
-            <w:proofErr w:type="spellStart"/>
-            <w:r>
-              <w:rPr>
-                <w:rFonts w:ascii="Arial Narrow" w:hAnsi="Arial Narrow" w:cs="Arial"/>
-                <w:sz w:val="24"/>
-                <w:szCs w:val="24"/>
-              </w:rPr>
-              <w:t>dalam</w:t>
-            </w:r>
-            <w:proofErr w:type="spellEnd"/>
-            <w:r>
-              <w:rPr>
-                <w:rFonts w:ascii="Arial Narrow" w:hAnsi="Arial Narrow" w:cs="Arial"/>
-                <w:sz w:val="24"/>
-                <w:szCs w:val="24"/>
-              </w:rPr>
-              <w:t xml:space="preserve"> ${</w:t>
-            </w:r>
-            <w:proofErr w:type="spellStart"/>
-            <w:r>
-              <w:rPr>
-                <w:rFonts w:ascii="Arial Narrow" w:hAnsi="Arial Narrow" w:cs="Arial"/>
-                <w:sz w:val="24"/>
-                <w:szCs w:val="24"/>
-              </w:rPr>
-              <w:t>CrimeConstitution</w:t>
-            </w:r>
-            <w:proofErr w:type="spellEnd"/>
-            <w:r>
-              <w:rPr>
-                <w:rFonts w:ascii="Arial Narrow" w:hAnsi="Arial Narrow" w:cs="Arial"/>
-                <w:sz w:val="24"/>
-                <w:szCs w:val="24"/>
-              </w:rPr>
-              <w:t xml:space="preserve">}, </w:t>
-            </w:r>
-            <w:r>
-              <w:rPr>
-                <w:rFonts w:ascii="Arial Narrow" w:hAnsi="Arial Narrow" w:cs="Arial"/>
-                <w:sz w:val="24"/>
-                <w:szCs w:val="24"/>
-              </w:rPr>
-              <w:t xml:space="preserve">yang </w:t>
-            </w:r>
-            <w:proofErr w:type="spellStart"/>
-            <w:r>
-              <w:rPr>
-                <w:rFonts w:ascii="Arial Narrow" w:hAnsi="Arial Narrow" w:cs="Arial"/>
-                <w:sz w:val="24"/>
-                <w:szCs w:val="24"/>
-              </w:rPr>
-              <w:t>terjadi</w:t>
-            </w:r>
-            <w:proofErr w:type="spellEnd"/>
-            <w:r>
-              <w:rPr>
-                <w:rFonts w:ascii="Arial Narrow" w:hAnsi="Arial Narrow" w:cs="Arial"/>
-                <w:sz w:val="24"/>
-                <w:szCs w:val="24"/>
-              </w:rPr>
-              <w:t xml:space="preserve"> di </w:t>
-            </w:r>
-            <w:r>
-              <w:rPr>
-                <w:rFonts w:ascii="Arial Narrow" w:hAnsi="Arial Narrow" w:cs="Arial"/>
-                <w:sz w:val="24"/>
-                <w:szCs w:val="24"/>
-              </w:rPr>
-              <w:t>${</w:t>
-            </w:r>
-            <w:proofErr w:type="spellStart"/>
-            <w:r>
-              <w:rPr>
-                <w:rFonts w:ascii="Arial Narrow" w:hAnsi="Arial Narrow" w:cs="Arial"/>
-                <w:sz w:val="24"/>
-                <w:szCs w:val="24"/>
-              </w:rPr>
-              <w:t>accidentRoad</w:t>
-            </w:r>
-            <w:proofErr w:type="spellEnd"/>
-            <w:r>
-              <w:rPr>
-                <w:rFonts w:ascii="Arial Narrow" w:hAnsi="Arial Narrow" w:cs="Arial"/>
-                <w:sz w:val="24"/>
-                <w:szCs w:val="24"/>
-              </w:rPr>
-              <w:t>}</w:t>
-            </w:r>
-            <w:r>
-              <w:rPr>
-                <w:rFonts w:ascii="Arial Narrow" w:hAnsi="Arial Narrow" w:cs="Arial"/>
-                <w:sz w:val="24"/>
-                <w:szCs w:val="24"/>
-              </w:rPr>
-              <w:t xml:space="preserve">, </w:t>
-            </w:r>
-            <w:r>
-              <w:rPr>
-                <w:rFonts w:ascii="Arial Narrow" w:hAnsi="Arial Narrow" w:cs="Arial"/>
-                <w:sz w:val="24"/>
-                <w:szCs w:val="24"/>
-              </w:rPr>
-              <w:t>(p</w:t>
-            </w:r>
-            <w:r>
-              <w:rPr>
-                <w:rFonts w:ascii="Arial Narrow" w:hAnsi="Arial Narrow" w:cs="Arial"/>
-                <w:sz w:val="24"/>
-                <w:szCs w:val="24"/>
-              </w:rPr>
-              <w:t>ada</w:t>
-            </w:r>
-            <w:r>
-              <w:rPr>
-                <w:rFonts w:ascii="Arial Narrow" w:hAnsi="Arial Narrow" w:cs="Arial"/>
-                <w:sz w:val="24"/>
-                <w:szCs w:val="24"/>
-              </w:rPr>
-              <w:t xml:space="preserve"> </w:t>
-            </w:r>
-            <w:proofErr w:type="spellStart"/>
-            <w:r>
-              <w:rPr>
-                <w:rFonts w:ascii="Arial Narrow" w:hAnsi="Arial Narrow" w:cs="Arial"/>
-                <w:sz w:val="24"/>
-                <w:szCs w:val="24"/>
-              </w:rPr>
-              <w:t>hari</w:t>
-            </w:r>
-            <w:proofErr w:type="spellEnd"/>
-            <w:r>
-              <w:rPr>
-                <w:rFonts w:ascii="Arial Narrow" w:hAnsi="Arial Narrow" w:cs="Arial"/>
-                <w:sz w:val="24"/>
-                <w:szCs w:val="24"/>
-              </w:rPr>
-              <w:t xml:space="preserve"> ${</w:t>
-            </w:r>
-            <w:proofErr w:type="spellStart"/>
-            <w:r>
-              <w:rPr>
-                <w:rFonts w:ascii="Arial Narrow" w:hAnsi="Arial Narrow" w:cs="Arial"/>
-                <w:sz w:val="24"/>
-                <w:szCs w:val="24"/>
-              </w:rPr>
-              <w:t>accidentDay</w:t>
-            </w:r>
-            <w:proofErr w:type="spellEnd"/>
-            <w:r>
-              <w:rPr>
-                <w:rFonts w:ascii="Arial Narrow" w:hAnsi="Arial Narrow" w:cs="Arial"/>
-                <w:sz w:val="24"/>
-                <w:szCs w:val="24"/>
-              </w:rPr>
-              <w:t>}</w:t>
-            </w:r>
-            <w:r>
-              <w:rPr>
-                <w:rFonts w:ascii="Arial Narrow" w:hAnsi="Arial Narrow" w:cs="Arial"/>
-                <w:sz w:val="24"/>
-                <w:szCs w:val="24"/>
-              </w:rPr>
-              <w:t xml:space="preserve"> </w:t>
-            </w:r>
-            <w:proofErr w:type="spellStart"/>
-            <w:r>
-              <w:rPr>
-                <w:rFonts w:ascii="Arial Narrow" w:hAnsi="Arial Narrow" w:cs="Arial"/>
-                <w:sz w:val="24"/>
-                <w:szCs w:val="24"/>
-              </w:rPr>
-              <w:t>t</w:t>
-            </w:r>
-            <w:r>
-              <w:rPr>
-                <w:rFonts w:ascii="Arial Narrow" w:hAnsi="Arial Narrow" w:cs="Arial"/>
-                <w:sz w:val="24"/>
-                <w:szCs w:val="24"/>
-              </w:rPr>
               <w:t>anggal</w:t>
             </w:r>
-            <w:proofErr w:type="spellEnd"/>
             <w:r>
               <w:rPr>
                 <w:rFonts w:ascii="Arial Narrow" w:hAnsi="Arial Narrow" w:cs="Arial"/>
@@ -2388,7 +1868,6 @@
               </w:rPr>
               <w:t>${</w:t>
             </w:r>
-            <w:proofErr w:type="spellStart"/>
             <w:r>
               <w:rPr>
                 <w:rFonts w:ascii="Arial Narrow" w:eastAsia="Times New Roman" w:hAnsi="Arial Narrow" w:cs="Fira Code"/>
@@ -2399,7 +1878,6 @@
               </w:rPr>
               <w:t>accidentDate</w:t>
             </w:r>
-            <w:proofErr w:type="spellEnd"/>
             <w:r>
               <w:rPr>
                 <w:rFonts w:ascii="Arial Narrow" w:eastAsia="Times New Roman" w:hAnsi="Arial Narrow" w:cs="Fira Code"/>
@@ -2418,9 +1896,8 @@
                 <w:shd w:val="clear" w:color="auto" w:fill="FFFFFF"/>
                 <w:lang w:eastAsia="en-ID"/>
               </w:rPr>
-              <w:t xml:space="preserve">. </w:t>
-            </w:r>
-            <w:proofErr w:type="spellStart"/>
+              <w:t>)</w:t>
+            </w:r>
             <w:r>
               <w:rPr>
                 <w:rFonts w:ascii="Arial Narrow" w:eastAsia="Times New Roman" w:hAnsi="Arial Narrow" w:cs="Fira Code"/>
@@ -2429,84 +1906,7 @@
                 <w:shd w:val="clear" w:color="auto" w:fill="FFFFFF"/>
                 <w:lang w:eastAsia="en-ID"/>
               </w:rPr>
-              <w:t>Berdasarkan</w:t>
-            </w:r>
-            <w:proofErr w:type="spellEnd"/>
-            <w:r>
-              <w:rPr>
-                <w:rFonts w:ascii="Arial Narrow" w:eastAsia="Times New Roman" w:hAnsi="Arial Narrow" w:cs="Fira Code"/>
-                <w:sz w:val="24"/>
-                <w:szCs w:val="24"/>
-                <w:shd w:val="clear" w:color="auto" w:fill="FFFFFF"/>
-                <w:lang w:eastAsia="en-ID"/>
-              </w:rPr>
-              <w:t xml:space="preserve"> </w:t>
-            </w:r>
-            <w:proofErr w:type="spellStart"/>
-            <w:r>
-              <w:rPr>
-                <w:rFonts w:ascii="Arial Narrow" w:eastAsia="Times New Roman" w:hAnsi="Arial Narrow" w:cs="Fira Code"/>
-                <w:sz w:val="24"/>
-                <w:szCs w:val="24"/>
-                <w:shd w:val="clear" w:color="auto" w:fill="FFFFFF"/>
-                <w:lang w:eastAsia="en-ID"/>
-              </w:rPr>
-              <w:t>hasil</w:t>
-            </w:r>
-            <w:proofErr w:type="spellEnd"/>
-            <w:r>
-              <w:rPr>
-                <w:rFonts w:ascii="Arial Narrow" w:eastAsia="Times New Roman" w:hAnsi="Arial Narrow" w:cs="Fira Code"/>
-                <w:sz w:val="24"/>
-                <w:szCs w:val="24"/>
-                <w:shd w:val="clear" w:color="auto" w:fill="FFFFFF"/>
-                <w:lang w:eastAsia="en-ID"/>
-              </w:rPr>
-              <w:t xml:space="preserve"> </w:t>
-            </w:r>
-            <w:proofErr w:type="spellStart"/>
-            <w:r>
-              <w:rPr>
-                <w:rFonts w:ascii="Arial Narrow" w:eastAsia="Times New Roman" w:hAnsi="Arial Narrow" w:cs="Fira Code"/>
-                <w:sz w:val="24"/>
-                <w:szCs w:val="24"/>
-                <w:shd w:val="clear" w:color="auto" w:fill="FFFFFF"/>
-                <w:lang w:eastAsia="en-ID"/>
-              </w:rPr>
-              <w:t>pemeriksaan</w:t>
-            </w:r>
-            <w:proofErr w:type="spellEnd"/>
-            <w:r>
-              <w:rPr>
-                <w:rFonts w:ascii="Arial Narrow" w:eastAsia="Times New Roman" w:hAnsi="Arial Narrow" w:cs="Fira Code"/>
-                <w:sz w:val="24"/>
-                <w:szCs w:val="24"/>
-                <w:shd w:val="clear" w:color="auto" w:fill="FFFFFF"/>
-                <w:lang w:eastAsia="en-ID"/>
-              </w:rPr>
-              <w:t xml:space="preserve"> </w:t>
-            </w:r>
-            <w:proofErr w:type="spellStart"/>
-            <w:r>
-              <w:rPr>
-                <w:rFonts w:ascii="Arial Narrow" w:eastAsia="Times New Roman" w:hAnsi="Arial Narrow" w:cs="Fira Code"/>
-                <w:sz w:val="24"/>
-                <w:szCs w:val="24"/>
-                <w:shd w:val="clear" w:color="auto" w:fill="FFFFFF"/>
-                <w:lang w:eastAsia="en-ID"/>
-              </w:rPr>
-              <w:t>terhadap</w:t>
-            </w:r>
-            <w:proofErr w:type="spellEnd"/>
-            <w:r>
-              <w:rPr>
-                <w:rFonts w:ascii="Arial Narrow" w:eastAsia="Times New Roman" w:hAnsi="Arial Narrow" w:cs="Fira Code"/>
-                <w:sz w:val="24"/>
-                <w:szCs w:val="24"/>
-                <w:shd w:val="clear" w:color="auto" w:fill="FFFFFF"/>
-                <w:lang w:eastAsia="en-ID"/>
-              </w:rPr>
-              <w:t xml:space="preserve"> </w:t>
+              <w:t xml:space="preserve">. Berdasarkan hasil pemeriksaan terhadap </w:t>
             </w:r>
             <w:r>
               <w:rPr>
@@ -2516,7 +1916,6 @@
               </w:rPr>
               <w:t>${</w:t>
             </w:r>
-            <w:proofErr w:type="spellStart"/>
             <w:r>
               <w:rPr>
                 <w:rFonts w:ascii="Arial Narrow" w:hAnsi="Arial Narrow" w:cs="Arial"/>
@@ -2525,7 +1924,6 @@
               </w:rPr>
               <w:t>suspectExistText</w:t>
             </w:r>
-            <w:proofErr w:type="spellEnd"/>
             <w:r>
               <w:rPr>
                 <w:rFonts w:ascii="Arial Narrow" w:hAnsi="Arial Narrow" w:cs="Arial"/>
@@ -2680,7 +2078,6 @@
                     </w:rPr>
                     <w:t>${</w:t>
                   </w:r>
-                  <w:proofErr w:type="spellStart"/>
                   <w:r>
                     <w:rPr>
                       <w:rFonts w:ascii="Arial Narrow" w:eastAsia="Arial Narrow" w:hAnsi="Arial Narrow"/>
@@ -2691,7 +2088,6 @@
                     </w:rPr>
                     <w:t>suspectName</w:t>
                   </w:r>
-                  <w:proofErr w:type="spellEnd"/>
                   <w:r>
                     <w:rPr>
                       <w:rFonts w:ascii="Arial Narrow" w:eastAsia="Arial Narrow" w:hAnsi="Arial Narrow"/>
@@ -2750,7 +2146,6 @@
                       <w:lang w:eastAsia="en-ID"/>
                     </w:rPr>
                   </w:pPr>
-                  <w:proofErr w:type="spellStart"/>
                   <w:r>
                     <w:rPr>
                       <w:rFonts w:ascii="Arial Narrow" w:eastAsia="Times New Roman" w:hAnsi="Arial Narrow" w:cs="Fira Code"/>
@@ -2759,31 +2154,8 @@
                       <w:shd w:val="clear" w:color="auto" w:fill="FFFFFF"/>
                       <w:lang w:eastAsia="en-ID"/>
                     </w:rPr>
-                    <w:t>nomor</w:t>
-                  </w:r>
-                  <w:proofErr w:type="spellEnd"/>
-                  <w:r>
-                    <w:rPr>
-                      <w:rFonts w:ascii="Arial Narrow" w:eastAsia="Times New Roman" w:hAnsi="Arial Narrow" w:cs="Fira Code"/>
-                      <w:sz w:val="24"/>
-                      <w:szCs w:val="24"/>
-                      <w:shd w:val="clear" w:color="auto" w:fill="FFFFFF"/>
-                      <w:lang w:eastAsia="en-ID"/>
-                    </w:rPr>
-                    <w:t xml:space="preserve"> </w:t>
-                  </w:r>
-                  <w:proofErr w:type="spellStart"/>
-                  <w:r>
-                    <w:rPr>
-                      <w:rFonts w:ascii="Arial Narrow" w:eastAsia="Times New Roman" w:hAnsi="Arial Narrow" w:cs="Fira Code"/>
-                      <w:sz w:val="24"/>
-                      <w:szCs w:val="24"/>
-                      <w:shd w:val="clear" w:color="auto" w:fill="FFFFFF"/>
-                      <w:lang w:eastAsia="en-ID"/>
-                    </w:rPr>
-                    <w:t>identitas</w:t>
-                  </w:r>
-                  <w:proofErr w:type="spellEnd"/>
+                    <w:t>nomor identitas</w:t>
+                  </w:r>
                 </w:p>
               </w:tc>
               <w:tc>
@@ -2840,7 +2212,6 @@
                     </w:rPr>
                     <w:t>${</w:t>
                   </w:r>
-                  <w:proofErr w:type="spellStart"/>
                   <w:r>
                     <w:rPr>
                       <w:rFonts w:ascii="Arial Narrow" w:eastAsia="Arial Narrow" w:hAnsi="Arial Narrow"/>
@@ -2851,7 +2222,6 @@
                     </w:rPr>
                     <w:t>suspectIdentityNumber</w:t>
                   </w:r>
-                  <w:proofErr w:type="spellEnd"/>
                   <w:r>
                     <w:rPr>
                       <w:rFonts w:ascii="Arial Narrow" w:eastAsia="Arial Narrow" w:hAnsi="Arial Narrow"/>
@@ -2910,7 +2280,6 @@
                       <w:lang w:eastAsia="en-ID"/>
                     </w:rPr>
                   </w:pPr>
-                  <w:proofErr w:type="spellStart"/>
                   <w:r>
                     <w:rPr>
                       <w:rFonts w:ascii="Arial Narrow" w:eastAsia="Times New Roman" w:hAnsi="Arial Narrow" w:cs="Fira Code"/>
@@ -2919,9 +2288,18 @@
                       <w:shd w:val="clear" w:color="auto" w:fill="FFFFFF"/>
                       <w:lang w:eastAsia="en-ID"/>
                     </w:rPr>
-                    <w:t>Kewarganegaraan</w:t>
-                  </w:r>
-                  <w:proofErr w:type="spellEnd"/>
+                    <w:t>k</w:t>
+                  </w:r>
+                  <w:r>
+                    <w:rPr>
+                      <w:rFonts w:ascii="Arial Narrow" w:eastAsia="Times New Roman" w:hAnsi="Arial Narrow" w:cs="Fira Code"/>
+                      <w:sz w:val="24"/>
+                      <w:szCs w:val="24"/>
+                      <w:shd w:val="clear" w:color="auto" w:fill="FFFFFF"/>
+                      <w:lang w:eastAsia="en-ID"/>
+                    </w:rPr>
+                    <w:t>ewarganegaraan</w:t>
+                  </w:r>
                 </w:p>
               </w:tc>
               <w:tc>
@@ -2978,7 +2356,6 @@
                     </w:rPr>
                     <w:t>${</w:t>
                   </w:r>
-                  <w:proofErr w:type="spellStart"/>
                   <w:r>
                     <w:rPr>
                       <w:rFonts w:ascii="Arial Narrow" w:eastAsia="Arial Narrow" w:hAnsi="Arial Narrow"/>
@@ -2989,7 +2366,6 @@
                     </w:rPr>
                     <w:t>suspectNationality</w:t>
                   </w:r>
-                  <w:proofErr w:type="spellEnd"/>
                   <w:r>
                     <w:rPr>
                       <w:rFonts w:ascii="Arial Narrow" w:eastAsia="Arial Narrow" w:hAnsi="Arial Narrow"/>
@@ -3056,9 +2432,8 @@
                       <w:shd w:val="clear" w:color="auto" w:fill="FFFFFF"/>
                       <w:lang w:eastAsia="en-ID"/>
                     </w:rPr>
-                    <w:t xml:space="preserve">Jenis </w:t>
-                  </w:r>
-                  <w:proofErr w:type="spellStart"/>
+                    <w:t>j</w:t>
+                  </w:r>
                   <w:r>
                     <w:rPr>
                       <w:rFonts w:ascii="Arial Narrow" w:eastAsia="Times New Roman" w:hAnsi="Arial Narrow" w:cs="Fira Code"/>
@@ -3067,9 +2442,8 @@
                       <w:shd w:val="clear" w:color="auto" w:fill="FFFFFF"/>
                       <w:lang w:eastAsia="en-ID"/>
                     </w:rPr>
-                    <w:t>kelamin</w:t>
-                  </w:r>
-                  <w:proofErr w:type="spellEnd"/>
+                    <w:t>enis kelamin</w:t>
+                  </w:r>
                 </w:p>
               </w:tc>
               <w:tc>
@@ -3126,7 +2500,6 @@
                     </w:rPr>
                     <w:t>${</w:t>
                   </w:r>
-                  <w:proofErr w:type="spellStart"/>
                   <w:r>
                     <w:rPr>
                       <w:rFonts w:ascii="Arial Narrow" w:eastAsia="Arial Narrow" w:hAnsi="Arial Narrow"/>
@@ -3147,7 +2520,6 @@
                     </w:rPr>
                     <w:t>Name</w:t>
                   </w:r>
-                  <w:proofErr w:type="spellEnd"/>
                   <w:r>
                     <w:rPr>
                       <w:rFonts w:ascii="Arial Narrow" w:eastAsia="Arial Narrow" w:hAnsi="Arial Narrow"/>
@@ -3206,7 +2578,6 @@
                       <w:lang w:eastAsia="en-ID"/>
                     </w:rPr>
                   </w:pPr>
-                  <w:proofErr w:type="spellStart"/>
                   <w:r>
                     <w:rPr>
                       <w:rFonts w:ascii="Arial Narrow" w:eastAsia="Times New Roman" w:hAnsi="Arial Narrow" w:cs="Fira Code"/>
@@ -3215,53 +2586,8 @@
                       <w:shd w:val="clear" w:color="auto" w:fill="FFFFFF"/>
                       <w:lang w:eastAsia="en-ID"/>
                     </w:rPr>
-                    <w:t>tempat</w:t>
-                  </w:r>
-                  <w:proofErr w:type="spellEnd"/>
-                  <w:r>
-                    <w:rPr>
-                      <w:rFonts w:ascii="Arial Narrow" w:eastAsia="Times New Roman" w:hAnsi="Arial Narrow" w:cs="Fira Code"/>
-                      <w:sz w:val="24"/>
-                      <w:szCs w:val="24"/>
-                      <w:shd w:val="clear" w:color="auto" w:fill="FFFFFF"/>
-                      <w:lang w:eastAsia="en-ID"/>
-                    </w:rPr>
-                    <w:t>/</w:t>
-                  </w:r>
-                  <w:proofErr w:type="spellStart"/>
-                  <w:r>
-                    <w:rPr>
-                      <w:rFonts w:ascii="Arial Narrow" w:eastAsia="Times New Roman" w:hAnsi="Arial Narrow" w:cs="Fira Code"/>
-                      <w:sz w:val="24"/>
-                      <w:szCs w:val="24"/>
-                      <w:shd w:val="clear" w:color="auto" w:fill="FFFFFF"/>
-                      <w:lang w:eastAsia="en-ID"/>
-                    </w:rPr>
-                    <w:t>tanggal</w:t>
-                  </w:r>
-                  <w:proofErr w:type="spellEnd"/>
-                  <w:r>
-                    <w:rPr>
-                      <w:rFonts w:ascii="Arial Narrow" w:eastAsia="Times New Roman" w:hAnsi="Arial Narrow" w:cs="Fira Code"/>
-                      <w:sz w:val="24"/>
-                      <w:szCs w:val="24"/>
-                      <w:shd w:val="clear" w:color="auto" w:fill="FFFFFF"/>
-                      <w:lang w:eastAsia="en-ID"/>
-                    </w:rPr>
-                    <w:t xml:space="preserve"> </w:t>
-                  </w:r>
-                  <w:proofErr w:type="spellStart"/>
-                  <w:r>
-                    <w:rPr>
-                      <w:rFonts w:ascii="Arial Narrow" w:eastAsia="Times New Roman" w:hAnsi="Arial Narrow" w:cs="Fira Code"/>
-                      <w:sz w:val="24"/>
-                      <w:szCs w:val="24"/>
-                      <w:shd w:val="clear" w:color="auto" w:fill="FFFFFF"/>
-                      <w:lang w:eastAsia="en-ID"/>
-                    </w:rPr>
-                    <w:t>lahir</w:t>
-                  </w:r>
-                  <w:proofErr w:type="spellEnd"/>
+                    <w:t>tempat/tanggal lahir</w:t>
+                  </w:r>
                 </w:p>
               </w:tc>
               <w:tc>
@@ -3318,7 +2644,6 @@
                     </w:rPr>
                     <w:t>${</w:t>
                   </w:r>
-                  <w:proofErr w:type="spellStart"/>
                   <w:r>
                     <w:rPr>
                       <w:rFonts w:ascii="Arial Narrow" w:eastAsia="Arial Narrow" w:hAnsi="Arial Narrow"/>
@@ -3329,7 +2654,6 @@
                     </w:rPr>
                     <w:t>suspectBirthPlace</w:t>
                   </w:r>
-                  <w:proofErr w:type="spellEnd"/>
                   <w:r>
                     <w:rPr>
                       <w:rFonts w:ascii="Arial Narrow" w:eastAsia="Arial Narrow" w:hAnsi="Arial Narrow"/>
@@ -3360,7 +2684,6 @@
                     </w:rPr>
                     <w:t>${</w:t>
                   </w:r>
-                  <w:proofErr w:type="spellStart"/>
                   <w:r>
                     <w:rPr>
                       <w:rFonts w:ascii="Arial Narrow" w:eastAsia="Arial Narrow" w:hAnsi="Arial Narrow"/>
@@ -3371,7 +2694,6 @@
                     </w:rPr>
                     <w:t>suspectBirthDate</w:t>
                   </w:r>
-                  <w:proofErr w:type="spellEnd"/>
                   <w:r>
                     <w:rPr>
                       <w:rFonts w:ascii="Arial Narrow" w:eastAsia="Arial Narrow" w:hAnsi="Arial Narrow"/>
@@ -3430,7 +2752,6 @@
                       <w:lang w:eastAsia="en-ID"/>
                     </w:rPr>
                   </w:pPr>
-                  <w:proofErr w:type="spellStart"/>
                   <w:r>
                     <w:rPr>
                       <w:rFonts w:ascii="Arial Narrow" w:eastAsia="Times New Roman" w:hAnsi="Arial Narrow" w:cs="Fira Code"/>
@@ -3441,7 +2762,6 @@
                     </w:rPr>
                     <w:t>pekerjaan</w:t>
                   </w:r>
-                  <w:proofErr w:type="spellEnd"/>
                 </w:p>
               </w:tc>
               <w:tc>
@@ -3498,7 +2818,6 @@
                     </w:rPr>
                     <w:t>${</w:t>
                   </w:r>
-                  <w:proofErr w:type="spellStart"/>
                   <w:r>
                     <w:rPr>
                       <w:rFonts w:ascii="Arial Narrow" w:eastAsia="Arial Narrow" w:hAnsi="Arial Narrow"/>
@@ -3509,7 +2828,6 @@
                     </w:rPr>
                     <w:t>suspectJobName</w:t>
                   </w:r>
-                  <w:proofErr w:type="spellEnd"/>
                   <w:r>
                     <w:rPr>
                       <w:rFonts w:ascii="Arial Narrow" w:eastAsia="Arial Narrow" w:hAnsi="Arial Narrow"/>
@@ -3634,7 +2952,6 @@
                     </w:rPr>
                     <w:t>${</w:t>
                   </w:r>
-                  <w:proofErr w:type="spellStart"/>
                   <w:r>
                     <w:rPr>
                       <w:rFonts w:ascii="Arial Narrow" w:eastAsia="Arial Narrow" w:hAnsi="Arial Narrow"/>
@@ -3645,7 +2962,6 @@
                     </w:rPr>
                     <w:t>suspectReligionName</w:t>
                   </w:r>
-                  <w:proofErr w:type="spellEnd"/>
                   <w:r>
                     <w:rPr>
                       <w:rFonts w:ascii="Arial Narrow" w:eastAsia="Arial Narrow" w:hAnsi="Arial Narrow"/>
@@ -3714,7 +3030,6 @@
                       <w:lang w:eastAsia="en-ID"/>
                     </w:rPr>
                   </w:pPr>
-                  <w:proofErr w:type="spellStart"/>
                   <w:r>
                     <w:rPr>
                       <w:rFonts w:ascii="Arial Narrow" w:eastAsia="Times New Roman" w:hAnsi="Arial Narrow" w:cs="Fira Code"/>
@@ -3725,7 +3040,6 @@
                     </w:rPr>
                     <w:t>alamat</w:t>
                   </w:r>
-                  <w:proofErr w:type="spellEnd"/>
                 </w:p>
               </w:tc>
               <w:tc>
@@ -3785,7 +3099,6 @@
                     </w:rPr>
                     <w:t>${</w:t>
                   </w:r>
-                  <w:proofErr w:type="spellStart"/>
                   <w:r>
                     <w:rPr>
                       <w:rFonts w:ascii="Arial Narrow" w:eastAsia="Arial Narrow" w:hAnsi="Arial Narrow"/>
@@ -3816,7 +3129,6 @@
                     </w:rPr>
                     <w:t>Address</w:t>
                   </w:r>
-                  <w:proofErr w:type="spellEnd"/>
                   <w:r>
                     <w:rPr>
                       <w:rFonts w:ascii="Arial Narrow" w:eastAsia="Arial Narrow" w:hAnsi="Arial Narrow"/>
@@ -3855,293 +3167,13 @@
                 <w:szCs w:val="24"/>
               </w:rPr>
             </w:pPr>
-            <w:proofErr w:type="spellStart"/>
             <w:r>
               <w:rPr>
                 <w:rFonts w:ascii="Arial Narrow" w:hAnsi="Arial Narrow" w:cs="Arial"/>
                 <w:sz w:val="24"/>
                 <w:szCs w:val="24"/>
               </w:rPr>
-              <w:t>Menerangkan</w:t>
-            </w:r>
-            <w:proofErr w:type="spellEnd"/>
-            <w:r>
-              <w:rPr>
-                <w:rFonts w:ascii="Arial Narrow" w:hAnsi="Arial Narrow" w:cs="Arial"/>
-                <w:sz w:val="24"/>
-                <w:szCs w:val="24"/>
-              </w:rPr>
-              <w:t xml:space="preserve"> </w:t>
-            </w:r>
-            <w:proofErr w:type="spellStart"/>
-            <w:r>
-              <w:rPr>
-                <w:rFonts w:ascii="Arial Narrow" w:hAnsi="Arial Narrow" w:cs="Arial"/>
-                <w:sz w:val="24"/>
-                <w:szCs w:val="24"/>
-              </w:rPr>
-              <w:t>bahwa</w:t>
-            </w:r>
-            <w:proofErr w:type="spellEnd"/>
-            <w:r>
-              <w:rPr>
-                <w:rFonts w:ascii="Arial Narrow" w:hAnsi="Arial Narrow" w:cs="Arial"/>
-                <w:sz w:val="24"/>
-                <w:szCs w:val="24"/>
-              </w:rPr>
-              <w:t xml:space="preserve"> </w:t>
-            </w:r>
-            <w:proofErr w:type="spellStart"/>
-            <w:r>
-              <w:rPr>
-                <w:rFonts w:ascii="Arial Narrow" w:hAnsi="Arial Narrow" w:cs="Arial"/>
-                <w:sz w:val="24"/>
-                <w:szCs w:val="24"/>
-              </w:rPr>
-              <w:t>terdapat</w:t>
-            </w:r>
-            <w:proofErr w:type="spellEnd"/>
-            <w:r>
-              <w:rPr>
-                <w:rFonts w:ascii="Arial Narrow" w:hAnsi="Arial Narrow" w:cs="Arial"/>
-                <w:sz w:val="24"/>
-                <w:szCs w:val="24"/>
-              </w:rPr>
-              <w:t xml:space="preserve"> </w:t>
-            </w:r>
-            <w:proofErr w:type="spellStart"/>
-            <w:r>
-              <w:rPr>
-                <w:rFonts w:ascii="Arial Narrow" w:hAnsi="Arial Narrow" w:cs="Arial"/>
-                <w:sz w:val="24"/>
-                <w:szCs w:val="24"/>
-              </w:rPr>
-              <w:t>barang</w:t>
-            </w:r>
-            <w:proofErr w:type="spellEnd"/>
-            <w:r>
-              <w:rPr>
-                <w:rFonts w:ascii="Arial Narrow" w:hAnsi="Arial Narrow" w:cs="Arial"/>
-                <w:sz w:val="24"/>
-                <w:szCs w:val="24"/>
-              </w:rPr>
-              <w:t xml:space="preserve"> </w:t>
-            </w:r>
-            <w:proofErr w:type="spellStart"/>
-            <w:r>
-              <w:rPr>
-                <w:rFonts w:ascii="Arial Narrow" w:hAnsi="Arial Narrow" w:cs="Arial"/>
-                <w:sz w:val="24"/>
-                <w:szCs w:val="24"/>
-              </w:rPr>
-              <w:t>bukti</w:t>
-            </w:r>
-            <w:proofErr w:type="spellEnd"/>
-            <w:r>
-              <w:rPr>
-                <w:rFonts w:ascii="Arial Narrow" w:hAnsi="Arial Narrow" w:cs="Arial"/>
-                <w:sz w:val="24"/>
-                <w:szCs w:val="24"/>
-              </w:rPr>
-              <w:t xml:space="preserve"> yang </w:t>
-            </w:r>
-            <w:proofErr w:type="spellStart"/>
-            <w:r>
-              <w:rPr>
-                <w:rFonts w:ascii="Arial Narrow" w:hAnsi="Arial Narrow" w:cs="Arial"/>
-                <w:sz w:val="24"/>
-                <w:szCs w:val="24"/>
-              </w:rPr>
-              <w:t>ada</w:t>
-            </w:r>
-            <w:proofErr w:type="spellEnd"/>
-            <w:r>
-              <w:rPr>
-                <w:rFonts w:ascii="Arial Narrow" w:hAnsi="Arial Narrow" w:cs="Arial"/>
-                <w:sz w:val="24"/>
-                <w:szCs w:val="24"/>
-              </w:rPr>
-              <w:t xml:space="preserve"> </w:t>
-            </w:r>
-            <w:proofErr w:type="spellStart"/>
-            <w:r>
-              <w:rPr>
-                <w:rFonts w:ascii="Arial Narrow" w:hAnsi="Arial Narrow" w:cs="Arial"/>
-                <w:sz w:val="24"/>
-                <w:szCs w:val="24"/>
-              </w:rPr>
-              <w:t>kaitan</w:t>
-            </w:r>
-            <w:proofErr w:type="spellEnd"/>
-            <w:r>
-              <w:rPr>
-                <w:rFonts w:ascii="Arial Narrow" w:hAnsi="Arial Narrow" w:cs="Arial"/>
-                <w:sz w:val="24"/>
-                <w:szCs w:val="24"/>
-              </w:rPr>
-              <w:t xml:space="preserve"> </w:t>
-            </w:r>
-            <w:proofErr w:type="spellStart"/>
-            <w:r>
-              <w:rPr>
-                <w:rFonts w:ascii="Arial Narrow" w:hAnsi="Arial Narrow" w:cs="Arial"/>
-                <w:sz w:val="24"/>
-                <w:szCs w:val="24"/>
-              </w:rPr>
-              <w:t>langsung</w:t>
-            </w:r>
-            <w:proofErr w:type="spellEnd"/>
-            <w:r>
-              <w:rPr>
-                <w:rFonts w:ascii="Arial Narrow" w:hAnsi="Arial Narrow" w:cs="Arial"/>
-                <w:sz w:val="24"/>
-                <w:szCs w:val="24"/>
-              </w:rPr>
-              <w:t>/</w:t>
-            </w:r>
-            <w:proofErr w:type="spellStart"/>
-            <w:r>
-              <w:rPr>
-                <w:rFonts w:ascii="Arial Narrow" w:hAnsi="Arial Narrow" w:cs="Arial"/>
-                <w:sz w:val="24"/>
-                <w:szCs w:val="24"/>
-              </w:rPr>
-              <w:t>tidak</w:t>
-            </w:r>
-            <w:proofErr w:type="spellEnd"/>
-            <w:r>
-              <w:rPr>
-                <w:rFonts w:ascii="Arial Narrow" w:hAnsi="Arial Narrow" w:cs="Arial"/>
-                <w:sz w:val="24"/>
-                <w:szCs w:val="24"/>
-              </w:rPr>
-              <w:t xml:space="preserve"> </w:t>
-            </w:r>
-            <w:proofErr w:type="spellStart"/>
-            <w:r>
-              <w:rPr>
-                <w:rFonts w:ascii="Arial Narrow" w:hAnsi="Arial Narrow" w:cs="Arial"/>
-                <w:sz w:val="24"/>
-                <w:szCs w:val="24"/>
-              </w:rPr>
-              <w:t>langsung</w:t>
-            </w:r>
-            <w:proofErr w:type="spellEnd"/>
-            <w:r>
-              <w:rPr>
-                <w:rFonts w:ascii="Arial Narrow" w:hAnsi="Arial Narrow" w:cs="Arial"/>
-                <w:sz w:val="24"/>
-                <w:szCs w:val="24"/>
-              </w:rPr>
-              <w:t xml:space="preserve"> </w:t>
-            </w:r>
-            <w:proofErr w:type="spellStart"/>
-            <w:r>
-              <w:rPr>
-                <w:rFonts w:ascii="Arial Narrow" w:hAnsi="Arial Narrow" w:cs="Arial"/>
-                <w:sz w:val="24"/>
-                <w:szCs w:val="24"/>
-              </w:rPr>
-              <w:t>dengan</w:t>
-            </w:r>
-            <w:proofErr w:type="spellEnd"/>
-            <w:r>
-              <w:rPr>
-                <w:rFonts w:ascii="Arial Narrow" w:hAnsi="Arial Narrow" w:cs="Arial"/>
-                <w:sz w:val="24"/>
-                <w:szCs w:val="24"/>
-              </w:rPr>
-              <w:t xml:space="preserve"> </w:t>
-            </w:r>
-            <w:proofErr w:type="spellStart"/>
-            <w:r>
-              <w:rPr>
-                <w:rFonts w:ascii="Arial Narrow" w:hAnsi="Arial Narrow" w:cs="Arial"/>
-                <w:sz w:val="24"/>
-                <w:szCs w:val="24"/>
-              </w:rPr>
-              <w:t>perkara</w:t>
-            </w:r>
-            <w:proofErr w:type="spellEnd"/>
-            <w:r>
-              <w:rPr>
-                <w:rFonts w:ascii="Arial Narrow" w:hAnsi="Arial Narrow" w:cs="Arial"/>
-                <w:sz w:val="24"/>
-                <w:szCs w:val="24"/>
-              </w:rPr>
-              <w:t xml:space="preserve"> yang </w:t>
-            </w:r>
-            <w:proofErr w:type="spellStart"/>
-            <w:r>
-              <w:rPr>
-                <w:rFonts w:ascii="Arial Narrow" w:hAnsi="Arial Narrow" w:cs="Arial"/>
-                <w:sz w:val="24"/>
-                <w:szCs w:val="24"/>
-              </w:rPr>
-              <w:t>sedang</w:t>
-            </w:r>
-            <w:proofErr w:type="spellEnd"/>
-            <w:r>
-              <w:rPr>
-                <w:rFonts w:ascii="Arial Narrow" w:hAnsi="Arial Narrow" w:cs="Arial"/>
-                <w:sz w:val="24"/>
-                <w:szCs w:val="24"/>
-              </w:rPr>
-              <w:t xml:space="preserve"> </w:t>
-            </w:r>
-            <w:proofErr w:type="spellStart"/>
-            <w:r>
-              <w:rPr>
-                <w:rFonts w:ascii="Arial Narrow" w:hAnsi="Arial Narrow" w:cs="Arial"/>
-                <w:sz w:val="24"/>
-                <w:szCs w:val="24"/>
-              </w:rPr>
-              <w:t>dilakukan</w:t>
-            </w:r>
-            <w:proofErr w:type="spellEnd"/>
-            <w:r>
-              <w:rPr>
-                <w:rFonts w:ascii="Arial Narrow" w:hAnsi="Arial Narrow" w:cs="Arial"/>
-                <w:sz w:val="24"/>
-                <w:szCs w:val="24"/>
-              </w:rPr>
-              <w:t xml:space="preserve"> </w:t>
-            </w:r>
-            <w:proofErr w:type="spellStart"/>
-            <w:r>
-              <w:rPr>
-                <w:rFonts w:ascii="Arial Narrow" w:hAnsi="Arial Narrow" w:cs="Arial"/>
-                <w:sz w:val="24"/>
-                <w:szCs w:val="24"/>
-              </w:rPr>
-              <w:t>penyidikan</w:t>
-            </w:r>
-            <w:proofErr w:type="spellEnd"/>
-            <w:r>
-              <w:rPr>
-                <w:rFonts w:ascii="Arial Narrow" w:hAnsi="Arial Narrow" w:cs="Arial"/>
-                <w:sz w:val="24"/>
-                <w:szCs w:val="24"/>
-              </w:rPr>
-              <w:t xml:space="preserve"> </w:t>
-            </w:r>
-            <w:proofErr w:type="spellStart"/>
-            <w:r>
-              <w:rPr>
-                <w:rFonts w:ascii="Arial Narrow" w:hAnsi="Arial Narrow" w:cs="Arial"/>
-                <w:sz w:val="24"/>
-                <w:szCs w:val="24"/>
-              </w:rPr>
-              <w:t>berupa</w:t>
-            </w:r>
-            <w:proofErr w:type="spellEnd"/>
-            <w:r>
-              <w:rPr>
-                <w:rFonts w:ascii="Arial Narrow" w:hAnsi="Arial Narrow" w:cs="Arial"/>
-                <w:sz w:val="24"/>
-                <w:szCs w:val="24"/>
-              </w:rPr>
-              <w:t>:</w:t>
+              <w:t>Menerangkan bahwa terdapat barang bukti yang ada kaitan langsung/tidak langsung dengan perkara yang sedang dilakukan penyidikan berupa:</w:t>
             </w:r>
           </w:p>
         </w:tc>
@@ -4188,16 +3220,15 @@
                 <w:sz w:val="24"/>
                 <w:szCs w:val="24"/>
               </w:rPr>
-              <w:t>${</w:t>
-            </w:r>
-            <w:proofErr w:type="spellStart"/>
+              <w:t>${seized</w:t>
+            </w:r>
             <w:r>
               <w:rPr>
                 <w:rFonts w:ascii="Arial Narrow" w:hAnsi="Arial Narrow" w:cs="Arial"/>
                 <w:sz w:val="24"/>
                 <w:szCs w:val="24"/>
               </w:rPr>
-              <w:t>seized</w:t>
+              <w:t>I</w:t>
             </w:r>
             <w:r>
               <w:rPr>
@@ -4205,24 +3236,7 @@
                 <w:sz w:val="24"/>
                 <w:szCs w:val="24"/>
               </w:rPr>
-              <w:t>I</w:t>
-            </w:r>
-            <w:r>
-              <w:rPr>
-                <w:rFonts w:ascii="Arial Narrow" w:hAnsi="Arial Narrow" w:cs="Arial"/>
-                <w:sz w:val="24"/>
-                <w:szCs w:val="24"/>
-              </w:rPr>
-              <w:t>teration</w:t>
-            </w:r>
-            <w:proofErr w:type="spellEnd"/>
-            <w:r>
-              <w:rPr>
-                <w:rFonts w:ascii="Arial Narrow" w:hAnsi="Arial Narrow" w:cs="Arial"/>
-                <w:sz w:val="24"/>
-                <w:szCs w:val="24"/>
-              </w:rPr>
-              <w:t>}</w:t>
+              <w:t>teration}</w:t>
             </w:r>
           </w:p>
         </w:tc>
@@ -4248,7 +3262,6 @@
               </w:rPr>
               <w:t>${</w:t>
             </w:r>
-            <w:proofErr w:type="spellStart"/>
             <w:r>
               <w:rPr>
                 <w:rFonts w:ascii="Arial Narrow" w:hAnsi="Arial Narrow" w:cs="Arial"/>
@@ -4271,16 +3284,7 @@
                 <w:sz w:val="24"/>
                 <w:szCs w:val="24"/>
               </w:rPr>
-              <w:t>ems</w:t>
-            </w:r>
-            <w:proofErr w:type="spellEnd"/>
-            <w:r>
-              <w:rPr>
-                <w:rFonts w:ascii="Arial Narrow" w:hAnsi="Arial Narrow" w:cs="Arial"/>
-                <w:sz w:val="24"/>
-                <w:szCs w:val="24"/>
-              </w:rPr>
-              <w:t>}</w:t>
+              <w:t>ems}</w:t>
             </w:r>
           </w:p>
         </w:tc>
@@ -4381,7 +3385,6 @@
                 <w:lang w:eastAsia="en-ID"/>
               </w:rPr>
             </w:pPr>
-            <w:proofErr w:type="spellStart"/>
             <w:r>
               <w:rPr>
                 <w:rFonts w:ascii="Arial Narrow" w:hAnsi="Arial Narrow" w:cs="Arial"/>
@@ -4389,9 +3392,8 @@
                 <w:sz w:val="24"/>
                 <w:szCs w:val="24"/>
               </w:rPr>
-              <w:t>Berkaitan</w:t>
-            </w:r>
-            <w:proofErr w:type="spellEnd"/>
+              <w:t xml:space="preserve">Berkaitan </w:t>
+            </w:r>
             <w:r>
               <w:rPr>
                 <w:rFonts w:ascii="Arial Narrow" w:hAnsi="Arial Narrow" w:cs="Arial"/>
@@ -4399,9 +3401,8 @@
                 <w:sz w:val="24"/>
                 <w:szCs w:val="24"/>
               </w:rPr>
-              <w:t xml:space="preserve"> </w:t>
-            </w:r>
-            <w:proofErr w:type="spellStart"/>
+              <w:t>dengan hal</w:t>
+            </w:r>
             <w:r>
               <w:rPr>
                 <w:rFonts w:ascii="Arial Narrow" w:hAnsi="Arial Narrow" w:cs="Arial"/>
@@ -4409,9 +3410,8 @@
                 <w:sz w:val="24"/>
                 <w:szCs w:val="24"/>
               </w:rPr>
-              <w:t>dengan</w:t>
-            </w:r>
-            <w:proofErr w:type="spellEnd"/>
+              <w:t xml:space="preserve"> tersebut, </w:t>
+            </w:r>
             <w:r>
               <w:rPr>
                 <w:rFonts w:ascii="Arial Narrow" w:hAnsi="Arial Narrow" w:cs="Arial"/>
@@ -4419,9 +3419,8 @@
                 <w:sz w:val="24"/>
                 <w:szCs w:val="24"/>
               </w:rPr>
-              <w:t xml:space="preserve"> </w:t>
-            </w:r>
-            <w:proofErr w:type="spellStart"/>
+              <w:t>b</w:t>
+            </w:r>
             <w:r>
               <w:rPr>
                 <w:rFonts w:ascii="Arial Narrow" w:hAnsi="Arial Narrow" w:cs="Arial"/>
@@ -4429,9 +3428,8 @@
                 <w:sz w:val="24"/>
                 <w:szCs w:val="24"/>
               </w:rPr>
-              <w:t>hal</w:t>
-            </w:r>
-            <w:proofErr w:type="spellEnd"/>
+              <w:t xml:space="preserve">ersama ini diajukan kepada Ketua permohonan izin penyitaan terhadap benda yang berhubungan langsung dengan </w:t>
+            </w:r>
             <w:r>
               <w:rPr>
                 <w:rFonts w:ascii="Arial Narrow" w:hAnsi="Arial Narrow" w:cs="Arial"/>
@@ -4439,9 +3437,8 @@
                 <w:sz w:val="24"/>
                 <w:szCs w:val="24"/>
               </w:rPr>
-              <w:t xml:space="preserve"> </w:t>
-            </w:r>
-            <w:proofErr w:type="spellStart"/>
+              <w:t>t</w:t>
+            </w:r>
             <w:r>
               <w:rPr>
                 <w:rFonts w:ascii="Arial Narrow" w:hAnsi="Arial Narrow" w:cs="Arial"/>
@@ -4449,9 +3446,8 @@
                 <w:sz w:val="24"/>
                 <w:szCs w:val="24"/>
               </w:rPr>
-              <w:t>tersebut</w:t>
-            </w:r>
-            <w:proofErr w:type="spellEnd"/>
+              <w:t xml:space="preserve">indak </w:t>
+            </w:r>
             <w:r>
               <w:rPr>
                 <w:rFonts w:ascii="Arial Narrow" w:hAnsi="Arial Narrow" w:cs="Arial"/>
@@ -4459,9 +3455,8 @@
                 <w:sz w:val="24"/>
                 <w:szCs w:val="24"/>
               </w:rPr>
-              <w:t xml:space="preserve">, </w:t>
-            </w:r>
-            <w:proofErr w:type="spellStart"/>
+              <w:t>p</w:t>
+            </w:r>
             <w:r>
               <w:rPr>
                 <w:rFonts w:ascii="Arial Narrow" w:hAnsi="Arial Narrow" w:cs="Arial"/>
@@ -4469,7 +3464,7 @@
                 <w:sz w:val="24"/>
                 <w:szCs w:val="24"/>
               </w:rPr>
-              <w:t>b</w:t>
+              <w:t>idana yang sedang dilakukan penyidikan, sebagaimana kelengkapan administrasi izin penyitaan terlampir</w:t>
             </w:r>
             <w:r>
               <w:rPr>
@@ -4478,9 +3473,8 @@
                 <w:sz w:val="24"/>
                 <w:szCs w:val="24"/>
               </w:rPr>
-              <w:t>ersama</w:t>
-            </w:r>
-            <w:proofErr w:type="spellEnd"/>
+              <w:t>. Untuk</w:t>
+            </w:r>
             <w:r>
               <w:rPr>
                 <w:rFonts w:ascii="Arial Narrow" w:hAnsi="Arial Narrow" w:cs="Arial"/>
@@ -4488,9 +3482,8 @@
                 <w:sz w:val="24"/>
                 <w:szCs w:val="24"/>
               </w:rPr>
-              <w:t xml:space="preserve"> </w:t>
-            </w:r>
-            <w:proofErr w:type="spellStart"/>
+              <w:t xml:space="preserve"> memudahkan berkomunikasi </w:t>
+            </w:r>
             <w:r>
               <w:rPr>
                 <w:rFonts w:ascii="Arial Narrow" w:hAnsi="Arial Narrow" w:cs="Arial"/>
@@ -4498,9 +3491,8 @@
                 <w:sz w:val="24"/>
                 <w:szCs w:val="24"/>
               </w:rPr>
-              <w:t>ini</w:t>
-            </w:r>
-            <w:proofErr w:type="spellEnd"/>
+              <w:t xml:space="preserve">dan berkoordinasi </w:t>
+            </w:r>
             <w:r>
               <w:rPr>
                 <w:rFonts w:ascii="Arial Narrow" w:hAnsi="Arial Narrow" w:cs="Arial"/>
@@ -4508,9 +3500,8 @@
                 <w:sz w:val="24"/>
                 <w:szCs w:val="24"/>
               </w:rPr>
-              <w:t xml:space="preserve"> </w:t>
-            </w:r>
-            <w:proofErr w:type="spellStart"/>
+              <w:t xml:space="preserve">dapat menghubungi </w:t>
+            </w:r>
             <w:r>
               <w:rPr>
                 <w:rFonts w:ascii="Arial Narrow" w:hAnsi="Arial Narrow" w:cs="Arial"/>
@@ -4518,9 +3509,19 @@
                 <w:sz w:val="24"/>
                 <w:szCs w:val="24"/>
               </w:rPr>
-              <w:t>diajukan</w:t>
-            </w:r>
-            <w:proofErr w:type="spellEnd"/>
+              <w:t xml:space="preserve">penyidik atas nama ${investigatorName} dengan nomor </w:t>
+            </w:r>
+            <w:r>
+              <w:rPr>
+                <w:rFonts w:ascii="Arial Narrow" w:hAnsi="Arial Narrow" w:cs="Arial"/>
+                <w:i/>
+                <w:iCs/>
+                <w:color w:val="000000"/>
+                <w:sz w:val="24"/>
+                <w:szCs w:val="24"/>
+              </w:rPr>
+              <w:t>Hp</w:t>
+            </w:r>
             <w:r>
               <w:rPr>
                 <w:rFonts w:ascii="Arial Narrow" w:hAnsi="Arial Narrow" w:cs="Arial"/>
@@ -4528,9 +3529,8 @@
                 <w:sz w:val="24"/>
                 <w:szCs w:val="24"/>
               </w:rPr>
-              <w:t xml:space="preserve"> </w:t>
-            </w:r>
-            <w:proofErr w:type="spellStart"/>
+              <w:t xml:space="preserve">. </w:t>
+            </w:r>
             <w:r>
               <w:rPr>
                 <w:rFonts w:ascii="Arial Narrow" w:hAnsi="Arial Narrow" w:cs="Arial"/>
@@ -4538,9 +3538,8 @@
                 <w:sz w:val="24"/>
                 <w:szCs w:val="24"/>
               </w:rPr>
-              <w:t>kepada</w:t>
-            </w:r>
-            <w:proofErr w:type="spellEnd"/>
+              <w:t>+</w:t>
+            </w:r>
             <w:r>
               <w:rPr>
                 <w:rFonts w:ascii="Arial Narrow" w:hAnsi="Arial Narrow" w:cs="Arial"/>
@@ -4548,674 +3547,7 @@
                 <w:sz w:val="24"/>
                 <w:szCs w:val="24"/>
               </w:rPr>
-              <w:t xml:space="preserve"> </w:t>
-            </w:r>
-            <w:proofErr w:type="spellStart"/>
-            <w:r>
-              <w:rPr>
-                <w:rFonts w:ascii="Arial Narrow" w:hAnsi="Arial Narrow" w:cs="Arial"/>
-                <w:color w:val="000000"/>
-                <w:sz w:val="24"/>
-                <w:szCs w:val="24"/>
-              </w:rPr>
-              <w:t>Ketua</w:t>
-            </w:r>
-            <w:proofErr w:type="spellEnd"/>
-            <w:r>
-              <w:rPr>
-                <w:rFonts w:ascii="Arial Narrow" w:hAnsi="Arial Narrow" w:cs="Arial"/>
-                <w:color w:val="000000"/>
-                <w:sz w:val="24"/>
-                <w:szCs w:val="24"/>
-              </w:rPr>
-              <w:t xml:space="preserve"> </w:t>
-            </w:r>
-            <w:proofErr w:type="spellStart"/>
-            <w:r>
-              <w:rPr>
-                <w:rFonts w:ascii="Arial Narrow" w:hAnsi="Arial Narrow" w:cs="Arial"/>
-                <w:color w:val="000000"/>
-                <w:sz w:val="24"/>
-                <w:szCs w:val="24"/>
-              </w:rPr>
-              <w:t>permohonan</w:t>
-            </w:r>
-            <w:proofErr w:type="spellEnd"/>
-            <w:r>
-              <w:rPr>
-                <w:rFonts w:ascii="Arial Narrow" w:hAnsi="Arial Narrow" w:cs="Arial"/>
-                <w:color w:val="000000"/>
-                <w:sz w:val="24"/>
-                <w:szCs w:val="24"/>
-              </w:rPr>
-              <w:t xml:space="preserve"> </w:t>
-            </w:r>
-            <w:proofErr w:type="spellStart"/>
-            <w:r>
-              <w:rPr>
-                <w:rFonts w:ascii="Arial Narrow" w:hAnsi="Arial Narrow" w:cs="Arial"/>
-                <w:color w:val="000000"/>
-                <w:sz w:val="24"/>
-                <w:szCs w:val="24"/>
-              </w:rPr>
-              <w:t>izin</w:t>
-            </w:r>
-            <w:proofErr w:type="spellEnd"/>
-            <w:r>
-              <w:rPr>
-                <w:rFonts w:ascii="Arial Narrow" w:hAnsi="Arial Narrow" w:cs="Arial"/>
-                <w:color w:val="000000"/>
-                <w:sz w:val="24"/>
-                <w:szCs w:val="24"/>
-              </w:rPr>
-              <w:t xml:space="preserve"> </w:t>
-            </w:r>
-            <w:proofErr w:type="spellStart"/>
-            <w:r>
-              <w:rPr>
-                <w:rFonts w:ascii="Arial Narrow" w:hAnsi="Arial Narrow" w:cs="Arial"/>
-                <w:color w:val="000000"/>
-                <w:sz w:val="24"/>
-                <w:szCs w:val="24"/>
-              </w:rPr>
-              <w:t>penyitaan</w:t>
-            </w:r>
-            <w:proofErr w:type="spellEnd"/>
-            <w:r>
-              <w:rPr>
-                <w:rFonts w:ascii="Arial Narrow" w:hAnsi="Arial Narrow" w:cs="Arial"/>
-                <w:color w:val="000000"/>
-                <w:sz w:val="24"/>
-                <w:szCs w:val="24"/>
-              </w:rPr>
-              <w:t xml:space="preserve"> </w:t>
-            </w:r>
-            <w:proofErr w:type="spellStart"/>
-            <w:r>
-              <w:rPr>
-                <w:rFonts w:ascii="Arial Narrow" w:hAnsi="Arial Narrow" w:cs="Arial"/>
-                <w:color w:val="000000"/>
-                <w:sz w:val="24"/>
-                <w:szCs w:val="24"/>
-              </w:rPr>
-              <w:t>terhadap</w:t>
-            </w:r>
-            <w:proofErr w:type="spellEnd"/>
-            <w:r>
-              <w:rPr>
-                <w:rFonts w:ascii="Arial Narrow" w:hAnsi="Arial Narrow" w:cs="Arial"/>
-                <w:color w:val="000000"/>
-                <w:sz w:val="24"/>
-                <w:szCs w:val="24"/>
-              </w:rPr>
-              <w:t xml:space="preserve"> </w:t>
-            </w:r>
-            <w:proofErr w:type="spellStart"/>
-            <w:r>
-              <w:rPr>
-                <w:rFonts w:ascii="Arial Narrow" w:hAnsi="Arial Narrow" w:cs="Arial"/>
-                <w:color w:val="000000"/>
-                <w:sz w:val="24"/>
-                <w:szCs w:val="24"/>
-              </w:rPr>
-              <w:t>benda</w:t>
-            </w:r>
-            <w:proofErr w:type="spellEnd"/>
-            <w:r>
-              <w:rPr>
-                <w:rFonts w:ascii="Arial Narrow" w:hAnsi="Arial Narrow" w:cs="Arial"/>
-                <w:color w:val="000000"/>
-                <w:sz w:val="24"/>
-                <w:szCs w:val="24"/>
-              </w:rPr>
-              <w:t xml:space="preserve"> yang </w:t>
-            </w:r>
-            <w:proofErr w:type="spellStart"/>
-            <w:r>
-              <w:rPr>
-                <w:rFonts w:ascii="Arial Narrow" w:hAnsi="Arial Narrow" w:cs="Arial"/>
-                <w:color w:val="000000"/>
-                <w:sz w:val="24"/>
-                <w:szCs w:val="24"/>
-              </w:rPr>
-              <w:t>berhubungan</w:t>
-            </w:r>
-            <w:proofErr w:type="spellEnd"/>
-            <w:r>
-              <w:rPr>
-                <w:rFonts w:ascii="Arial Narrow" w:hAnsi="Arial Narrow" w:cs="Arial"/>
-                <w:color w:val="000000"/>
-                <w:sz w:val="24"/>
-                <w:szCs w:val="24"/>
-              </w:rPr>
-              <w:t xml:space="preserve"> </w:t>
-            </w:r>
-            <w:proofErr w:type="spellStart"/>
-            <w:r>
-              <w:rPr>
-                <w:rFonts w:ascii="Arial Narrow" w:hAnsi="Arial Narrow" w:cs="Arial"/>
-                <w:color w:val="000000"/>
-                <w:sz w:val="24"/>
-                <w:szCs w:val="24"/>
-              </w:rPr>
-              <w:t>langsung</w:t>
-            </w:r>
-            <w:proofErr w:type="spellEnd"/>
-            <w:r>
-              <w:rPr>
-                <w:rFonts w:ascii="Arial Narrow" w:hAnsi="Arial Narrow" w:cs="Arial"/>
-                <w:color w:val="000000"/>
-                <w:sz w:val="24"/>
-                <w:szCs w:val="24"/>
-              </w:rPr>
-              <w:t xml:space="preserve"> </w:t>
-            </w:r>
-            <w:proofErr w:type="spellStart"/>
-            <w:r>
-              <w:rPr>
-                <w:rFonts w:ascii="Arial Narrow" w:hAnsi="Arial Narrow" w:cs="Arial"/>
-                <w:color w:val="000000"/>
-                <w:sz w:val="24"/>
-                <w:szCs w:val="24"/>
-              </w:rPr>
-              <w:t>dengan</w:t>
-            </w:r>
-            <w:proofErr w:type="spellEnd"/>
-            <w:r>
-              <w:rPr>
-                <w:rFonts w:ascii="Arial Narrow" w:hAnsi="Arial Narrow" w:cs="Arial"/>
-                <w:color w:val="000000"/>
-                <w:sz w:val="24"/>
-                <w:szCs w:val="24"/>
-              </w:rPr>
-              <w:t xml:space="preserve"> </w:t>
-            </w:r>
-            <w:proofErr w:type="spellStart"/>
-            <w:r>
-              <w:rPr>
-                <w:rFonts w:ascii="Arial Narrow" w:hAnsi="Arial Narrow" w:cs="Arial"/>
-                <w:color w:val="000000"/>
-                <w:sz w:val="24"/>
-                <w:szCs w:val="24"/>
-              </w:rPr>
-              <w:t>t</w:t>
-            </w:r>
-            <w:r>
-              <w:rPr>
-                <w:rFonts w:ascii="Arial Narrow" w:hAnsi="Arial Narrow" w:cs="Arial"/>
-                <w:color w:val="000000"/>
-                <w:sz w:val="24"/>
-                <w:szCs w:val="24"/>
-              </w:rPr>
-              <w:t>indak</w:t>
-            </w:r>
-            <w:proofErr w:type="spellEnd"/>
-            <w:r>
-              <w:rPr>
-                <w:rFonts w:ascii="Arial Narrow" w:hAnsi="Arial Narrow" w:cs="Arial"/>
-                <w:color w:val="000000"/>
-                <w:sz w:val="24"/>
-                <w:szCs w:val="24"/>
-              </w:rPr>
-              <w:t xml:space="preserve"> </w:t>
-            </w:r>
-            <w:proofErr w:type="spellStart"/>
-            <w:r>
-              <w:rPr>
-                <w:rFonts w:ascii="Arial Narrow" w:hAnsi="Arial Narrow" w:cs="Arial"/>
-                <w:color w:val="000000"/>
-                <w:sz w:val="24"/>
-                <w:szCs w:val="24"/>
-              </w:rPr>
-              <w:t>p</w:t>
-            </w:r>
-            <w:r>
-              <w:rPr>
-                <w:rFonts w:ascii="Arial Narrow" w:hAnsi="Arial Narrow" w:cs="Arial"/>
-                <w:color w:val="000000"/>
-                <w:sz w:val="24"/>
-                <w:szCs w:val="24"/>
-              </w:rPr>
-              <w:t>idana</w:t>
-            </w:r>
-            <w:proofErr w:type="spellEnd"/>
-            <w:r>
-              <w:rPr>
-                <w:rFonts w:ascii="Arial Narrow" w:hAnsi="Arial Narrow" w:cs="Arial"/>
-                <w:color w:val="000000"/>
-                <w:sz w:val="24"/>
-                <w:szCs w:val="24"/>
-              </w:rPr>
-              <w:t xml:space="preserve"> yang </w:t>
-            </w:r>
-            <w:proofErr w:type="spellStart"/>
-            <w:r>
-              <w:rPr>
-                <w:rFonts w:ascii="Arial Narrow" w:hAnsi="Arial Narrow" w:cs="Arial"/>
-                <w:color w:val="000000"/>
-                <w:sz w:val="24"/>
-                <w:szCs w:val="24"/>
-              </w:rPr>
-              <w:t>sedang</w:t>
-            </w:r>
-            <w:proofErr w:type="spellEnd"/>
-            <w:r>
-              <w:rPr>
-                <w:rFonts w:ascii="Arial Narrow" w:hAnsi="Arial Narrow" w:cs="Arial"/>
-                <w:color w:val="000000"/>
-                <w:sz w:val="24"/>
-                <w:szCs w:val="24"/>
-              </w:rPr>
-              <w:t xml:space="preserve"> </w:t>
-            </w:r>
-            <w:proofErr w:type="spellStart"/>
-            <w:r>
-              <w:rPr>
-                <w:rFonts w:ascii="Arial Narrow" w:hAnsi="Arial Narrow" w:cs="Arial"/>
-                <w:color w:val="000000"/>
-                <w:sz w:val="24"/>
-                <w:szCs w:val="24"/>
-              </w:rPr>
-              <w:t>dilakukan</w:t>
-            </w:r>
-            <w:proofErr w:type="spellEnd"/>
-            <w:r>
-              <w:rPr>
-                <w:rFonts w:ascii="Arial Narrow" w:hAnsi="Arial Narrow" w:cs="Arial"/>
-                <w:color w:val="000000"/>
-                <w:sz w:val="24"/>
-                <w:szCs w:val="24"/>
-              </w:rPr>
-              <w:t xml:space="preserve"> </w:t>
-            </w:r>
-            <w:proofErr w:type="spellStart"/>
-            <w:r>
-              <w:rPr>
-                <w:rFonts w:ascii="Arial Narrow" w:hAnsi="Arial Narrow" w:cs="Arial"/>
-                <w:color w:val="000000"/>
-                <w:sz w:val="24"/>
-                <w:szCs w:val="24"/>
-              </w:rPr>
-              <w:t>penyidikan</w:t>
-            </w:r>
-            <w:proofErr w:type="spellEnd"/>
-            <w:r>
-              <w:rPr>
-                <w:rFonts w:ascii="Arial Narrow" w:hAnsi="Arial Narrow" w:cs="Arial"/>
-                <w:color w:val="000000"/>
-                <w:sz w:val="24"/>
-                <w:szCs w:val="24"/>
-              </w:rPr>
-              <w:t xml:space="preserve">, </w:t>
-            </w:r>
-            <w:proofErr w:type="spellStart"/>
-            <w:r>
-              <w:rPr>
-                <w:rFonts w:ascii="Arial Narrow" w:hAnsi="Arial Narrow" w:cs="Arial"/>
-                <w:color w:val="000000"/>
-                <w:sz w:val="24"/>
-                <w:szCs w:val="24"/>
-              </w:rPr>
-              <w:t>sebagaimana</w:t>
-            </w:r>
-            <w:proofErr w:type="spellEnd"/>
-            <w:r>
-              <w:rPr>
-                <w:rFonts w:ascii="Arial Narrow" w:hAnsi="Arial Narrow" w:cs="Arial"/>
-                <w:color w:val="000000"/>
-                <w:sz w:val="24"/>
-                <w:szCs w:val="24"/>
-              </w:rPr>
-              <w:t xml:space="preserve"> </w:t>
-            </w:r>
-            <w:proofErr w:type="spellStart"/>
-            <w:r>
-              <w:rPr>
-                <w:rFonts w:ascii="Arial Narrow" w:hAnsi="Arial Narrow" w:cs="Arial"/>
-                <w:color w:val="000000"/>
-                <w:sz w:val="24"/>
-                <w:szCs w:val="24"/>
-              </w:rPr>
-              <w:t>kelengkapan</w:t>
-            </w:r>
-            <w:proofErr w:type="spellEnd"/>
-            <w:r>
-              <w:rPr>
-                <w:rFonts w:ascii="Arial Narrow" w:hAnsi="Arial Narrow" w:cs="Arial"/>
-                <w:color w:val="000000"/>
-                <w:sz w:val="24"/>
-                <w:szCs w:val="24"/>
-              </w:rPr>
-              <w:t xml:space="preserve"> </w:t>
-            </w:r>
-            <w:proofErr w:type="spellStart"/>
-            <w:r>
-              <w:rPr>
-                <w:rFonts w:ascii="Arial Narrow" w:hAnsi="Arial Narrow" w:cs="Arial"/>
-                <w:color w:val="000000"/>
-                <w:sz w:val="24"/>
-                <w:szCs w:val="24"/>
-              </w:rPr>
-              <w:t>administrasi</w:t>
-            </w:r>
-            <w:proofErr w:type="spellEnd"/>
-            <w:r>
-              <w:rPr>
-                <w:rFonts w:ascii="Arial Narrow" w:hAnsi="Arial Narrow" w:cs="Arial"/>
-                <w:color w:val="000000"/>
-                <w:sz w:val="24"/>
-                <w:szCs w:val="24"/>
-              </w:rPr>
-              <w:t xml:space="preserve"> </w:t>
-            </w:r>
-            <w:proofErr w:type="spellStart"/>
-            <w:r>
-              <w:rPr>
-                <w:rFonts w:ascii="Arial Narrow" w:hAnsi="Arial Narrow" w:cs="Arial"/>
-                <w:color w:val="000000"/>
-                <w:sz w:val="24"/>
-                <w:szCs w:val="24"/>
-              </w:rPr>
-              <w:t>izin</w:t>
-            </w:r>
-            <w:proofErr w:type="spellEnd"/>
-            <w:r>
-              <w:rPr>
-                <w:rFonts w:ascii="Arial Narrow" w:hAnsi="Arial Narrow" w:cs="Arial"/>
-                <w:color w:val="000000"/>
-                <w:sz w:val="24"/>
-                <w:szCs w:val="24"/>
-              </w:rPr>
-              <w:t xml:space="preserve"> </w:t>
-            </w:r>
-            <w:proofErr w:type="spellStart"/>
-            <w:r>
-              <w:rPr>
-                <w:rFonts w:ascii="Arial Narrow" w:hAnsi="Arial Narrow" w:cs="Arial"/>
-                <w:color w:val="000000"/>
-                <w:sz w:val="24"/>
-                <w:szCs w:val="24"/>
-              </w:rPr>
-              <w:t>penyitaan</w:t>
-            </w:r>
-            <w:proofErr w:type="spellEnd"/>
-            <w:r>
-              <w:rPr>
-                <w:rFonts w:ascii="Arial Narrow" w:hAnsi="Arial Narrow" w:cs="Arial"/>
-                <w:color w:val="000000"/>
-                <w:sz w:val="24"/>
-                <w:szCs w:val="24"/>
-              </w:rPr>
-              <w:t xml:space="preserve"> </w:t>
-            </w:r>
-            <w:proofErr w:type="spellStart"/>
-            <w:r>
-              <w:rPr>
-                <w:rFonts w:ascii="Arial Narrow" w:hAnsi="Arial Narrow" w:cs="Arial"/>
-                <w:color w:val="000000"/>
-                <w:sz w:val="24"/>
-                <w:szCs w:val="24"/>
-              </w:rPr>
-              <w:t>terlampir</w:t>
-            </w:r>
-            <w:proofErr w:type="spellEnd"/>
-            <w:r>
-              <w:rPr>
-                <w:rFonts w:ascii="Arial Narrow" w:hAnsi="Arial Narrow" w:cs="Arial"/>
-                <w:color w:val="000000"/>
-                <w:sz w:val="24"/>
-                <w:szCs w:val="24"/>
-              </w:rPr>
-              <w:t xml:space="preserve">. </w:t>
-            </w:r>
-            <w:proofErr w:type="spellStart"/>
-            <w:r>
-              <w:rPr>
-                <w:rFonts w:ascii="Arial Narrow" w:hAnsi="Arial Narrow" w:cs="Arial"/>
-                <w:color w:val="000000"/>
-                <w:sz w:val="24"/>
-                <w:szCs w:val="24"/>
-              </w:rPr>
-              <w:t>Untuk</w:t>
-            </w:r>
-            <w:proofErr w:type="spellEnd"/>
-            <w:r>
-              <w:rPr>
-                <w:rFonts w:ascii="Arial Narrow" w:hAnsi="Arial Narrow" w:cs="Arial"/>
-                <w:color w:val="000000"/>
-                <w:sz w:val="24"/>
-                <w:szCs w:val="24"/>
-              </w:rPr>
-              <w:t xml:space="preserve"> </w:t>
-            </w:r>
-            <w:proofErr w:type="spellStart"/>
-            <w:r>
-              <w:rPr>
-                <w:rFonts w:ascii="Arial Narrow" w:hAnsi="Arial Narrow" w:cs="Arial"/>
-                <w:color w:val="000000"/>
-                <w:sz w:val="24"/>
-                <w:szCs w:val="24"/>
-              </w:rPr>
-              <w:t>memudahkan</w:t>
-            </w:r>
-            <w:proofErr w:type="spellEnd"/>
-            <w:r>
-              <w:rPr>
-                <w:rFonts w:ascii="Arial Narrow" w:hAnsi="Arial Narrow" w:cs="Arial"/>
-                <w:color w:val="000000"/>
-                <w:sz w:val="24"/>
-                <w:szCs w:val="24"/>
-              </w:rPr>
-              <w:t xml:space="preserve"> </w:t>
-            </w:r>
-            <w:proofErr w:type="spellStart"/>
-            <w:r>
-              <w:rPr>
-                <w:rFonts w:ascii="Arial Narrow" w:hAnsi="Arial Narrow" w:cs="Arial"/>
-                <w:color w:val="000000"/>
-                <w:sz w:val="24"/>
-                <w:szCs w:val="24"/>
-              </w:rPr>
-              <w:t>berkomunikasi</w:t>
-            </w:r>
-            <w:proofErr w:type="spellEnd"/>
-            <w:r>
-              <w:rPr>
-                <w:rFonts w:ascii="Arial Narrow" w:hAnsi="Arial Narrow" w:cs="Arial"/>
-                <w:color w:val="000000"/>
-                <w:sz w:val="24"/>
-                <w:szCs w:val="24"/>
-              </w:rPr>
-              <w:t xml:space="preserve"> </w:t>
-            </w:r>
-            <w:r>
-              <w:rPr>
-                <w:rFonts w:ascii="Arial Narrow" w:hAnsi="Arial Narrow" w:cs="Arial"/>
-                <w:color w:val="000000"/>
-                <w:sz w:val="24"/>
-                <w:szCs w:val="24"/>
-              </w:rPr>
-              <w:t xml:space="preserve">dan </w:t>
-            </w:r>
-            <w:proofErr w:type="spellStart"/>
-            <w:r>
-              <w:rPr>
-                <w:rFonts w:ascii="Arial Narrow" w:hAnsi="Arial Narrow" w:cs="Arial"/>
-                <w:color w:val="000000"/>
-                <w:sz w:val="24"/>
-                <w:szCs w:val="24"/>
-              </w:rPr>
-              <w:t>berkoordinasi</w:t>
-            </w:r>
-            <w:proofErr w:type="spellEnd"/>
-            <w:r>
-              <w:rPr>
-                <w:rFonts w:ascii="Arial Narrow" w:hAnsi="Arial Narrow" w:cs="Arial"/>
-                <w:color w:val="000000"/>
-                <w:sz w:val="24"/>
-                <w:szCs w:val="24"/>
-              </w:rPr>
-              <w:t xml:space="preserve"> </w:t>
-            </w:r>
-            <w:proofErr w:type="spellStart"/>
-            <w:r>
-              <w:rPr>
-                <w:rFonts w:ascii="Arial Narrow" w:hAnsi="Arial Narrow" w:cs="Arial"/>
-                <w:color w:val="000000"/>
-                <w:sz w:val="24"/>
-                <w:szCs w:val="24"/>
-              </w:rPr>
-              <w:t>dapat</w:t>
-            </w:r>
-            <w:proofErr w:type="spellEnd"/>
-            <w:r>
-              <w:rPr>
-                <w:rFonts w:ascii="Arial Narrow" w:hAnsi="Arial Narrow" w:cs="Arial"/>
-                <w:color w:val="000000"/>
-                <w:sz w:val="24"/>
-                <w:szCs w:val="24"/>
-              </w:rPr>
-              <w:t xml:space="preserve"> </w:t>
-            </w:r>
-            <w:proofErr w:type="spellStart"/>
-            <w:r>
-              <w:rPr>
-                <w:rFonts w:ascii="Arial Narrow" w:hAnsi="Arial Narrow" w:cs="Arial"/>
-                <w:color w:val="000000"/>
-                <w:sz w:val="24"/>
-                <w:szCs w:val="24"/>
-              </w:rPr>
-              <w:t>menghubungi</w:t>
-            </w:r>
-            <w:proofErr w:type="spellEnd"/>
-            <w:r>
-              <w:rPr>
-                <w:rFonts w:ascii="Arial Narrow" w:hAnsi="Arial Narrow" w:cs="Arial"/>
-                <w:color w:val="000000"/>
-                <w:sz w:val="24"/>
-                <w:szCs w:val="24"/>
-              </w:rPr>
-              <w:t xml:space="preserve"> </w:t>
-            </w:r>
-            <w:proofErr w:type="spellStart"/>
-            <w:r>
-              <w:rPr>
-                <w:rFonts w:ascii="Arial Narrow" w:hAnsi="Arial Narrow" w:cs="Arial"/>
-                <w:color w:val="000000"/>
-                <w:sz w:val="24"/>
-                <w:szCs w:val="24"/>
-              </w:rPr>
-              <w:t>penyidik</w:t>
-            </w:r>
-            <w:proofErr w:type="spellEnd"/>
-            <w:r>
-              <w:rPr>
-                <w:rFonts w:ascii="Arial Narrow" w:hAnsi="Arial Narrow" w:cs="Arial"/>
-                <w:color w:val="000000"/>
-                <w:sz w:val="24"/>
-                <w:szCs w:val="24"/>
-              </w:rPr>
-              <w:t xml:space="preserve"> </w:t>
-            </w:r>
-            <w:proofErr w:type="spellStart"/>
-            <w:r>
-              <w:rPr>
-                <w:rFonts w:ascii="Arial Narrow" w:hAnsi="Arial Narrow" w:cs="Arial"/>
-                <w:color w:val="000000"/>
-                <w:sz w:val="24"/>
-                <w:szCs w:val="24"/>
-              </w:rPr>
-              <w:t>atas</w:t>
-            </w:r>
-            <w:proofErr w:type="spellEnd"/>
-            <w:r>
-              <w:rPr>
-                <w:rFonts w:ascii="Arial Narrow" w:hAnsi="Arial Narrow" w:cs="Arial"/>
-                <w:color w:val="000000"/>
-                <w:sz w:val="24"/>
-                <w:szCs w:val="24"/>
-              </w:rPr>
-              <w:t xml:space="preserve"> nama ${</w:t>
-            </w:r>
-            <w:proofErr w:type="spellStart"/>
-            <w:r>
-              <w:rPr>
-                <w:rFonts w:ascii="Arial Narrow" w:hAnsi="Arial Narrow" w:cs="Arial"/>
-                <w:color w:val="000000"/>
-                <w:sz w:val="24"/>
-                <w:szCs w:val="24"/>
-              </w:rPr>
-              <w:t>investigatorName</w:t>
-            </w:r>
-            <w:proofErr w:type="spellEnd"/>
-            <w:r>
-              <w:rPr>
-                <w:rFonts w:ascii="Arial Narrow" w:hAnsi="Arial Narrow" w:cs="Arial"/>
-                <w:color w:val="000000"/>
-                <w:sz w:val="24"/>
-                <w:szCs w:val="24"/>
-              </w:rPr>
-              <w:t xml:space="preserve">} </w:t>
-            </w:r>
-            <w:proofErr w:type="spellStart"/>
-            <w:r>
-              <w:rPr>
-                <w:rFonts w:ascii="Arial Narrow" w:hAnsi="Arial Narrow" w:cs="Arial"/>
-                <w:color w:val="000000"/>
-                <w:sz w:val="24"/>
-                <w:szCs w:val="24"/>
-              </w:rPr>
-              <w:t>dengan</w:t>
-            </w:r>
-            <w:proofErr w:type="spellEnd"/>
-            <w:r>
-              <w:rPr>
-                <w:rFonts w:ascii="Arial Narrow" w:hAnsi="Arial Narrow" w:cs="Arial"/>
-                <w:color w:val="000000"/>
-                <w:sz w:val="24"/>
-                <w:szCs w:val="24"/>
-              </w:rPr>
-              <w:t xml:space="preserve"> </w:t>
-            </w:r>
-            <w:proofErr w:type="spellStart"/>
-            <w:r>
-              <w:rPr>
-                <w:rFonts w:ascii="Arial Narrow" w:hAnsi="Arial Narrow" w:cs="Arial"/>
-                <w:color w:val="000000"/>
-                <w:sz w:val="24"/>
-                <w:szCs w:val="24"/>
-              </w:rPr>
-              <w:t>nomor</w:t>
-            </w:r>
-            <w:proofErr w:type="spellEnd"/>
-            <w:r>
-              <w:rPr>
-                <w:rFonts w:ascii="Arial Narrow" w:hAnsi="Arial Narrow" w:cs="Arial"/>
-                <w:color w:val="000000"/>
-                <w:sz w:val="24"/>
-                <w:szCs w:val="24"/>
-              </w:rPr>
-              <w:t xml:space="preserve"> Hp. ${</w:t>
-            </w:r>
-            <w:proofErr w:type="spellStart"/>
-            <w:r>
-              <w:rPr>
-                <w:rFonts w:ascii="Arial Narrow" w:hAnsi="Arial Narrow" w:cs="Arial"/>
-                <w:color w:val="000000"/>
-                <w:sz w:val="24"/>
-                <w:szCs w:val="24"/>
-              </w:rPr>
-              <w:t>investigatorPhoneNumber</w:t>
-            </w:r>
-            <w:proofErr w:type="spellEnd"/>
-            <w:r>
-              <w:rPr>
-                <w:rFonts w:ascii="Arial Narrow" w:hAnsi="Arial Narrow" w:cs="Arial"/>
-                <w:color w:val="000000"/>
-                <w:sz w:val="24"/>
-                <w:szCs w:val="24"/>
-              </w:rPr>
-              <w:t>}.</w:t>
+              <w:t>${investigatorPhoneNumber}.</w:t>
             </w:r>
           </w:p>
         </w:tc>
@@ -5313,7 +3645,6 @@
                 <w:szCs w:val="24"/>
               </w:rPr>
             </w:pPr>
-            <w:proofErr w:type="spellStart"/>
             <w:r>
               <w:rPr>
                 <w:rFonts w:ascii="Arial Narrow" w:hAnsi="Arial Narrow" w:cs="Arial"/>
@@ -5321,197 +3652,7 @@
                 <w:sz w:val="24"/>
                 <w:szCs w:val="24"/>
               </w:rPr>
-              <w:t>Demikian</w:t>
-            </w:r>
-            <w:proofErr w:type="spellEnd"/>
-            <w:r>
-              <w:rPr>
-                <w:rFonts w:ascii="Arial Narrow" w:hAnsi="Arial Narrow" w:cs="Arial"/>
-                <w:color w:val="000000"/>
-                <w:sz w:val="24"/>
-                <w:szCs w:val="24"/>
-              </w:rPr>
-              <w:t xml:space="preserve"> </w:t>
-            </w:r>
-            <w:proofErr w:type="spellStart"/>
-            <w:r>
-              <w:rPr>
-                <w:rFonts w:ascii="Arial Narrow" w:hAnsi="Arial Narrow" w:cs="Arial"/>
-                <w:color w:val="000000"/>
-                <w:sz w:val="24"/>
-                <w:szCs w:val="24"/>
-              </w:rPr>
-              <w:t>untuk</w:t>
-            </w:r>
-            <w:proofErr w:type="spellEnd"/>
-            <w:r>
-              <w:rPr>
-                <w:rFonts w:ascii="Arial Narrow" w:hAnsi="Arial Narrow" w:cs="Arial"/>
-                <w:color w:val="000000"/>
-                <w:sz w:val="24"/>
-                <w:szCs w:val="24"/>
-              </w:rPr>
-              <w:t xml:space="preserve"> </w:t>
-            </w:r>
-            <w:proofErr w:type="spellStart"/>
-            <w:r>
-              <w:rPr>
-                <w:rFonts w:ascii="Arial Narrow" w:hAnsi="Arial Narrow" w:cs="Arial"/>
-                <w:color w:val="000000"/>
-                <w:sz w:val="24"/>
-                <w:szCs w:val="24"/>
-              </w:rPr>
-              <w:t>menjadi</w:t>
-            </w:r>
-            <w:proofErr w:type="spellEnd"/>
-            <w:r>
-              <w:rPr>
-                <w:rFonts w:ascii="Arial Narrow" w:hAnsi="Arial Narrow" w:cs="Arial"/>
-                <w:color w:val="000000"/>
-                <w:sz w:val="24"/>
-                <w:szCs w:val="24"/>
-              </w:rPr>
-              <w:t xml:space="preserve"> </w:t>
-            </w:r>
-            <w:proofErr w:type="spellStart"/>
-            <w:r>
-              <w:rPr>
-                <w:rFonts w:ascii="Arial Narrow" w:hAnsi="Arial Narrow" w:cs="Arial"/>
-                <w:color w:val="000000"/>
-                <w:sz w:val="24"/>
-                <w:szCs w:val="24"/>
-              </w:rPr>
-              <w:t>maklum</w:t>
-            </w:r>
-            <w:proofErr w:type="spellEnd"/>
-            <w:r>
-              <w:rPr>
-                <w:rFonts w:ascii="Arial Narrow" w:hAnsi="Arial Narrow" w:cs="Arial"/>
-                <w:color w:val="000000"/>
-                <w:sz w:val="24"/>
-                <w:szCs w:val="24"/>
-              </w:rPr>
-              <w:t xml:space="preserve">, </w:t>
-            </w:r>
-            <w:proofErr w:type="spellStart"/>
-            <w:r>
-              <w:rPr>
-                <w:rFonts w:ascii="Arial Narrow" w:hAnsi="Arial Narrow" w:cs="Arial"/>
-                <w:color w:val="000000"/>
-                <w:sz w:val="24"/>
-                <w:szCs w:val="24"/>
-              </w:rPr>
-              <w:t>atas</w:t>
-            </w:r>
-            <w:proofErr w:type="spellEnd"/>
-            <w:r>
-              <w:rPr>
-                <w:rFonts w:ascii="Arial Narrow" w:hAnsi="Arial Narrow" w:cs="Arial"/>
-                <w:color w:val="000000"/>
-                <w:sz w:val="24"/>
-                <w:szCs w:val="24"/>
-              </w:rPr>
-              <w:t xml:space="preserve"> </w:t>
-            </w:r>
-            <w:proofErr w:type="spellStart"/>
-            <w:r>
-              <w:rPr>
-                <w:rFonts w:ascii="Arial Narrow" w:hAnsi="Arial Narrow" w:cs="Arial"/>
-                <w:color w:val="000000"/>
-                <w:sz w:val="24"/>
-                <w:szCs w:val="24"/>
-              </w:rPr>
-              <w:t>perhatian</w:t>
-            </w:r>
-            <w:proofErr w:type="spellEnd"/>
-            <w:r>
-              <w:rPr>
-                <w:rFonts w:ascii="Arial Narrow" w:hAnsi="Arial Narrow" w:cs="Arial"/>
-                <w:color w:val="000000"/>
-                <w:sz w:val="24"/>
-                <w:szCs w:val="24"/>
-              </w:rPr>
-              <w:t xml:space="preserve"> dan </w:t>
-            </w:r>
-            <w:proofErr w:type="spellStart"/>
-            <w:r>
-              <w:rPr>
-                <w:rFonts w:ascii="Arial Narrow" w:hAnsi="Arial Narrow" w:cs="Arial"/>
-                <w:color w:val="000000"/>
-                <w:sz w:val="24"/>
-                <w:szCs w:val="24"/>
-              </w:rPr>
-              <w:t>kerjasamanya</w:t>
-            </w:r>
-            <w:proofErr w:type="spellEnd"/>
-            <w:r>
-              <w:rPr>
-                <w:rFonts w:ascii="Arial Narrow" w:hAnsi="Arial Narrow" w:cs="Arial"/>
-                <w:color w:val="000000"/>
-                <w:sz w:val="24"/>
-                <w:szCs w:val="24"/>
-              </w:rPr>
-              <w:t xml:space="preserve"> </w:t>
-            </w:r>
-            <w:proofErr w:type="spellStart"/>
-            <w:r>
-              <w:rPr>
-                <w:rFonts w:ascii="Arial Narrow" w:hAnsi="Arial Narrow" w:cs="Arial"/>
-                <w:color w:val="000000"/>
-                <w:sz w:val="24"/>
-                <w:szCs w:val="24"/>
-              </w:rPr>
-              <w:t>diucapkan</w:t>
-            </w:r>
-            <w:proofErr w:type="spellEnd"/>
-            <w:r>
-              <w:rPr>
-                <w:rFonts w:ascii="Arial Narrow" w:hAnsi="Arial Narrow" w:cs="Arial"/>
-                <w:color w:val="000000"/>
-                <w:sz w:val="24"/>
-                <w:szCs w:val="24"/>
-              </w:rPr>
-              <w:t xml:space="preserve"> </w:t>
-            </w:r>
-            <w:proofErr w:type="spellStart"/>
-            <w:r>
-              <w:rPr>
-                <w:rFonts w:ascii="Arial Narrow" w:hAnsi="Arial Narrow" w:cs="Arial"/>
-                <w:color w:val="000000"/>
-                <w:sz w:val="24"/>
-                <w:szCs w:val="24"/>
-              </w:rPr>
-              <w:t>terima</w:t>
-            </w:r>
-            <w:proofErr w:type="spellEnd"/>
-            <w:r>
-              <w:rPr>
-                <w:rFonts w:ascii="Arial Narrow" w:hAnsi="Arial Narrow" w:cs="Arial"/>
-                <w:color w:val="000000"/>
-                <w:sz w:val="24"/>
-                <w:szCs w:val="24"/>
-              </w:rPr>
-              <w:t xml:space="preserve"> </w:t>
-            </w:r>
-            <w:proofErr w:type="spellStart"/>
-            <w:r>
-              <w:rPr>
-                <w:rFonts w:ascii="Arial Narrow" w:hAnsi="Arial Narrow" w:cs="Arial"/>
-                <w:color w:val="000000"/>
-                <w:sz w:val="24"/>
-                <w:szCs w:val="24"/>
-              </w:rPr>
-              <w:t>kasih</w:t>
-            </w:r>
-            <w:proofErr w:type="spellEnd"/>
-            <w:r>
-              <w:rPr>
-                <w:rFonts w:ascii="Arial Narrow" w:hAnsi="Arial Narrow" w:cs="Arial"/>
-                <w:color w:val="000000"/>
-                <w:sz w:val="24"/>
-                <w:szCs w:val="24"/>
-              </w:rPr>
-              <w:t>.</w:t>
+              <w:t>Demikian untuk menjadi maklum, atas perhatian dan kerjasamanya diucapkan terima kasih.</w:t>
             </w:r>
           </w:p>
         </w:tc>
@@ -5680,23 +3821,13 @@
                       <w:szCs w:val="24"/>
                     </w:rPr>
                   </w:pPr>
-                  <w:proofErr w:type="spellStart"/>
                   <w:r>
                     <w:rPr>
                       <w:rFonts w:ascii="Arial Narrow" w:hAnsi="Arial Narrow"/>
                       <w:sz w:val="24"/>
                       <w:szCs w:val="24"/>
                     </w:rPr>
-                    <w:t>Tembusan</w:t>
-                  </w:r>
-                  <w:proofErr w:type="spellEnd"/>
-                  <w:r>
-                    <w:rPr>
-                      <w:rFonts w:ascii="Arial Narrow" w:hAnsi="Arial Narrow"/>
-                      <w:sz w:val="24"/>
-                      <w:szCs w:val="24"/>
-                    </w:rPr>
-                    <w:t xml:space="preserve"> :</w:t>
+                    <w:t>Tembusan :</w:t>
                   </w:r>
                 </w:p>
               </w:tc>
@@ -5728,7 +3859,6 @@
                     </w:rPr>
                     <w:t>${</w:t>
                   </w:r>
-                  <w:proofErr w:type="spellStart"/>
                   <w:r>
                     <w:rPr>
                       <w:rFonts w:ascii="Arial Narrow" w:eastAsia="Arial Narrow" w:hAnsi="Arial Narrow"/>
@@ -5789,7 +3919,6 @@
                     </w:rPr>
                     <w:t>teration</w:t>
                   </w:r>
-                  <w:proofErr w:type="spellEnd"/>
                   <w:r>
                     <w:rPr>
                       <w:rFonts w:ascii="Arial Narrow" w:eastAsia="Arial Narrow" w:hAnsi="Arial Narrow"/>
@@ -5820,7 +3949,6 @@
                     </w:rPr>
                     <w:t>${</w:t>
                   </w:r>
-                  <w:proofErr w:type="spellStart"/>
                   <w:r>
                     <w:rPr>
                       <w:rFonts w:ascii="Arial Narrow" w:eastAsia="Arial Narrow" w:hAnsi="Arial Narrow"/>
@@ -5871,7 +3999,6 @@
                     </w:rPr>
                     <w:t>ame</w:t>
                   </w:r>
-                  <w:proofErr w:type="spellEnd"/>
                   <w:r>
                     <w:rPr>
                       <w:rFonts w:ascii="Arial Narrow" w:eastAsia="Arial Narrow" w:hAnsi="Arial Narrow"/>
@@ -5954,29 +4081,7 @@
                       <w:szCs w:val="24"/>
                     </w:rPr>
                     <w:lastRenderedPageBreak/>
-                    <w:t>${</w:t>
-                  </w:r>
-                  <w:proofErr w:type="spellStart"/>
-                  <w:r>
-                    <w:rPr>
-                      <w:rFonts w:ascii="Arial Narrow" w:eastAsia="Arial Narrow" w:hAnsi="Arial Narrow"/>
-                      <w:bCs/>
-                      <w:color w:val="000000"/>
-                      <w:sz w:val="24"/>
-                      <w:szCs w:val="24"/>
-                    </w:rPr>
-                    <w:t>signatoryHeadText</w:t>
-                  </w:r>
-                  <w:proofErr w:type="spellEnd"/>
-                  <w:r>
-                    <w:rPr>
-                      <w:rFonts w:ascii="Arial Narrow" w:eastAsia="Arial Narrow" w:hAnsi="Arial Narrow"/>
-                      <w:bCs/>
-                      <w:color w:val="000000"/>
-                      <w:sz w:val="24"/>
-                      <w:szCs w:val="24"/>
-                    </w:rPr>
-                    <w:t>}</w:t>
+                    <w:t>${signatoryHeadText}</w:t>
                   </w:r>
                 </w:p>
               </w:tc>
@@ -6009,9 +4114,8 @@
                       <w:szCs w:val="24"/>
                     </w:rPr>
                     <w:lastRenderedPageBreak/>
-                    <w:t>${</w:t>
-                  </w:r>
-                  <w:proofErr w:type="spellStart"/>
+                    <w:t>${signatory</w:t>
+                  </w:r>
                   <w:r>
                     <w:rPr>
                       <w:rFonts w:ascii="Arial Narrow" w:eastAsia="Arial Narrow" w:hAnsi="Arial Narrow"/>
@@ -6020,19 +4124,8 @@
                       <w:sz w:val="24"/>
                       <w:szCs w:val="24"/>
                     </w:rPr>
-                    <w:t>signatory</w:t>
-                  </w:r>
-                  <w:r>
-                    <w:rPr>
-                      <w:rFonts w:ascii="Arial Narrow" w:eastAsia="Arial Narrow" w:hAnsi="Arial Narrow"/>
-                      <w:bCs/>
-                      <w:color w:val="000000"/>
-                      <w:sz w:val="24"/>
-                      <w:szCs w:val="24"/>
-                    </w:rPr>
                     <w:t>PositionName</w:t>
                   </w:r>
-                  <w:proofErr w:type="spellEnd"/>
                   <w:r>
                     <w:rPr>
                       <w:rFonts w:ascii="Arial Narrow" w:eastAsia="Arial Narrow" w:hAnsi="Arial Narrow"/>
@@ -6187,29 +4280,7 @@
                             <w:sz w:val="24"/>
                             <w:szCs w:val="24"/>
                           </w:rPr>
-                          <w:t>${</w:t>
-                        </w:r>
-                        <w:proofErr w:type="spellStart"/>
-                        <w:r>
-                          <w:rPr>
-                            <w:rFonts w:ascii="Arial Narrow" w:eastAsia="Arial Narrow" w:hAnsi="Arial Narrow"/>
-                            <w:bCs/>
-                            <w:color w:val="000000"/>
-                            <w:sz w:val="24"/>
-                            <w:szCs w:val="24"/>
-                          </w:rPr>
-                          <w:t>signatoryName</w:t>
-                        </w:r>
-                        <w:proofErr w:type="spellEnd"/>
-                        <w:r>
-                          <w:rPr>
-                            <w:rFonts w:ascii="Arial Narrow" w:eastAsia="Arial Narrow" w:hAnsi="Arial Narrow"/>
-                            <w:bCs/>
-                            <w:color w:val="000000"/>
-                            <w:sz w:val="24"/>
-                            <w:szCs w:val="24"/>
-                          </w:rPr>
-                          <w:t>}</w:t>
+                          <w:t>${signatoryName}</w:t>
                         </w:r>
                       </w:p>
                     </w:tc>
@@ -6245,29 +4316,7 @@
                             <w:sz w:val="24"/>
                             <w:szCs w:val="24"/>
                           </w:rPr>
-                          <w:t>${</w:t>
-                        </w:r>
-                        <w:proofErr w:type="spellStart"/>
-                        <w:r>
-                          <w:rPr>
-                            <w:rFonts w:ascii="Arial Narrow" w:eastAsia="Arial Narrow" w:hAnsi="Arial Narrow"/>
-                            <w:bCs/>
-                            <w:color w:val="000000"/>
-                            <w:sz w:val="24"/>
-                            <w:szCs w:val="24"/>
-                          </w:rPr>
-                          <w:t>signatoryRankName</w:t>
-                        </w:r>
-                        <w:proofErr w:type="spellEnd"/>
-                        <w:r>
-                          <w:rPr>
-                            <w:rFonts w:ascii="Arial Narrow" w:eastAsia="Arial Narrow" w:hAnsi="Arial Narrow"/>
-                            <w:bCs/>
-                            <w:color w:val="000000"/>
-                            <w:sz w:val="24"/>
-                            <w:szCs w:val="24"/>
-                          </w:rPr>
-                          <w:t>}</w:t>
+                          <w:t>${signatoryRankName}</w:t>
                         </w:r>
                         <w:r>
                           <w:rPr>
@@ -6289,7 +4338,6 @@
                           </w:rPr>
                           <w:t>${</w:t>
                         </w:r>
-                        <w:proofErr w:type="spellStart"/>
                         <w:r>
                           <w:rPr>
                             <w:rFonts w:ascii="Arial Narrow" w:eastAsia="Arial Narrow" w:hAnsi="Arial Narrow"/>
@@ -6300,7 +4348,6 @@
                           </w:rPr>
                           <w:t>signatoryRegisterNumber</w:t>
                         </w:r>
-                        <w:proofErr w:type="spellEnd"/>
                         <w:r>
                           <w:rPr>
                             <w:rFonts w:ascii="Arial Narrow" w:eastAsia="Arial Narrow" w:hAnsi="Arial Narrow"/>

</xml_diff>

<commit_message>
Menyesuaikan field tersangka dan menghapus bagian saksi pada form S-12
- Menghapus toggle Ada/Tidak Ada Tersangka
- Menjadikan tersangka sebagai field wajib
- Menghapus penggunaan witness pada S-12
</commit_message>
<xml_diff>
--- a/public/word-template/surat_permintaan_izin_penyitaan.docx
+++ b/public/word-template/surat_permintaan_izin_penyitaan.docx
@@ -73,7 +73,7 @@
                       <w:lang w:val="en-US"/>
                     </w:rPr>
                     <w:drawing>
-                      <wp:inline distT="0" distB="0" distL="0" distR="0" wp14:anchorId="1D461AF8" wp14:editId="3C9B40A1">
+                      <wp:inline distT="0" distB="0" distL="0" distR="0" wp14:anchorId="1D461AF8" wp14:editId="0216CEA8">
                         <wp:extent cx="738127" cy="690404"/>
                         <wp:effectExtent l="0" t="0" r="5080" b="0"/>
                         <wp:docPr id="6" name="Picture 6"/>
@@ -161,6 +161,7 @@
                     </w:rPr>
                     <w:t>${</w:t>
                   </w:r>
+                  <w:proofErr w:type="spellStart"/>
                   <w:r>
                     <w:rPr>
                       <w:rFonts w:ascii="Arial Narrow" w:hAnsi="Arial Narrow"/>
@@ -169,6 +170,7 @@
                     </w:rPr>
                     <w:t>daerahPoliceFullName</w:t>
                   </w:r>
+                  <w:proofErr w:type="spellEnd"/>
                   <w:r>
                     <w:rPr>
                       <w:rFonts w:ascii="Arial Narrow" w:hAnsi="Arial Narrow"/>
@@ -188,6 +190,7 @@
                     </w:rPr>
                     <w:t>${</w:t>
                   </w:r>
+                  <w:proofErr w:type="spellStart"/>
                   <w:r>
                     <w:rPr>
                       <w:rFonts w:ascii="Arial Narrow" w:hAnsi="Arial Narrow"/>
@@ -196,6 +199,7 @@
                     </w:rPr>
                     <w:t>resorPoliceFullName</w:t>
                   </w:r>
+                  <w:proofErr w:type="spellEnd"/>
                   <w:r>
                     <w:rPr>
                       <w:rFonts w:ascii="Arial Narrow" w:hAnsi="Arial Narrow"/>
@@ -215,6 +219,7 @@
                     </w:rPr>
                     <w:t>${</w:t>
                   </w:r>
+                  <w:proofErr w:type="spellStart"/>
                   <w:r>
                     <w:rPr>
                       <w:rFonts w:ascii="Arial Narrow" w:hAnsi="Arial Narrow"/>
@@ -223,6 +228,7 @@
                     </w:rPr>
                     <w:t>resorPoliceAddress</w:t>
                   </w:r>
+                  <w:proofErr w:type="spellEnd"/>
                   <w:r>
                     <w:rPr>
                       <w:rFonts w:ascii="Arial Narrow" w:hAnsi="Arial Narrow"/>
@@ -323,6 +329,7 @@
               </w:rPr>
               <w:t>${</w:t>
             </w:r>
+            <w:proofErr w:type="spellStart"/>
             <w:r>
               <w:rPr>
                 <w:rFonts w:ascii="Arial Narrow" w:hAnsi="Arial Narrow" w:cs="Consolas"/>
@@ -332,6 +339,7 @@
               </w:rPr>
               <w:t>documentLocation</w:t>
             </w:r>
+            <w:proofErr w:type="spellEnd"/>
             <w:r>
               <w:rPr>
                 <w:rFonts w:ascii="Arial Narrow" w:hAnsi="Arial Narrow" w:cs="Consolas"/>
@@ -341,6 +349,7 @@
               </w:rPr>
               <w:t>}, ${</w:t>
             </w:r>
+            <w:proofErr w:type="spellStart"/>
             <w:r>
               <w:rPr>
                 <w:rFonts w:ascii="Arial Narrow" w:hAnsi="Arial Narrow" w:cs="Consolas"/>
@@ -350,6 +359,7 @@
               </w:rPr>
               <w:t>documentDate</w:t>
             </w:r>
+            <w:proofErr w:type="spellEnd"/>
             <w:r>
               <w:rPr>
                 <w:rFonts w:ascii="Arial Narrow" w:hAnsi="Arial Narrow" w:cs="Consolas"/>
@@ -459,6 +469,7 @@
                 <w:szCs w:val="24"/>
               </w:rPr>
             </w:pPr>
+            <w:proofErr w:type="spellStart"/>
             <w:r>
               <w:rPr>
                 <w:rFonts w:ascii="Arial Narrow" w:hAnsi="Arial Narrow"/>
@@ -467,6 +478,7 @@
               </w:rPr>
               <w:t>Nomor</w:t>
             </w:r>
+            <w:proofErr w:type="spellEnd"/>
           </w:p>
         </w:tc>
         <w:tc>
@@ -510,7 +522,25 @@
                 <w:sz w:val="24"/>
                 <w:szCs w:val="24"/>
               </w:rPr>
-              <w:t>${documentNumber}</w:t>
+              <w:t>${</w:t>
+            </w:r>
+            <w:proofErr w:type="spellStart"/>
+            <w:r>
+              <w:rPr>
+                <w:rFonts w:ascii="Arial Narrow" w:hAnsi="Arial Narrow"/>
+                <w:sz w:val="24"/>
+                <w:szCs w:val="24"/>
+              </w:rPr>
+              <w:t>documentNumber</w:t>
+            </w:r>
+            <w:proofErr w:type="spellEnd"/>
+            <w:r>
+              <w:rPr>
+                <w:rFonts w:ascii="Arial Narrow" w:hAnsi="Arial Narrow"/>
+                <w:sz w:val="24"/>
+                <w:szCs w:val="24"/>
+              </w:rPr>
+              <w:t>}</w:t>
             </w:r>
           </w:p>
         </w:tc>
@@ -543,6 +573,7 @@
                 <w:szCs w:val="24"/>
               </w:rPr>
             </w:pPr>
+            <w:proofErr w:type="spellStart"/>
             <w:r>
               <w:rPr>
                 <w:rFonts w:ascii="Arial Narrow" w:hAnsi="Arial Narrow"/>
@@ -551,6 +582,7 @@
               </w:rPr>
               <w:t>Klasifikasi</w:t>
             </w:r>
+            <w:proofErr w:type="spellEnd"/>
           </w:p>
         </w:tc>
         <w:tc>
@@ -595,7 +627,25 @@
                 <w:sz w:val="24"/>
                 <w:szCs w:val="24"/>
               </w:rPr>
-              <w:t>${documentClassificationName}</w:t>
+              <w:t>${</w:t>
+            </w:r>
+            <w:proofErr w:type="spellStart"/>
+            <w:r>
+              <w:rPr>
+                <w:rFonts w:ascii="Arial Narrow" w:hAnsi="Arial Narrow"/>
+                <w:sz w:val="24"/>
+                <w:szCs w:val="24"/>
+              </w:rPr>
+              <w:t>documentClassificationName</w:t>
+            </w:r>
+            <w:proofErr w:type="spellEnd"/>
+            <w:r>
+              <w:rPr>
+                <w:rFonts w:ascii="Arial Narrow" w:hAnsi="Arial Narrow"/>
+                <w:sz w:val="24"/>
+                <w:szCs w:val="24"/>
+              </w:rPr>
+              <w:t>}</w:t>
             </w:r>
           </w:p>
         </w:tc>
@@ -729,6 +779,7 @@
                 <w:u w:val="single"/>
               </w:rPr>
             </w:pPr>
+            <w:proofErr w:type="spellStart"/>
             <w:r>
               <w:rPr>
                 <w:rFonts w:ascii="Arial Narrow" w:hAnsi="Arial Narrow"/>
@@ -736,8 +787,49 @@
                 <w:szCs w:val="24"/>
                 <w:u w:val="single"/>
               </w:rPr>
-              <w:t>permohonan izin penyitaan</w:t>
-            </w:r>
+              <w:t>permohonan</w:t>
+            </w:r>
+            <w:proofErr w:type="spellEnd"/>
+            <w:r>
+              <w:rPr>
+                <w:rFonts w:ascii="Arial Narrow" w:hAnsi="Arial Narrow"/>
+                <w:sz w:val="24"/>
+                <w:szCs w:val="24"/>
+                <w:u w:val="single"/>
+              </w:rPr>
+              <w:t xml:space="preserve"> </w:t>
+            </w:r>
+            <w:proofErr w:type="spellStart"/>
+            <w:r>
+              <w:rPr>
+                <w:rFonts w:ascii="Arial Narrow" w:hAnsi="Arial Narrow"/>
+                <w:sz w:val="24"/>
+                <w:szCs w:val="24"/>
+                <w:u w:val="single"/>
+              </w:rPr>
+              <w:t>izin</w:t>
+            </w:r>
+            <w:proofErr w:type="spellEnd"/>
+            <w:r>
+              <w:rPr>
+                <w:rFonts w:ascii="Arial Narrow" w:hAnsi="Arial Narrow"/>
+                <w:sz w:val="24"/>
+                <w:szCs w:val="24"/>
+                <w:u w:val="single"/>
+              </w:rPr>
+              <w:t xml:space="preserve"> </w:t>
+            </w:r>
+            <w:proofErr w:type="spellStart"/>
+            <w:r>
+              <w:rPr>
+                <w:rFonts w:ascii="Arial Narrow" w:hAnsi="Arial Narrow"/>
+                <w:sz w:val="24"/>
+                <w:szCs w:val="24"/>
+                <w:u w:val="single"/>
+              </w:rPr>
+              <w:t>penyitaan</w:t>
+            </w:r>
+            <w:proofErr w:type="spellEnd"/>
           </w:p>
         </w:tc>
         <w:tc>
@@ -784,6 +876,7 @@
                 <w:szCs w:val="24"/>
               </w:rPr>
             </w:pPr>
+            <w:proofErr w:type="spellStart"/>
             <w:r>
               <w:rPr>
                 <w:rFonts w:ascii="Arial Narrow" w:hAnsi="Arial Narrow"/>
@@ -792,6 +885,7 @@
               </w:rPr>
               <w:t>Kepada</w:t>
             </w:r>
+            <w:proofErr w:type="spellEnd"/>
           </w:p>
         </w:tc>
       </w:tr>
@@ -961,13 +1055,23 @@
                 <w:szCs w:val="24"/>
               </w:rPr>
             </w:pPr>
-            <w:r>
-              <w:rPr>
-                <w:rFonts w:ascii="Arial Narrow" w:hAnsi="Arial Narrow"/>
-                <w:sz w:val="24"/>
-                <w:szCs w:val="24"/>
-              </w:rPr>
-              <w:t>Yth.</w:t>
+            <w:proofErr w:type="spellStart"/>
+            <w:r>
+              <w:rPr>
+                <w:rFonts w:ascii="Arial Narrow" w:hAnsi="Arial Narrow"/>
+                <w:sz w:val="24"/>
+                <w:szCs w:val="24"/>
+              </w:rPr>
+              <w:t>Yth</w:t>
+            </w:r>
+            <w:proofErr w:type="spellEnd"/>
+            <w:r>
+              <w:rPr>
+                <w:rFonts w:ascii="Arial Narrow" w:hAnsi="Arial Narrow"/>
+                <w:sz w:val="24"/>
+                <w:szCs w:val="24"/>
+              </w:rPr>
+              <w:t>.</w:t>
             </w:r>
           </w:p>
         </w:tc>
@@ -1000,6 +1104,7 @@
               </w:rPr>
               <w:t>${</w:t>
             </w:r>
+            <w:proofErr w:type="spellStart"/>
             <w:r>
               <w:rPr>
                 <w:rFonts w:ascii="Arial Narrow" w:hAnsi="Arial Narrow"/>
@@ -1016,6 +1121,7 @@
               </w:rPr>
               <w:t>Name</w:t>
             </w:r>
+            <w:proofErr w:type="spellEnd"/>
             <w:r>
               <w:rPr>
                 <w:rFonts w:ascii="Arial Narrow" w:hAnsi="Arial Narrow"/>
@@ -1411,6 +1517,7 @@
               </w:rPr>
               <w:t>${</w:t>
             </w:r>
+            <w:proofErr w:type="spellStart"/>
             <w:r>
               <w:rPr>
                 <w:rFonts w:ascii="Arial Narrow" w:hAnsi="Arial Narrow"/>
@@ -1429,6 +1536,7 @@
               </w:rPr>
               <w:t>Location</w:t>
             </w:r>
+            <w:proofErr w:type="spellEnd"/>
             <w:r>
               <w:rPr>
                 <w:rFonts w:ascii="Arial Narrow" w:hAnsi="Arial Narrow"/>
@@ -1529,6 +1637,7 @@
                 <w:lang w:eastAsia="en-ID"/>
               </w:rPr>
             </w:pPr>
+            <w:proofErr w:type="spellStart"/>
             <w:r>
               <w:rPr>
                 <w:rFonts w:ascii="Arial Narrow" w:eastAsia="Times New Roman" w:hAnsi="Arial Narrow" w:cs="Fira Code"/>
@@ -1538,6 +1647,7 @@
               </w:rPr>
               <w:t>Rujukan</w:t>
             </w:r>
+            <w:proofErr w:type="spellEnd"/>
             <w:r>
               <w:rPr>
                 <w:rFonts w:ascii="Arial Narrow" w:eastAsia="Times New Roman" w:hAnsi="Arial Narrow" w:cs="Fira Code"/>
@@ -1594,7 +1704,29 @@
                 <w:shd w:val="clear" w:color="auto" w:fill="FFFFFF"/>
                 <w:lang w:eastAsia="en-ID"/>
               </w:rPr>
-              <w:t>${referenceIteration}</w:t>
+              <w:t>${</w:t>
+            </w:r>
+            <w:proofErr w:type="spellStart"/>
+            <w:r>
+              <w:rPr>
+                <w:rFonts w:ascii="Arial Narrow" w:eastAsia="Times New Roman" w:hAnsi="Arial Narrow" w:cs="Fira Code"/>
+                <w:sz w:val="24"/>
+                <w:szCs w:val="24"/>
+                <w:shd w:val="clear" w:color="auto" w:fill="FFFFFF"/>
+                <w:lang w:eastAsia="en-ID"/>
+              </w:rPr>
+              <w:t>referenceIteration</w:t>
+            </w:r>
+            <w:proofErr w:type="spellEnd"/>
+            <w:r>
+              <w:rPr>
+                <w:rFonts w:ascii="Arial Narrow" w:eastAsia="Times New Roman" w:hAnsi="Arial Narrow" w:cs="Fira Code"/>
+                <w:sz w:val="24"/>
+                <w:szCs w:val="24"/>
+                <w:shd w:val="clear" w:color="auto" w:fill="FFFFFF"/>
+                <w:lang w:eastAsia="en-ID"/>
+              </w:rPr>
+              <w:t>}</w:t>
             </w:r>
           </w:p>
         </w:tc>
@@ -1622,7 +1754,29 @@
                 <w:shd w:val="clear" w:color="auto" w:fill="FFFFFF"/>
                 <w:lang w:eastAsia="en-ID"/>
               </w:rPr>
-              <w:t>${referenceName}</w:t>
+              <w:t>${</w:t>
+            </w:r>
+            <w:proofErr w:type="spellStart"/>
+            <w:r>
+              <w:rPr>
+                <w:rFonts w:ascii="Arial Narrow" w:eastAsia="Times New Roman" w:hAnsi="Arial Narrow" w:cs="Fira Code"/>
+                <w:sz w:val="24"/>
+                <w:szCs w:val="24"/>
+                <w:shd w:val="clear" w:color="auto" w:fill="FFFFFF"/>
+                <w:lang w:eastAsia="en-ID"/>
+              </w:rPr>
+              <w:t>referenceName</w:t>
+            </w:r>
+            <w:proofErr w:type="spellEnd"/>
+            <w:r>
+              <w:rPr>
+                <w:rFonts w:ascii="Arial Narrow" w:eastAsia="Times New Roman" w:hAnsi="Arial Narrow" w:cs="Fira Code"/>
+                <w:sz w:val="24"/>
+                <w:szCs w:val="24"/>
+                <w:shd w:val="clear" w:color="auto" w:fill="FFFFFF"/>
+                <w:lang w:eastAsia="en-ID"/>
+              </w:rPr>
+              <w:t>}</w:t>
             </w:r>
           </w:p>
         </w:tc>
@@ -1698,13 +1852,122 @@
                 <w:szCs w:val="24"/>
               </w:rPr>
             </w:pPr>
-            <w:r>
-              <w:rPr>
-                <w:rFonts w:ascii="Arial Narrow" w:hAnsi="Arial Narrow" w:cs="Arial"/>
-                <w:sz w:val="24"/>
-                <w:szCs w:val="24"/>
-              </w:rPr>
-              <w:t>Sehubungan dengan rujukan di atas, diberitahukan kepada K</w:t>
+            <w:proofErr w:type="spellStart"/>
+            <w:r>
+              <w:rPr>
+                <w:rFonts w:ascii="Arial Narrow" w:hAnsi="Arial Narrow" w:cs="Arial"/>
+                <w:sz w:val="24"/>
+                <w:szCs w:val="24"/>
+              </w:rPr>
+              <w:t>Sehubungan</w:t>
+            </w:r>
+            <w:proofErr w:type="spellEnd"/>
+            <w:r>
+              <w:rPr>
+                <w:rFonts w:ascii="Arial Narrow" w:hAnsi="Arial Narrow" w:cs="Arial"/>
+                <w:sz w:val="24"/>
+                <w:szCs w:val="24"/>
+              </w:rPr>
+              <w:t xml:space="preserve"> </w:t>
+            </w:r>
+            <w:proofErr w:type="spellStart"/>
+            <w:r>
+              <w:rPr>
+                <w:rFonts w:ascii="Arial Narrow" w:hAnsi="Arial Narrow" w:cs="Arial"/>
+                <w:sz w:val="24"/>
+                <w:szCs w:val="24"/>
+              </w:rPr>
+              <w:t>dengan</w:t>
+            </w:r>
+            <w:proofErr w:type="spellEnd"/>
+            <w:r>
+              <w:rPr>
+                <w:rFonts w:ascii="Arial Narrow" w:hAnsi="Arial Narrow" w:cs="Arial"/>
+                <w:sz w:val="24"/>
+                <w:szCs w:val="24"/>
+              </w:rPr>
+              <w:t xml:space="preserve"> </w:t>
+            </w:r>
+            <w:proofErr w:type="spellStart"/>
+            <w:r>
+              <w:rPr>
+                <w:rFonts w:ascii="Arial Narrow" w:hAnsi="Arial Narrow" w:cs="Arial"/>
+                <w:sz w:val="24"/>
+                <w:szCs w:val="24"/>
+              </w:rPr>
+              <w:t>rujukan</w:t>
+            </w:r>
+            <w:proofErr w:type="spellEnd"/>
+            <w:r>
+              <w:rPr>
+                <w:rFonts w:ascii="Arial Narrow" w:hAnsi="Arial Narrow" w:cs="Arial"/>
+                <w:sz w:val="24"/>
+                <w:szCs w:val="24"/>
+              </w:rPr>
+              <w:t xml:space="preserve"> di </w:t>
+            </w:r>
+            <w:proofErr w:type="spellStart"/>
+            <w:r>
+              <w:rPr>
+                <w:rFonts w:ascii="Arial Narrow" w:hAnsi="Arial Narrow" w:cs="Arial"/>
+                <w:sz w:val="24"/>
+                <w:szCs w:val="24"/>
+              </w:rPr>
+              <w:t>atas</w:t>
+            </w:r>
+            <w:proofErr w:type="spellEnd"/>
+            <w:r>
+              <w:rPr>
+                <w:rFonts w:ascii="Arial Narrow" w:hAnsi="Arial Narrow" w:cs="Arial"/>
+                <w:sz w:val="24"/>
+                <w:szCs w:val="24"/>
+              </w:rPr>
+              <w:t xml:space="preserve">, </w:t>
+            </w:r>
+            <w:proofErr w:type="spellStart"/>
+            <w:r>
+              <w:rPr>
+                <w:rFonts w:ascii="Arial Narrow" w:hAnsi="Arial Narrow" w:cs="Arial"/>
+                <w:sz w:val="24"/>
+                <w:szCs w:val="24"/>
+              </w:rPr>
+              <w:t>diberitahukan</w:t>
+            </w:r>
+            <w:proofErr w:type="spellEnd"/>
+            <w:r>
+              <w:rPr>
+                <w:rFonts w:ascii="Arial Narrow" w:hAnsi="Arial Narrow" w:cs="Arial"/>
+                <w:sz w:val="24"/>
+                <w:szCs w:val="24"/>
+              </w:rPr>
+              <w:t xml:space="preserve"> </w:t>
+            </w:r>
+            <w:proofErr w:type="spellStart"/>
+            <w:r>
+              <w:rPr>
+                <w:rFonts w:ascii="Arial Narrow" w:hAnsi="Arial Narrow" w:cs="Arial"/>
+                <w:sz w:val="24"/>
+                <w:szCs w:val="24"/>
+              </w:rPr>
+              <w:t>kepada</w:t>
+            </w:r>
+            <w:proofErr w:type="spellEnd"/>
+            <w:r>
+              <w:rPr>
+                <w:rFonts w:ascii="Arial Narrow" w:hAnsi="Arial Narrow" w:cs="Arial"/>
+                <w:sz w:val="24"/>
+                <w:szCs w:val="24"/>
+              </w:rPr>
+              <w:t xml:space="preserve"> </w:t>
+            </w:r>
+            <w:proofErr w:type="spellStart"/>
+            <w:r>
+              <w:rPr>
+                <w:rFonts w:ascii="Arial Narrow" w:hAnsi="Arial Narrow" w:cs="Arial"/>
+                <w:sz w:val="24"/>
+                <w:szCs w:val="24"/>
+              </w:rPr>
+              <w:t>K</w:t>
             </w:r>
             <w:r>
               <w:rPr>
@@ -1714,29 +1977,58 @@
               </w:rPr>
               <w:t>etua</w:t>
             </w:r>
-            <w:r>
-              <w:rPr>
-                <w:rFonts w:ascii="Arial Narrow" w:hAnsi="Arial Narrow" w:cs="Arial"/>
-                <w:sz w:val="24"/>
-                <w:szCs w:val="24"/>
-              </w:rPr>
-              <w:t xml:space="preserve"> bahwa </w:t>
-            </w:r>
-            <w:r>
-              <w:rPr>
-                <w:rFonts w:ascii="Arial Narrow" w:hAnsi="Arial Narrow" w:cs="Arial"/>
-                <w:sz w:val="24"/>
-                <w:szCs w:val="24"/>
-              </w:rPr>
-              <w:t>P</w:t>
-            </w:r>
-            <w:r>
-              <w:rPr>
-                <w:rFonts w:ascii="Arial Narrow" w:hAnsi="Arial Narrow" w:cs="Arial"/>
-                <w:sz w:val="24"/>
-                <w:szCs w:val="24"/>
-              </w:rPr>
-              <w:t xml:space="preserve">enyidik </w:t>
+            <w:proofErr w:type="spellEnd"/>
+            <w:r>
+              <w:rPr>
+                <w:rFonts w:ascii="Arial Narrow" w:hAnsi="Arial Narrow" w:cs="Arial"/>
+                <w:sz w:val="24"/>
+                <w:szCs w:val="24"/>
+              </w:rPr>
+              <w:t xml:space="preserve"> </w:t>
+            </w:r>
+            <w:proofErr w:type="spellStart"/>
+            <w:r>
+              <w:rPr>
+                <w:rFonts w:ascii="Arial Narrow" w:hAnsi="Arial Narrow" w:cs="Arial"/>
+                <w:sz w:val="24"/>
+                <w:szCs w:val="24"/>
+              </w:rPr>
+              <w:t>bahwa</w:t>
+            </w:r>
+            <w:proofErr w:type="spellEnd"/>
+            <w:r>
+              <w:rPr>
+                <w:rFonts w:ascii="Arial Narrow" w:hAnsi="Arial Narrow" w:cs="Arial"/>
+                <w:sz w:val="24"/>
+                <w:szCs w:val="24"/>
+              </w:rPr>
+              <w:t xml:space="preserve"> </w:t>
+            </w:r>
+            <w:proofErr w:type="spellStart"/>
+            <w:r>
+              <w:rPr>
+                <w:rFonts w:ascii="Arial Narrow" w:hAnsi="Arial Narrow" w:cs="Arial"/>
+                <w:sz w:val="24"/>
+                <w:szCs w:val="24"/>
+              </w:rPr>
+              <w:t>p</w:t>
+            </w:r>
+            <w:r>
+              <w:rPr>
+                <w:rFonts w:ascii="Arial Narrow" w:hAnsi="Arial Narrow" w:cs="Arial"/>
+                <w:sz w:val="24"/>
+                <w:szCs w:val="24"/>
+              </w:rPr>
+              <w:t>enyidik</w:t>
+            </w:r>
+            <w:proofErr w:type="spellEnd"/>
+            <w:r>
+              <w:rPr>
+                <w:rFonts w:ascii="Arial Narrow" w:hAnsi="Arial Narrow" w:cs="Arial"/>
+                <w:sz w:val="24"/>
+                <w:szCs w:val="24"/>
+              </w:rPr>
+              <w:t xml:space="preserve"> </w:t>
             </w:r>
             <w:r>
               <w:rPr>
@@ -1746,6 +2038,7 @@
               </w:rPr>
               <w:t>${</w:t>
             </w:r>
+            <w:proofErr w:type="spellStart"/>
             <w:r>
               <w:rPr>
                 <w:rFonts w:ascii="Arial Narrow" w:hAnsi="Arial Narrow" w:cs="Arial"/>
@@ -1754,6 +2047,7 @@
               </w:rPr>
               <w:t>workUnitName</w:t>
             </w:r>
+            <w:proofErr w:type="spellEnd"/>
             <w:r>
               <w:rPr>
                 <w:rFonts w:ascii="Arial Narrow" w:hAnsi="Arial Narrow" w:cs="Arial"/>
@@ -1770,37 +2064,295 @@
               </w:rPr>
               <w:t xml:space="preserve"> </w:t>
             </w:r>
-            <w:r>
-              <w:rPr>
-                <w:rFonts w:ascii="Arial Narrow" w:hAnsi="Arial Narrow" w:cs="Arial"/>
-                <w:sz w:val="24"/>
-                <w:szCs w:val="24"/>
-              </w:rPr>
-              <w:t xml:space="preserve">sedang menangani perkara Tindak Pidana ${crimeClass} sebagaimana dimaksud dalam ${CrimeConstitution}, </w:t>
-            </w:r>
-            <w:r>
-              <w:rPr>
-                <w:rFonts w:ascii="Arial Narrow" w:hAnsi="Arial Narrow" w:cs="Arial"/>
-                <w:sz w:val="24"/>
-                <w:szCs w:val="24"/>
-              </w:rPr>
-              <w:t xml:space="preserve">yang terjadi di </w:t>
-            </w:r>
-            <w:r>
-              <w:rPr>
-                <w:rFonts w:ascii="Arial Narrow" w:hAnsi="Arial Narrow" w:cs="Arial"/>
-                <w:sz w:val="24"/>
-                <w:szCs w:val="24"/>
-              </w:rPr>
-              <w:t>${accidentRoad}</w:t>
-            </w:r>
-            <w:r>
-              <w:rPr>
-                <w:rFonts w:ascii="Arial Narrow" w:hAnsi="Arial Narrow" w:cs="Arial"/>
-                <w:sz w:val="24"/>
-                <w:szCs w:val="24"/>
-              </w:rPr>
-              <w:t xml:space="preserve">, </w:t>
+            <w:proofErr w:type="spellStart"/>
+            <w:r>
+              <w:rPr>
+                <w:rFonts w:ascii="Arial Narrow" w:hAnsi="Arial Narrow" w:cs="Arial"/>
+                <w:sz w:val="24"/>
+                <w:szCs w:val="24"/>
+              </w:rPr>
+              <w:t>sedang</w:t>
+            </w:r>
+            <w:proofErr w:type="spellEnd"/>
+            <w:r>
+              <w:rPr>
+                <w:rFonts w:ascii="Arial Narrow" w:hAnsi="Arial Narrow" w:cs="Arial"/>
+                <w:sz w:val="24"/>
+                <w:szCs w:val="24"/>
+              </w:rPr>
+              <w:t xml:space="preserve"> </w:t>
+            </w:r>
+            <w:proofErr w:type="spellStart"/>
+            <w:r>
+              <w:rPr>
+                <w:rFonts w:ascii="Arial Narrow" w:hAnsi="Arial Narrow" w:cs="Arial"/>
+                <w:sz w:val="24"/>
+                <w:szCs w:val="24"/>
+              </w:rPr>
+              <w:t>melakukan</w:t>
+            </w:r>
+            <w:proofErr w:type="spellEnd"/>
+            <w:r>
+              <w:rPr>
+                <w:rFonts w:ascii="Arial Narrow" w:hAnsi="Arial Narrow" w:cs="Arial"/>
+                <w:sz w:val="24"/>
+                <w:szCs w:val="24"/>
+              </w:rPr>
+              <w:t xml:space="preserve"> </w:t>
+            </w:r>
+            <w:proofErr w:type="spellStart"/>
+            <w:r>
+              <w:rPr>
+                <w:rFonts w:ascii="Arial Narrow" w:hAnsi="Arial Narrow" w:cs="Arial"/>
+                <w:sz w:val="24"/>
+                <w:szCs w:val="24"/>
+              </w:rPr>
+              <w:t>penyidikan</w:t>
+            </w:r>
+            <w:proofErr w:type="spellEnd"/>
+            <w:r>
+              <w:rPr>
+                <w:rFonts w:ascii="Arial Narrow" w:hAnsi="Arial Narrow" w:cs="Arial"/>
+                <w:sz w:val="24"/>
+                <w:szCs w:val="24"/>
+              </w:rPr>
+              <w:t xml:space="preserve"> </w:t>
+            </w:r>
+            <w:proofErr w:type="spellStart"/>
+            <w:r>
+              <w:rPr>
+                <w:rFonts w:ascii="Arial Narrow" w:hAnsi="Arial Narrow" w:cs="Arial"/>
+                <w:sz w:val="24"/>
+                <w:szCs w:val="24"/>
+              </w:rPr>
+              <w:t>dugaan</w:t>
+            </w:r>
+            <w:proofErr w:type="spellEnd"/>
+            <w:r>
+              <w:rPr>
+                <w:rFonts w:ascii="Arial Narrow" w:hAnsi="Arial Narrow" w:cs="Arial"/>
+                <w:sz w:val="24"/>
+                <w:szCs w:val="24"/>
+              </w:rPr>
+              <w:t xml:space="preserve"> </w:t>
+            </w:r>
+            <w:proofErr w:type="spellStart"/>
+            <w:r>
+              <w:rPr>
+                <w:rFonts w:ascii="Arial Narrow" w:hAnsi="Arial Narrow" w:cs="Arial"/>
+                <w:sz w:val="24"/>
+                <w:szCs w:val="24"/>
+              </w:rPr>
+              <w:t>t</w:t>
+            </w:r>
+            <w:r>
+              <w:rPr>
+                <w:rFonts w:ascii="Arial Narrow" w:hAnsi="Arial Narrow" w:cs="Arial"/>
+                <w:sz w:val="24"/>
+                <w:szCs w:val="24"/>
+              </w:rPr>
+              <w:t>indak</w:t>
+            </w:r>
+            <w:proofErr w:type="spellEnd"/>
+            <w:r>
+              <w:rPr>
+                <w:rFonts w:ascii="Arial Narrow" w:hAnsi="Arial Narrow" w:cs="Arial"/>
+                <w:sz w:val="24"/>
+                <w:szCs w:val="24"/>
+              </w:rPr>
+              <w:t xml:space="preserve"> </w:t>
+            </w:r>
+            <w:proofErr w:type="spellStart"/>
+            <w:r>
+              <w:rPr>
+                <w:rFonts w:ascii="Arial Narrow" w:hAnsi="Arial Narrow" w:cs="Arial"/>
+                <w:sz w:val="24"/>
+                <w:szCs w:val="24"/>
+              </w:rPr>
+              <w:t>p</w:t>
+            </w:r>
+            <w:r>
+              <w:rPr>
+                <w:rFonts w:ascii="Arial Narrow" w:hAnsi="Arial Narrow" w:cs="Arial"/>
+                <w:sz w:val="24"/>
+                <w:szCs w:val="24"/>
+              </w:rPr>
+              <w:t>idana</w:t>
+            </w:r>
+            <w:proofErr w:type="spellEnd"/>
+            <w:r>
+              <w:rPr>
+                <w:rFonts w:ascii="Arial Narrow" w:hAnsi="Arial Narrow" w:cs="Arial"/>
+                <w:sz w:val="24"/>
+                <w:szCs w:val="24"/>
+              </w:rPr>
+              <w:t xml:space="preserve"> ${</w:t>
+            </w:r>
+            <w:proofErr w:type="spellStart"/>
+            <w:r>
+              <w:rPr>
+                <w:rFonts w:ascii="Arial Narrow" w:hAnsi="Arial Narrow" w:cs="Arial"/>
+                <w:sz w:val="24"/>
+                <w:szCs w:val="24"/>
+              </w:rPr>
+              <w:t>crimeClass</w:t>
+            </w:r>
+            <w:proofErr w:type="spellEnd"/>
+            <w:r>
+              <w:rPr>
+                <w:rFonts w:ascii="Arial Narrow" w:hAnsi="Arial Narrow" w:cs="Arial"/>
+                <w:sz w:val="24"/>
+                <w:szCs w:val="24"/>
+              </w:rPr>
+              <w:t xml:space="preserve">} </w:t>
+            </w:r>
+            <w:proofErr w:type="spellStart"/>
+            <w:r>
+              <w:rPr>
+                <w:rFonts w:ascii="Arial Narrow" w:hAnsi="Arial Narrow" w:cs="Arial"/>
+                <w:sz w:val="24"/>
+                <w:szCs w:val="24"/>
+              </w:rPr>
+              <w:t>sebagaimana</w:t>
+            </w:r>
+            <w:proofErr w:type="spellEnd"/>
+            <w:r>
+              <w:rPr>
+                <w:rFonts w:ascii="Arial Narrow" w:hAnsi="Arial Narrow" w:cs="Arial"/>
+                <w:sz w:val="24"/>
+                <w:szCs w:val="24"/>
+              </w:rPr>
+              <w:t xml:space="preserve"> </w:t>
+            </w:r>
+            <w:proofErr w:type="spellStart"/>
+            <w:r>
+              <w:rPr>
+                <w:rFonts w:ascii="Arial Narrow" w:hAnsi="Arial Narrow" w:cs="Arial"/>
+                <w:sz w:val="24"/>
+                <w:szCs w:val="24"/>
+              </w:rPr>
+              <w:t>dimaksud</w:t>
+            </w:r>
+            <w:proofErr w:type="spellEnd"/>
+            <w:r>
+              <w:rPr>
+                <w:rFonts w:ascii="Arial Narrow" w:hAnsi="Arial Narrow" w:cs="Arial"/>
+                <w:sz w:val="24"/>
+                <w:szCs w:val="24"/>
+              </w:rPr>
+              <w:t xml:space="preserve"> </w:t>
+            </w:r>
+            <w:proofErr w:type="spellStart"/>
+            <w:r>
+              <w:rPr>
+                <w:rFonts w:ascii="Arial Narrow" w:hAnsi="Arial Narrow" w:cs="Arial"/>
+                <w:sz w:val="24"/>
+                <w:szCs w:val="24"/>
+              </w:rPr>
+              <w:t>dalam</w:t>
+            </w:r>
+            <w:proofErr w:type="spellEnd"/>
+            <w:r>
+              <w:rPr>
+                <w:rFonts w:ascii="Arial Narrow" w:hAnsi="Arial Narrow" w:cs="Arial"/>
+                <w:sz w:val="24"/>
+                <w:szCs w:val="24"/>
+              </w:rPr>
+              <w:t xml:space="preserve"> ${</w:t>
+            </w:r>
+            <w:proofErr w:type="spellStart"/>
+            <w:r>
+              <w:rPr>
+                <w:rFonts w:ascii="Arial Narrow" w:hAnsi="Arial Narrow" w:cs="Arial"/>
+                <w:sz w:val="24"/>
+                <w:szCs w:val="24"/>
+              </w:rPr>
+              <w:t>CrimeConstitution</w:t>
+            </w:r>
+            <w:proofErr w:type="spellEnd"/>
+            <w:r>
+              <w:rPr>
+                <w:rFonts w:ascii="Arial Narrow" w:hAnsi="Arial Narrow" w:cs="Arial"/>
+                <w:sz w:val="24"/>
+                <w:szCs w:val="24"/>
+              </w:rPr>
+              <w:t xml:space="preserve">}, </w:t>
+            </w:r>
+            <w:r>
+              <w:rPr>
+                <w:rFonts w:ascii="Arial Narrow" w:hAnsi="Arial Narrow" w:cs="Arial"/>
+                <w:sz w:val="24"/>
+                <w:szCs w:val="24"/>
+              </w:rPr>
+              <w:t xml:space="preserve">yang </w:t>
+            </w:r>
+            <w:proofErr w:type="spellStart"/>
+            <w:r>
+              <w:rPr>
+                <w:rFonts w:ascii="Arial Narrow" w:hAnsi="Arial Narrow" w:cs="Arial"/>
+                <w:sz w:val="24"/>
+                <w:szCs w:val="24"/>
+              </w:rPr>
+              <w:t>terjadi</w:t>
+            </w:r>
+            <w:proofErr w:type="spellEnd"/>
+            <w:r>
+              <w:rPr>
+                <w:rFonts w:ascii="Arial Narrow" w:hAnsi="Arial Narrow" w:cs="Arial"/>
+                <w:sz w:val="24"/>
+                <w:szCs w:val="24"/>
+              </w:rPr>
+              <w:t xml:space="preserve"> </w:t>
+            </w:r>
+            <w:r>
+              <w:rPr>
+                <w:rFonts w:ascii="Arial Narrow" w:hAnsi="Arial Narrow" w:cs="Arial"/>
+                <w:sz w:val="24"/>
+                <w:szCs w:val="24"/>
+              </w:rPr>
+              <w:t>pada</w:t>
+            </w:r>
+            <w:r>
+              <w:rPr>
+                <w:rFonts w:ascii="Arial Narrow" w:hAnsi="Arial Narrow" w:cs="Arial"/>
+                <w:sz w:val="24"/>
+                <w:szCs w:val="24"/>
+              </w:rPr>
+              <w:t xml:space="preserve"> </w:t>
+            </w:r>
+            <w:r>
+              <w:rPr>
+                <w:rFonts w:ascii="Arial Narrow" w:hAnsi="Arial Narrow" w:cs="Arial"/>
+                <w:sz w:val="24"/>
+                <w:szCs w:val="24"/>
+              </w:rPr>
+              <w:t>${</w:t>
+            </w:r>
+            <w:proofErr w:type="spellStart"/>
+            <w:r>
+              <w:rPr>
+                <w:rFonts w:ascii="Arial Narrow" w:hAnsi="Arial Narrow" w:cs="Arial"/>
+                <w:sz w:val="24"/>
+                <w:szCs w:val="24"/>
+              </w:rPr>
+              <w:t>accidentRoad</w:t>
+            </w:r>
+            <w:proofErr w:type="spellEnd"/>
+            <w:r>
+              <w:rPr>
+                <w:rFonts w:ascii="Arial Narrow" w:hAnsi="Arial Narrow" w:cs="Arial"/>
+                <w:sz w:val="24"/>
+                <w:szCs w:val="24"/>
+              </w:rPr>
+              <w:t>}</w:t>
+            </w:r>
+            <w:r>
+              <w:rPr>
+                <w:rFonts w:ascii="Arial Narrow" w:hAnsi="Arial Narrow" w:cs="Arial"/>
+                <w:sz w:val="24"/>
+                <w:szCs w:val="24"/>
+              </w:rPr>
+              <w:t xml:space="preserve"> </w:t>
             </w:r>
             <w:r>
               <w:rPr>
@@ -1824,16 +2376,53 @@
                 <w:sz w:val="24"/>
                 <w:szCs w:val="24"/>
               </w:rPr>
-              <w:t xml:space="preserve"> hari ${accidentDay}</w:t>
-            </w:r>
-            <w:r>
-              <w:rPr>
-                <w:rFonts w:ascii="Arial Narrow" w:hAnsi="Arial Narrow" w:cs="Arial"/>
-                <w:sz w:val="24"/>
-                <w:szCs w:val="24"/>
-              </w:rPr>
               <w:t xml:space="preserve"> </w:t>
             </w:r>
+            <w:proofErr w:type="spellStart"/>
+            <w:r>
+              <w:rPr>
+                <w:rFonts w:ascii="Arial Narrow" w:hAnsi="Arial Narrow" w:cs="Arial"/>
+                <w:sz w:val="24"/>
+                <w:szCs w:val="24"/>
+              </w:rPr>
+              <w:t>hari</w:t>
+            </w:r>
+            <w:proofErr w:type="spellEnd"/>
+            <w:r>
+              <w:rPr>
+                <w:rFonts w:ascii="Arial Narrow" w:hAnsi="Arial Narrow" w:cs="Arial"/>
+                <w:sz w:val="24"/>
+                <w:szCs w:val="24"/>
+              </w:rPr>
+              <w:t xml:space="preserve"> ${</w:t>
+            </w:r>
+            <w:proofErr w:type="spellStart"/>
+            <w:r>
+              <w:rPr>
+                <w:rFonts w:ascii="Arial Narrow" w:hAnsi="Arial Narrow" w:cs="Arial"/>
+                <w:sz w:val="24"/>
+                <w:szCs w:val="24"/>
+              </w:rPr>
+              <w:t>accidentDay</w:t>
+            </w:r>
+            <w:proofErr w:type="spellEnd"/>
+            <w:r>
+              <w:rPr>
+                <w:rFonts w:ascii="Arial Narrow" w:hAnsi="Arial Narrow" w:cs="Arial"/>
+                <w:sz w:val="24"/>
+                <w:szCs w:val="24"/>
+              </w:rPr>
+              <w:t>}</w:t>
+            </w:r>
+            <w:r>
+              <w:rPr>
+                <w:rFonts w:ascii="Arial Narrow" w:hAnsi="Arial Narrow" w:cs="Arial"/>
+                <w:sz w:val="24"/>
+                <w:szCs w:val="24"/>
+              </w:rPr>
+              <w:t xml:space="preserve"> </w:t>
+            </w:r>
+            <w:proofErr w:type="spellStart"/>
             <w:r>
               <w:rPr>
                 <w:rFonts w:ascii="Arial Narrow" w:hAnsi="Arial Narrow" w:cs="Arial"/>
@@ -1850,6 +2439,7 @@
               </w:rPr>
               <w:t>anggal</w:t>
             </w:r>
+            <w:proofErr w:type="spellEnd"/>
             <w:r>
               <w:rPr>
                 <w:rFonts w:ascii="Arial Narrow" w:hAnsi="Arial Narrow" w:cs="Arial"/>
@@ -1868,6 +2458,7 @@
               </w:rPr>
               <w:t>${</w:t>
             </w:r>
+            <w:proofErr w:type="spellStart"/>
             <w:r>
               <w:rPr>
                 <w:rFonts w:ascii="Arial Narrow" w:eastAsia="Times New Roman" w:hAnsi="Arial Narrow" w:cs="Fira Code"/>
@@ -1878,6 +2469,7 @@
               </w:rPr>
               <w:t>accidentDate</w:t>
             </w:r>
+            <w:proofErr w:type="spellEnd"/>
             <w:r>
               <w:rPr>
                 <w:rFonts w:ascii="Arial Narrow" w:eastAsia="Times New Roman" w:hAnsi="Arial Narrow" w:cs="Fira Code"/>
@@ -1906,7 +2498,171 @@
                 <w:shd w:val="clear" w:color="auto" w:fill="FFFFFF"/>
                 <w:lang w:eastAsia="en-ID"/>
               </w:rPr>
-              <w:t xml:space="preserve">. Berdasarkan hasil pemeriksaan terhadap </w:t>
+              <w:t xml:space="preserve">, </w:t>
+            </w:r>
+            <w:proofErr w:type="spellStart"/>
+            <w:r>
+              <w:rPr>
+                <w:rFonts w:ascii="Arial Narrow" w:eastAsia="Times New Roman" w:hAnsi="Arial Narrow" w:cs="Fira Code"/>
+                <w:sz w:val="24"/>
+                <w:szCs w:val="24"/>
+                <w:shd w:val="clear" w:color="auto" w:fill="FFFFFF"/>
+                <w:lang w:eastAsia="en-ID"/>
+              </w:rPr>
+              <w:t>dengan</w:t>
+            </w:r>
+            <w:proofErr w:type="spellEnd"/>
+            <w:r>
+              <w:rPr>
+                <w:rFonts w:ascii="Arial Narrow" w:eastAsia="Times New Roman" w:hAnsi="Arial Narrow" w:cs="Fira Code"/>
+                <w:sz w:val="24"/>
+                <w:szCs w:val="24"/>
+                <w:shd w:val="clear" w:color="auto" w:fill="FFFFFF"/>
+                <w:lang w:eastAsia="en-ID"/>
+              </w:rPr>
+              <w:t xml:space="preserve"> </w:t>
+            </w:r>
+            <w:proofErr w:type="spellStart"/>
+            <w:r>
+              <w:rPr>
+                <w:rFonts w:ascii="Arial Narrow" w:eastAsia="Times New Roman" w:hAnsi="Arial Narrow" w:cs="Fira Code"/>
+                <w:sz w:val="24"/>
+                <w:szCs w:val="24"/>
+                <w:shd w:val="clear" w:color="auto" w:fill="FFFFFF"/>
+                <w:lang w:eastAsia="en-ID"/>
+              </w:rPr>
+              <w:t>tersangka</w:t>
+            </w:r>
+            <w:proofErr w:type="spellEnd"/>
+            <w:r>
+              <w:rPr>
+                <w:rFonts w:ascii="Arial Narrow" w:eastAsia="Times New Roman" w:hAnsi="Arial Narrow" w:cs="Fira Code"/>
+                <w:sz w:val="24"/>
+                <w:szCs w:val="24"/>
+                <w:shd w:val="clear" w:color="auto" w:fill="FFFFFF"/>
+                <w:lang w:eastAsia="en-ID"/>
+              </w:rPr>
+              <w:t xml:space="preserve"> ${</w:t>
+            </w:r>
+            <w:proofErr w:type="spellStart"/>
+            <w:r>
+              <w:rPr>
+                <w:rFonts w:ascii="Arial Narrow" w:eastAsia="Times New Roman" w:hAnsi="Arial Narrow" w:cs="Fira Code"/>
+                <w:sz w:val="24"/>
+                <w:szCs w:val="24"/>
+                <w:shd w:val="clear" w:color="auto" w:fill="FFFFFF"/>
+                <w:lang w:eastAsia="en-ID"/>
+              </w:rPr>
+              <w:t>suspectName</w:t>
+            </w:r>
+            <w:proofErr w:type="spellEnd"/>
+            <w:r>
+              <w:rPr>
+                <w:rFonts w:ascii="Arial Narrow" w:eastAsia="Times New Roman" w:hAnsi="Arial Narrow" w:cs="Fira Code"/>
+                <w:sz w:val="24"/>
+                <w:szCs w:val="24"/>
+                <w:shd w:val="clear" w:color="auto" w:fill="FFFFFF"/>
+                <w:lang w:eastAsia="en-ID"/>
+              </w:rPr>
+              <w:t>}</w:t>
+            </w:r>
+            <w:r>
+              <w:rPr>
+                <w:rFonts w:ascii="Arial Narrow" w:eastAsia="Times New Roman" w:hAnsi="Arial Narrow" w:cs="Fira Code"/>
+                <w:sz w:val="24"/>
+                <w:szCs w:val="24"/>
+                <w:shd w:val="clear" w:color="auto" w:fill="FFFFFF"/>
+                <w:lang w:eastAsia="en-ID"/>
+              </w:rPr>
+              <w:t xml:space="preserve">. </w:t>
+            </w:r>
+            <w:proofErr w:type="spellStart"/>
+            <w:r>
+              <w:rPr>
+                <w:rFonts w:ascii="Arial Narrow" w:eastAsia="Times New Roman" w:hAnsi="Arial Narrow" w:cs="Fira Code"/>
+                <w:sz w:val="24"/>
+                <w:szCs w:val="24"/>
+                <w:shd w:val="clear" w:color="auto" w:fill="FFFFFF"/>
+                <w:lang w:eastAsia="en-ID"/>
+              </w:rPr>
+              <w:t>Berdasarkan</w:t>
+            </w:r>
+            <w:proofErr w:type="spellEnd"/>
+            <w:r>
+              <w:rPr>
+                <w:rFonts w:ascii="Arial Narrow" w:eastAsia="Times New Roman" w:hAnsi="Arial Narrow" w:cs="Fira Code"/>
+                <w:sz w:val="24"/>
+                <w:szCs w:val="24"/>
+                <w:shd w:val="clear" w:color="auto" w:fill="FFFFFF"/>
+                <w:lang w:eastAsia="en-ID"/>
+              </w:rPr>
+              <w:t xml:space="preserve"> </w:t>
+            </w:r>
+            <w:proofErr w:type="spellStart"/>
+            <w:r>
+              <w:rPr>
+                <w:rFonts w:ascii="Arial Narrow" w:eastAsia="Times New Roman" w:hAnsi="Arial Narrow" w:cs="Fira Code"/>
+                <w:sz w:val="24"/>
+                <w:szCs w:val="24"/>
+                <w:shd w:val="clear" w:color="auto" w:fill="FFFFFF"/>
+                <w:lang w:eastAsia="en-ID"/>
+              </w:rPr>
+              <w:t>hasil</w:t>
+            </w:r>
+            <w:proofErr w:type="spellEnd"/>
+            <w:r>
+              <w:rPr>
+                <w:rFonts w:ascii="Arial Narrow" w:eastAsia="Times New Roman" w:hAnsi="Arial Narrow" w:cs="Fira Code"/>
+                <w:sz w:val="24"/>
+                <w:szCs w:val="24"/>
+                <w:shd w:val="clear" w:color="auto" w:fill="FFFFFF"/>
+                <w:lang w:eastAsia="en-ID"/>
+              </w:rPr>
+              <w:t xml:space="preserve"> </w:t>
+            </w:r>
+            <w:proofErr w:type="spellStart"/>
+            <w:r>
+              <w:rPr>
+                <w:rFonts w:ascii="Arial Narrow" w:eastAsia="Times New Roman" w:hAnsi="Arial Narrow" w:cs="Fira Code"/>
+                <w:sz w:val="24"/>
+                <w:szCs w:val="24"/>
+                <w:shd w:val="clear" w:color="auto" w:fill="FFFFFF"/>
+                <w:lang w:eastAsia="en-ID"/>
+              </w:rPr>
+              <w:t>pemeriksaan</w:t>
+            </w:r>
+            <w:proofErr w:type="spellEnd"/>
+            <w:r>
+              <w:rPr>
+                <w:rFonts w:ascii="Arial Narrow" w:eastAsia="Times New Roman" w:hAnsi="Arial Narrow" w:cs="Fira Code"/>
+                <w:sz w:val="24"/>
+                <w:szCs w:val="24"/>
+                <w:shd w:val="clear" w:color="auto" w:fill="FFFFFF"/>
+                <w:lang w:eastAsia="en-ID"/>
+              </w:rPr>
+              <w:t xml:space="preserve"> </w:t>
+            </w:r>
+            <w:proofErr w:type="spellStart"/>
+            <w:r>
+              <w:rPr>
+                <w:rFonts w:ascii="Arial Narrow" w:eastAsia="Times New Roman" w:hAnsi="Arial Narrow" w:cs="Fira Code"/>
+                <w:sz w:val="24"/>
+                <w:szCs w:val="24"/>
+                <w:shd w:val="clear" w:color="auto" w:fill="FFFFFF"/>
+                <w:lang w:eastAsia="en-ID"/>
+              </w:rPr>
+              <w:t>terhadap</w:t>
+            </w:r>
+            <w:proofErr w:type="spellEnd"/>
+            <w:r>
+              <w:rPr>
+                <w:rFonts w:ascii="Arial Narrow" w:eastAsia="Times New Roman" w:hAnsi="Arial Narrow" w:cs="Fira Code"/>
+                <w:sz w:val="24"/>
+                <w:szCs w:val="24"/>
+                <w:shd w:val="clear" w:color="auto" w:fill="FFFFFF"/>
+                <w:lang w:eastAsia="en-ID"/>
+              </w:rPr>
+              <w:t xml:space="preserve"> </w:t>
             </w:r>
             <w:r>
               <w:rPr>
@@ -1916,6 +2672,7 @@
               </w:rPr>
               <w:t>${</w:t>
             </w:r>
+            <w:proofErr w:type="spellStart"/>
             <w:r>
               <w:rPr>
                 <w:rFonts w:ascii="Arial Narrow" w:hAnsi="Arial Narrow" w:cs="Arial"/>
@@ -1924,6 +2681,7 @@
               </w:rPr>
               <w:t>suspectExistText</w:t>
             </w:r>
+            <w:proofErr w:type="spellEnd"/>
             <w:r>
               <w:rPr>
                 <w:rFonts w:ascii="Arial Narrow" w:hAnsi="Arial Narrow" w:cs="Arial"/>
@@ -2078,6 +2836,7 @@
                     </w:rPr>
                     <w:t>${</w:t>
                   </w:r>
+                  <w:proofErr w:type="spellStart"/>
                   <w:r>
                     <w:rPr>
                       <w:rFonts w:ascii="Arial Narrow" w:eastAsia="Arial Narrow" w:hAnsi="Arial Narrow"/>
@@ -2088,6 +2847,7 @@
                     </w:rPr>
                     <w:t>suspectName</w:t>
                   </w:r>
+                  <w:proofErr w:type="spellEnd"/>
                   <w:r>
                     <w:rPr>
                       <w:rFonts w:ascii="Arial Narrow" w:eastAsia="Arial Narrow" w:hAnsi="Arial Narrow"/>
@@ -2146,6 +2906,7 @@
                       <w:lang w:eastAsia="en-ID"/>
                     </w:rPr>
                   </w:pPr>
+                  <w:proofErr w:type="spellStart"/>
                   <w:r>
                     <w:rPr>
                       <w:rFonts w:ascii="Arial Narrow" w:eastAsia="Times New Roman" w:hAnsi="Arial Narrow" w:cs="Fira Code"/>
@@ -2154,8 +2915,31 @@
                       <w:shd w:val="clear" w:color="auto" w:fill="FFFFFF"/>
                       <w:lang w:eastAsia="en-ID"/>
                     </w:rPr>
-                    <w:t>nomor identitas</w:t>
-                  </w:r>
+                    <w:t>nomor</w:t>
+                  </w:r>
+                  <w:proofErr w:type="spellEnd"/>
+                  <w:r>
+                    <w:rPr>
+                      <w:rFonts w:ascii="Arial Narrow" w:eastAsia="Times New Roman" w:hAnsi="Arial Narrow" w:cs="Fira Code"/>
+                      <w:sz w:val="24"/>
+                      <w:szCs w:val="24"/>
+                      <w:shd w:val="clear" w:color="auto" w:fill="FFFFFF"/>
+                      <w:lang w:eastAsia="en-ID"/>
+                    </w:rPr>
+                    <w:t xml:space="preserve"> </w:t>
+                  </w:r>
+                  <w:proofErr w:type="spellStart"/>
+                  <w:r>
+                    <w:rPr>
+                      <w:rFonts w:ascii="Arial Narrow" w:eastAsia="Times New Roman" w:hAnsi="Arial Narrow" w:cs="Fira Code"/>
+                      <w:sz w:val="24"/>
+                      <w:szCs w:val="24"/>
+                      <w:shd w:val="clear" w:color="auto" w:fill="FFFFFF"/>
+                      <w:lang w:eastAsia="en-ID"/>
+                    </w:rPr>
+                    <w:t>identitas</w:t>
+                  </w:r>
+                  <w:proofErr w:type="spellEnd"/>
                 </w:p>
               </w:tc>
               <w:tc>
@@ -2212,6 +2996,7 @@
                     </w:rPr>
                     <w:t>${</w:t>
                   </w:r>
+                  <w:proofErr w:type="spellStart"/>
                   <w:r>
                     <w:rPr>
                       <w:rFonts w:ascii="Arial Narrow" w:eastAsia="Arial Narrow" w:hAnsi="Arial Narrow"/>
@@ -2222,6 +3007,7 @@
                     </w:rPr>
                     <w:t>suspectIdentityNumber</w:t>
                   </w:r>
+                  <w:proofErr w:type="spellEnd"/>
                   <w:r>
                     <w:rPr>
                       <w:rFonts w:ascii="Arial Narrow" w:eastAsia="Arial Narrow" w:hAnsi="Arial Narrow"/>
@@ -2280,6 +3066,7 @@
                       <w:lang w:eastAsia="en-ID"/>
                     </w:rPr>
                   </w:pPr>
+                  <w:proofErr w:type="spellStart"/>
                   <w:r>
                     <w:rPr>
                       <w:rFonts w:ascii="Arial Narrow" w:eastAsia="Times New Roman" w:hAnsi="Arial Narrow" w:cs="Fira Code"/>
@@ -2300,6 +3087,7 @@
                     </w:rPr>
                     <w:t>ewarganegaraan</w:t>
                   </w:r>
+                  <w:proofErr w:type="spellEnd"/>
                 </w:p>
               </w:tc>
               <w:tc>
@@ -2356,6 +3144,7 @@
                     </w:rPr>
                     <w:t>${</w:t>
                   </w:r>
+                  <w:proofErr w:type="spellStart"/>
                   <w:r>
                     <w:rPr>
                       <w:rFonts w:ascii="Arial Narrow" w:eastAsia="Arial Narrow" w:hAnsi="Arial Narrow"/>
@@ -2366,6 +3155,7 @@
                     </w:rPr>
                     <w:t>suspectNationality</w:t>
                   </w:r>
+                  <w:proofErr w:type="spellEnd"/>
                   <w:r>
                     <w:rPr>
                       <w:rFonts w:ascii="Arial Narrow" w:eastAsia="Arial Narrow" w:hAnsi="Arial Narrow"/>
@@ -2424,6 +3214,7 @@
                       <w:lang w:eastAsia="en-ID"/>
                     </w:rPr>
                   </w:pPr>
+                  <w:proofErr w:type="spellStart"/>
                   <w:r>
                     <w:rPr>
                       <w:rFonts w:ascii="Arial Narrow" w:eastAsia="Times New Roman" w:hAnsi="Arial Narrow" w:cs="Fira Code"/>
@@ -2442,8 +3233,31 @@
                       <w:shd w:val="clear" w:color="auto" w:fill="FFFFFF"/>
                       <w:lang w:eastAsia="en-ID"/>
                     </w:rPr>
-                    <w:t>enis kelamin</w:t>
-                  </w:r>
+                    <w:t>enis</w:t>
+                  </w:r>
+                  <w:proofErr w:type="spellEnd"/>
+                  <w:r>
+                    <w:rPr>
+                      <w:rFonts w:ascii="Arial Narrow" w:eastAsia="Times New Roman" w:hAnsi="Arial Narrow" w:cs="Fira Code"/>
+                      <w:sz w:val="24"/>
+                      <w:szCs w:val="24"/>
+                      <w:shd w:val="clear" w:color="auto" w:fill="FFFFFF"/>
+                      <w:lang w:eastAsia="en-ID"/>
+                    </w:rPr>
+                    <w:t xml:space="preserve"> </w:t>
+                  </w:r>
+                  <w:proofErr w:type="spellStart"/>
+                  <w:r>
+                    <w:rPr>
+                      <w:rFonts w:ascii="Arial Narrow" w:eastAsia="Times New Roman" w:hAnsi="Arial Narrow" w:cs="Fira Code"/>
+                      <w:sz w:val="24"/>
+                      <w:szCs w:val="24"/>
+                      <w:shd w:val="clear" w:color="auto" w:fill="FFFFFF"/>
+                      <w:lang w:eastAsia="en-ID"/>
+                    </w:rPr>
+                    <w:t>kelamin</w:t>
+                  </w:r>
+                  <w:proofErr w:type="spellEnd"/>
                 </w:p>
               </w:tc>
               <w:tc>
@@ -2500,6 +3314,7 @@
                     </w:rPr>
                     <w:t>${</w:t>
                   </w:r>
+                  <w:proofErr w:type="spellStart"/>
                   <w:r>
                     <w:rPr>
                       <w:rFonts w:ascii="Arial Narrow" w:eastAsia="Arial Narrow" w:hAnsi="Arial Narrow"/>
@@ -2520,6 +3335,7 @@
                     </w:rPr>
                     <w:t>Name</w:t>
                   </w:r>
+                  <w:proofErr w:type="spellEnd"/>
                   <w:r>
                     <w:rPr>
                       <w:rFonts w:ascii="Arial Narrow" w:eastAsia="Arial Narrow" w:hAnsi="Arial Narrow"/>
@@ -2578,6 +3394,7 @@
                       <w:lang w:eastAsia="en-ID"/>
                     </w:rPr>
                   </w:pPr>
+                  <w:proofErr w:type="spellStart"/>
                   <w:r>
                     <w:rPr>
                       <w:rFonts w:ascii="Arial Narrow" w:eastAsia="Times New Roman" w:hAnsi="Arial Narrow" w:cs="Fira Code"/>
@@ -2586,8 +3403,53 @@
                       <w:shd w:val="clear" w:color="auto" w:fill="FFFFFF"/>
                       <w:lang w:eastAsia="en-ID"/>
                     </w:rPr>
-                    <w:t>tempat/tanggal lahir</w:t>
-                  </w:r>
+                    <w:t>tempat</w:t>
+                  </w:r>
+                  <w:proofErr w:type="spellEnd"/>
+                  <w:r>
+                    <w:rPr>
+                      <w:rFonts w:ascii="Arial Narrow" w:eastAsia="Times New Roman" w:hAnsi="Arial Narrow" w:cs="Fira Code"/>
+                      <w:sz w:val="24"/>
+                      <w:szCs w:val="24"/>
+                      <w:shd w:val="clear" w:color="auto" w:fill="FFFFFF"/>
+                      <w:lang w:eastAsia="en-ID"/>
+                    </w:rPr>
+                    <w:t>/</w:t>
+                  </w:r>
+                  <w:proofErr w:type="spellStart"/>
+                  <w:r>
+                    <w:rPr>
+                      <w:rFonts w:ascii="Arial Narrow" w:eastAsia="Times New Roman" w:hAnsi="Arial Narrow" w:cs="Fira Code"/>
+                      <w:sz w:val="24"/>
+                      <w:szCs w:val="24"/>
+                      <w:shd w:val="clear" w:color="auto" w:fill="FFFFFF"/>
+                      <w:lang w:eastAsia="en-ID"/>
+                    </w:rPr>
+                    <w:t>tanggal</w:t>
+                  </w:r>
+                  <w:proofErr w:type="spellEnd"/>
+                  <w:r>
+                    <w:rPr>
+                      <w:rFonts w:ascii="Arial Narrow" w:eastAsia="Times New Roman" w:hAnsi="Arial Narrow" w:cs="Fira Code"/>
+                      <w:sz w:val="24"/>
+                      <w:szCs w:val="24"/>
+                      <w:shd w:val="clear" w:color="auto" w:fill="FFFFFF"/>
+                      <w:lang w:eastAsia="en-ID"/>
+                    </w:rPr>
+                    <w:t xml:space="preserve"> </w:t>
+                  </w:r>
+                  <w:proofErr w:type="spellStart"/>
+                  <w:r>
+                    <w:rPr>
+                      <w:rFonts w:ascii="Arial Narrow" w:eastAsia="Times New Roman" w:hAnsi="Arial Narrow" w:cs="Fira Code"/>
+                      <w:sz w:val="24"/>
+                      <w:szCs w:val="24"/>
+                      <w:shd w:val="clear" w:color="auto" w:fill="FFFFFF"/>
+                      <w:lang w:eastAsia="en-ID"/>
+                    </w:rPr>
+                    <w:t>lahir</w:t>
+                  </w:r>
+                  <w:proofErr w:type="spellEnd"/>
                 </w:p>
               </w:tc>
               <w:tc>
@@ -2644,6 +3506,7 @@
                     </w:rPr>
                     <w:t>${</w:t>
                   </w:r>
+                  <w:proofErr w:type="spellStart"/>
                   <w:r>
                     <w:rPr>
                       <w:rFonts w:ascii="Arial Narrow" w:eastAsia="Arial Narrow" w:hAnsi="Arial Narrow"/>
@@ -2654,6 +3517,7 @@
                     </w:rPr>
                     <w:t>suspectBirthPlace</w:t>
                   </w:r>
+                  <w:proofErr w:type="spellEnd"/>
                   <w:r>
                     <w:rPr>
                       <w:rFonts w:ascii="Arial Narrow" w:eastAsia="Arial Narrow" w:hAnsi="Arial Narrow"/>
@@ -2684,6 +3548,7 @@
                     </w:rPr>
                     <w:t>${</w:t>
                   </w:r>
+                  <w:proofErr w:type="spellStart"/>
                   <w:r>
                     <w:rPr>
                       <w:rFonts w:ascii="Arial Narrow" w:eastAsia="Arial Narrow" w:hAnsi="Arial Narrow"/>
@@ -2694,6 +3559,7 @@
                     </w:rPr>
                     <w:t>suspectBirthDate</w:t>
                   </w:r>
+                  <w:proofErr w:type="spellEnd"/>
                   <w:r>
                     <w:rPr>
                       <w:rFonts w:ascii="Arial Narrow" w:eastAsia="Arial Narrow" w:hAnsi="Arial Narrow"/>
@@ -2752,6 +3618,7 @@
                       <w:lang w:eastAsia="en-ID"/>
                     </w:rPr>
                   </w:pPr>
+                  <w:proofErr w:type="spellStart"/>
                   <w:r>
                     <w:rPr>
                       <w:rFonts w:ascii="Arial Narrow" w:eastAsia="Times New Roman" w:hAnsi="Arial Narrow" w:cs="Fira Code"/>
@@ -2762,6 +3629,7 @@
                     </w:rPr>
                     <w:t>pekerjaan</w:t>
                   </w:r>
+                  <w:proofErr w:type="spellEnd"/>
                 </w:p>
               </w:tc>
               <w:tc>
@@ -2818,6 +3686,7 @@
                     </w:rPr>
                     <w:t>${</w:t>
                   </w:r>
+                  <w:proofErr w:type="spellStart"/>
                   <w:r>
                     <w:rPr>
                       <w:rFonts w:ascii="Arial Narrow" w:eastAsia="Arial Narrow" w:hAnsi="Arial Narrow"/>
@@ -2828,6 +3697,7 @@
                     </w:rPr>
                     <w:t>suspectJobName</w:t>
                   </w:r>
+                  <w:proofErr w:type="spellEnd"/>
                   <w:r>
                     <w:rPr>
                       <w:rFonts w:ascii="Arial Narrow" w:eastAsia="Arial Narrow" w:hAnsi="Arial Narrow"/>
@@ -2952,6 +3822,7 @@
                     </w:rPr>
                     <w:t>${</w:t>
                   </w:r>
+                  <w:proofErr w:type="spellStart"/>
                   <w:r>
                     <w:rPr>
                       <w:rFonts w:ascii="Arial Narrow" w:eastAsia="Arial Narrow" w:hAnsi="Arial Narrow"/>
@@ -2962,6 +3833,7 @@
                     </w:rPr>
                     <w:t>suspectReligionName</w:t>
                   </w:r>
+                  <w:proofErr w:type="spellEnd"/>
                   <w:r>
                     <w:rPr>
                       <w:rFonts w:ascii="Arial Narrow" w:eastAsia="Arial Narrow" w:hAnsi="Arial Narrow"/>
@@ -3030,6 +3902,7 @@
                       <w:lang w:eastAsia="en-ID"/>
                     </w:rPr>
                   </w:pPr>
+                  <w:proofErr w:type="spellStart"/>
                   <w:r>
                     <w:rPr>
                       <w:rFonts w:ascii="Arial Narrow" w:eastAsia="Times New Roman" w:hAnsi="Arial Narrow" w:cs="Fira Code"/>
@@ -3040,6 +3913,7 @@
                     </w:rPr>
                     <w:t>alamat</w:t>
                   </w:r>
+                  <w:proofErr w:type="spellEnd"/>
                 </w:p>
               </w:tc>
               <w:tc>
@@ -3099,6 +3973,7 @@
                     </w:rPr>
                     <w:t>${</w:t>
                   </w:r>
+                  <w:proofErr w:type="spellStart"/>
                   <w:r>
                     <w:rPr>
                       <w:rFonts w:ascii="Arial Narrow" w:eastAsia="Arial Narrow" w:hAnsi="Arial Narrow"/>
@@ -3129,6 +4004,7 @@
                     </w:rPr>
                     <w:t>Address</w:t>
                   </w:r>
+                  <w:proofErr w:type="spellEnd"/>
                   <w:r>
                     <w:rPr>
                       <w:rFonts w:ascii="Arial Narrow" w:eastAsia="Arial Narrow" w:hAnsi="Arial Narrow"/>
@@ -3167,13 +4043,301 @@
                 <w:szCs w:val="24"/>
               </w:rPr>
             </w:pPr>
-            <w:r>
-              <w:rPr>
-                <w:rFonts w:ascii="Arial Narrow" w:hAnsi="Arial Narrow" w:cs="Arial"/>
-                <w:sz w:val="24"/>
-                <w:szCs w:val="24"/>
-              </w:rPr>
-              <w:t>Menerangkan bahwa terdapat barang bukti yang ada kaitan langsung/tidak langsung dengan perkara yang sedang dilakukan penyidikan berupa:</w:t>
+            <w:proofErr w:type="spellStart"/>
+            <w:r>
+              <w:rPr>
+                <w:rFonts w:ascii="Arial Narrow" w:hAnsi="Arial Narrow" w:cs="Arial"/>
+                <w:sz w:val="24"/>
+                <w:szCs w:val="24"/>
+              </w:rPr>
+              <w:t>m</w:t>
+            </w:r>
+            <w:r>
+              <w:rPr>
+                <w:rFonts w:ascii="Arial Narrow" w:hAnsi="Arial Narrow" w:cs="Arial"/>
+                <w:sz w:val="24"/>
+                <w:szCs w:val="24"/>
+              </w:rPr>
+              <w:t>enerangkan</w:t>
+            </w:r>
+            <w:proofErr w:type="spellEnd"/>
+            <w:r>
+              <w:rPr>
+                <w:rFonts w:ascii="Arial Narrow" w:hAnsi="Arial Narrow" w:cs="Arial"/>
+                <w:sz w:val="24"/>
+                <w:szCs w:val="24"/>
+              </w:rPr>
+              <w:t xml:space="preserve"> </w:t>
+            </w:r>
+            <w:proofErr w:type="spellStart"/>
+            <w:r>
+              <w:rPr>
+                <w:rFonts w:ascii="Arial Narrow" w:hAnsi="Arial Narrow" w:cs="Arial"/>
+                <w:sz w:val="24"/>
+                <w:szCs w:val="24"/>
+              </w:rPr>
+              <w:t>bahwa</w:t>
+            </w:r>
+            <w:proofErr w:type="spellEnd"/>
+            <w:r>
+              <w:rPr>
+                <w:rFonts w:ascii="Arial Narrow" w:hAnsi="Arial Narrow" w:cs="Arial"/>
+                <w:sz w:val="24"/>
+                <w:szCs w:val="24"/>
+              </w:rPr>
+              <w:t xml:space="preserve"> </w:t>
+            </w:r>
+            <w:proofErr w:type="spellStart"/>
+            <w:r>
+              <w:rPr>
+                <w:rFonts w:ascii="Arial Narrow" w:hAnsi="Arial Narrow" w:cs="Arial"/>
+                <w:sz w:val="24"/>
+                <w:szCs w:val="24"/>
+              </w:rPr>
+              <w:t>terdapat</w:t>
+            </w:r>
+            <w:proofErr w:type="spellEnd"/>
+            <w:r>
+              <w:rPr>
+                <w:rFonts w:ascii="Arial Narrow" w:hAnsi="Arial Narrow" w:cs="Arial"/>
+                <w:sz w:val="24"/>
+                <w:szCs w:val="24"/>
+              </w:rPr>
+              <w:t xml:space="preserve"> </w:t>
+            </w:r>
+            <w:proofErr w:type="spellStart"/>
+            <w:r>
+              <w:rPr>
+                <w:rFonts w:ascii="Arial Narrow" w:hAnsi="Arial Narrow" w:cs="Arial"/>
+                <w:sz w:val="24"/>
+                <w:szCs w:val="24"/>
+              </w:rPr>
+              <w:t>barang</w:t>
+            </w:r>
+            <w:proofErr w:type="spellEnd"/>
+            <w:r>
+              <w:rPr>
+                <w:rFonts w:ascii="Arial Narrow" w:hAnsi="Arial Narrow" w:cs="Arial"/>
+                <w:sz w:val="24"/>
+                <w:szCs w:val="24"/>
+              </w:rPr>
+              <w:t xml:space="preserve"> </w:t>
+            </w:r>
+            <w:proofErr w:type="spellStart"/>
+            <w:r>
+              <w:rPr>
+                <w:rFonts w:ascii="Arial Narrow" w:hAnsi="Arial Narrow" w:cs="Arial"/>
+                <w:sz w:val="24"/>
+                <w:szCs w:val="24"/>
+              </w:rPr>
+              <w:t>bukti</w:t>
+            </w:r>
+            <w:proofErr w:type="spellEnd"/>
+            <w:r>
+              <w:rPr>
+                <w:rFonts w:ascii="Arial Narrow" w:hAnsi="Arial Narrow" w:cs="Arial"/>
+                <w:sz w:val="24"/>
+                <w:szCs w:val="24"/>
+              </w:rPr>
+              <w:t xml:space="preserve"> yang </w:t>
+            </w:r>
+            <w:proofErr w:type="spellStart"/>
+            <w:r>
+              <w:rPr>
+                <w:rFonts w:ascii="Arial Narrow" w:hAnsi="Arial Narrow" w:cs="Arial"/>
+                <w:sz w:val="24"/>
+                <w:szCs w:val="24"/>
+              </w:rPr>
+              <w:t>ada</w:t>
+            </w:r>
+            <w:proofErr w:type="spellEnd"/>
+            <w:r>
+              <w:rPr>
+                <w:rFonts w:ascii="Arial Narrow" w:hAnsi="Arial Narrow" w:cs="Arial"/>
+                <w:sz w:val="24"/>
+                <w:szCs w:val="24"/>
+              </w:rPr>
+              <w:t xml:space="preserve"> </w:t>
+            </w:r>
+            <w:proofErr w:type="spellStart"/>
+            <w:r>
+              <w:rPr>
+                <w:rFonts w:ascii="Arial Narrow" w:hAnsi="Arial Narrow" w:cs="Arial"/>
+                <w:sz w:val="24"/>
+                <w:szCs w:val="24"/>
+              </w:rPr>
+              <w:t>kaitan</w:t>
+            </w:r>
+            <w:proofErr w:type="spellEnd"/>
+            <w:r>
+              <w:rPr>
+                <w:rFonts w:ascii="Arial Narrow" w:hAnsi="Arial Narrow" w:cs="Arial"/>
+                <w:sz w:val="24"/>
+                <w:szCs w:val="24"/>
+              </w:rPr>
+              <w:t xml:space="preserve"> </w:t>
+            </w:r>
+            <w:proofErr w:type="spellStart"/>
+            <w:r>
+              <w:rPr>
+                <w:rFonts w:ascii="Arial Narrow" w:hAnsi="Arial Narrow" w:cs="Arial"/>
+                <w:sz w:val="24"/>
+                <w:szCs w:val="24"/>
+              </w:rPr>
+              <w:t>langsung</w:t>
+            </w:r>
+            <w:proofErr w:type="spellEnd"/>
+            <w:r>
+              <w:rPr>
+                <w:rFonts w:ascii="Arial Narrow" w:hAnsi="Arial Narrow" w:cs="Arial"/>
+                <w:sz w:val="24"/>
+                <w:szCs w:val="24"/>
+              </w:rPr>
+              <w:t>/</w:t>
+            </w:r>
+            <w:proofErr w:type="spellStart"/>
+            <w:r>
+              <w:rPr>
+                <w:rFonts w:ascii="Arial Narrow" w:hAnsi="Arial Narrow" w:cs="Arial"/>
+                <w:sz w:val="24"/>
+                <w:szCs w:val="24"/>
+              </w:rPr>
+              <w:t>tidak</w:t>
+            </w:r>
+            <w:proofErr w:type="spellEnd"/>
+            <w:r>
+              <w:rPr>
+                <w:rFonts w:ascii="Arial Narrow" w:hAnsi="Arial Narrow" w:cs="Arial"/>
+                <w:sz w:val="24"/>
+                <w:szCs w:val="24"/>
+              </w:rPr>
+              <w:t xml:space="preserve"> </w:t>
+            </w:r>
+            <w:proofErr w:type="spellStart"/>
+            <w:r>
+              <w:rPr>
+                <w:rFonts w:ascii="Arial Narrow" w:hAnsi="Arial Narrow" w:cs="Arial"/>
+                <w:sz w:val="24"/>
+                <w:szCs w:val="24"/>
+              </w:rPr>
+              <w:t>langsung</w:t>
+            </w:r>
+            <w:proofErr w:type="spellEnd"/>
+            <w:r>
+              <w:rPr>
+                <w:rFonts w:ascii="Arial Narrow" w:hAnsi="Arial Narrow" w:cs="Arial"/>
+                <w:sz w:val="24"/>
+                <w:szCs w:val="24"/>
+              </w:rPr>
+              <w:t xml:space="preserve"> </w:t>
+            </w:r>
+            <w:proofErr w:type="spellStart"/>
+            <w:r>
+              <w:rPr>
+                <w:rFonts w:ascii="Arial Narrow" w:hAnsi="Arial Narrow" w:cs="Arial"/>
+                <w:sz w:val="24"/>
+                <w:szCs w:val="24"/>
+              </w:rPr>
+              <w:t>dengan</w:t>
+            </w:r>
+            <w:proofErr w:type="spellEnd"/>
+            <w:r>
+              <w:rPr>
+                <w:rFonts w:ascii="Arial Narrow" w:hAnsi="Arial Narrow" w:cs="Arial"/>
+                <w:sz w:val="24"/>
+                <w:szCs w:val="24"/>
+              </w:rPr>
+              <w:t xml:space="preserve"> </w:t>
+            </w:r>
+            <w:proofErr w:type="spellStart"/>
+            <w:r>
+              <w:rPr>
+                <w:rFonts w:ascii="Arial Narrow" w:hAnsi="Arial Narrow" w:cs="Arial"/>
+                <w:sz w:val="24"/>
+                <w:szCs w:val="24"/>
+              </w:rPr>
+              <w:t>perkara</w:t>
+            </w:r>
+            <w:proofErr w:type="spellEnd"/>
+            <w:r>
+              <w:rPr>
+                <w:rFonts w:ascii="Arial Narrow" w:hAnsi="Arial Narrow" w:cs="Arial"/>
+                <w:sz w:val="24"/>
+                <w:szCs w:val="24"/>
+              </w:rPr>
+              <w:t xml:space="preserve"> yang </w:t>
+            </w:r>
+            <w:proofErr w:type="spellStart"/>
+            <w:r>
+              <w:rPr>
+                <w:rFonts w:ascii="Arial Narrow" w:hAnsi="Arial Narrow" w:cs="Arial"/>
+                <w:sz w:val="24"/>
+                <w:szCs w:val="24"/>
+              </w:rPr>
+              <w:t>sedang</w:t>
+            </w:r>
+            <w:proofErr w:type="spellEnd"/>
+            <w:r>
+              <w:rPr>
+                <w:rFonts w:ascii="Arial Narrow" w:hAnsi="Arial Narrow" w:cs="Arial"/>
+                <w:sz w:val="24"/>
+                <w:szCs w:val="24"/>
+              </w:rPr>
+              <w:t xml:space="preserve"> </w:t>
+            </w:r>
+            <w:proofErr w:type="spellStart"/>
+            <w:r>
+              <w:rPr>
+                <w:rFonts w:ascii="Arial Narrow" w:hAnsi="Arial Narrow" w:cs="Arial"/>
+                <w:sz w:val="24"/>
+                <w:szCs w:val="24"/>
+              </w:rPr>
+              <w:t>dilakukan</w:t>
+            </w:r>
+            <w:proofErr w:type="spellEnd"/>
+            <w:r>
+              <w:rPr>
+                <w:rFonts w:ascii="Arial Narrow" w:hAnsi="Arial Narrow" w:cs="Arial"/>
+                <w:sz w:val="24"/>
+                <w:szCs w:val="24"/>
+              </w:rPr>
+              <w:t xml:space="preserve"> </w:t>
+            </w:r>
+            <w:proofErr w:type="spellStart"/>
+            <w:r>
+              <w:rPr>
+                <w:rFonts w:ascii="Arial Narrow" w:hAnsi="Arial Narrow" w:cs="Arial"/>
+                <w:sz w:val="24"/>
+                <w:szCs w:val="24"/>
+              </w:rPr>
+              <w:t>penyidikan</w:t>
+            </w:r>
+            <w:proofErr w:type="spellEnd"/>
+            <w:r>
+              <w:rPr>
+                <w:rFonts w:ascii="Arial Narrow" w:hAnsi="Arial Narrow" w:cs="Arial"/>
+                <w:sz w:val="24"/>
+                <w:szCs w:val="24"/>
+              </w:rPr>
+              <w:t xml:space="preserve"> </w:t>
+            </w:r>
+            <w:proofErr w:type="spellStart"/>
+            <w:r>
+              <w:rPr>
+                <w:rFonts w:ascii="Arial Narrow" w:hAnsi="Arial Narrow" w:cs="Arial"/>
+                <w:sz w:val="24"/>
+                <w:szCs w:val="24"/>
+              </w:rPr>
+              <w:t>berupa</w:t>
+            </w:r>
+            <w:proofErr w:type="spellEnd"/>
+            <w:r>
+              <w:rPr>
+                <w:rFonts w:ascii="Arial Narrow" w:hAnsi="Arial Narrow" w:cs="Arial"/>
+                <w:sz w:val="24"/>
+                <w:szCs w:val="24"/>
+              </w:rPr>
+              <w:t>:</w:t>
             </w:r>
           </w:p>
         </w:tc>
@@ -3220,7 +4384,16 @@
                 <w:sz w:val="24"/>
                 <w:szCs w:val="24"/>
               </w:rPr>
-              <w:t>${seized</w:t>
+              <w:t>${</w:t>
+            </w:r>
+            <w:proofErr w:type="spellStart"/>
+            <w:r>
+              <w:rPr>
+                <w:rFonts w:ascii="Arial Narrow" w:hAnsi="Arial Narrow" w:cs="Arial"/>
+                <w:sz w:val="24"/>
+                <w:szCs w:val="24"/>
+              </w:rPr>
+              <w:t>seized</w:t>
             </w:r>
             <w:r>
               <w:rPr>
@@ -3236,7 +4409,16 @@
                 <w:sz w:val="24"/>
                 <w:szCs w:val="24"/>
               </w:rPr>
-              <w:t>teration}</w:t>
+              <w:t>teration</w:t>
+            </w:r>
+            <w:proofErr w:type="spellEnd"/>
+            <w:r>
+              <w:rPr>
+                <w:rFonts w:ascii="Arial Narrow" w:hAnsi="Arial Narrow" w:cs="Arial"/>
+                <w:sz w:val="24"/>
+                <w:szCs w:val="24"/>
+              </w:rPr>
+              <w:t>}</w:t>
             </w:r>
           </w:p>
         </w:tc>
@@ -3262,6 +4444,7 @@
               </w:rPr>
               <w:t>${</w:t>
             </w:r>
+            <w:proofErr w:type="spellStart"/>
             <w:r>
               <w:rPr>
                 <w:rFonts w:ascii="Arial Narrow" w:hAnsi="Arial Narrow" w:cs="Arial"/>
@@ -3284,7 +4467,16 @@
                 <w:sz w:val="24"/>
                 <w:szCs w:val="24"/>
               </w:rPr>
-              <w:t>ems}</w:t>
+              <w:t>ems</w:t>
+            </w:r>
+            <w:proofErr w:type="spellEnd"/>
+            <w:r>
+              <w:rPr>
+                <w:rFonts w:ascii="Arial Narrow" w:hAnsi="Arial Narrow" w:cs="Arial"/>
+                <w:sz w:val="24"/>
+                <w:szCs w:val="24"/>
+              </w:rPr>
+              <w:t>}</w:t>
             </w:r>
           </w:p>
         </w:tc>
@@ -3385,33 +4577,87 @@
                 <w:lang w:eastAsia="en-ID"/>
               </w:rPr>
             </w:pPr>
-            <w:r>
-              <w:rPr>
-                <w:rFonts w:ascii="Arial Narrow" w:hAnsi="Arial Narrow" w:cs="Arial"/>
-                <w:color w:val="000000"/>
-                <w:sz w:val="24"/>
-                <w:szCs w:val="24"/>
-              </w:rPr>
-              <w:t xml:space="preserve">Berkaitan </w:t>
-            </w:r>
-            <w:r>
-              <w:rPr>
-                <w:rFonts w:ascii="Arial Narrow" w:hAnsi="Arial Narrow" w:cs="Arial"/>
-                <w:color w:val="000000"/>
-                <w:sz w:val="24"/>
-                <w:szCs w:val="24"/>
-              </w:rPr>
-              <w:t>dengan hal</w:t>
-            </w:r>
-            <w:r>
-              <w:rPr>
-                <w:rFonts w:ascii="Arial Narrow" w:hAnsi="Arial Narrow" w:cs="Arial"/>
-                <w:color w:val="000000"/>
-                <w:sz w:val="24"/>
-                <w:szCs w:val="24"/>
-              </w:rPr>
-              <w:t xml:space="preserve"> tersebut, </w:t>
-            </w:r>
+            <w:proofErr w:type="spellStart"/>
+            <w:r>
+              <w:rPr>
+                <w:rFonts w:ascii="Arial Narrow" w:hAnsi="Arial Narrow" w:cs="Arial"/>
+                <w:color w:val="000000"/>
+                <w:sz w:val="24"/>
+                <w:szCs w:val="24"/>
+              </w:rPr>
+              <w:t>Berkaitan</w:t>
+            </w:r>
+            <w:proofErr w:type="spellEnd"/>
+            <w:r>
+              <w:rPr>
+                <w:rFonts w:ascii="Arial Narrow" w:hAnsi="Arial Narrow" w:cs="Arial"/>
+                <w:color w:val="000000"/>
+                <w:sz w:val="24"/>
+                <w:szCs w:val="24"/>
+              </w:rPr>
+              <w:t xml:space="preserve"> </w:t>
+            </w:r>
+            <w:proofErr w:type="spellStart"/>
+            <w:r>
+              <w:rPr>
+                <w:rFonts w:ascii="Arial Narrow" w:hAnsi="Arial Narrow" w:cs="Arial"/>
+                <w:color w:val="000000"/>
+                <w:sz w:val="24"/>
+                <w:szCs w:val="24"/>
+              </w:rPr>
+              <w:t>dengan</w:t>
+            </w:r>
+            <w:proofErr w:type="spellEnd"/>
+            <w:r>
+              <w:rPr>
+                <w:rFonts w:ascii="Arial Narrow" w:hAnsi="Arial Narrow" w:cs="Arial"/>
+                <w:color w:val="000000"/>
+                <w:sz w:val="24"/>
+                <w:szCs w:val="24"/>
+              </w:rPr>
+              <w:t xml:space="preserve"> </w:t>
+            </w:r>
+            <w:proofErr w:type="spellStart"/>
+            <w:r>
+              <w:rPr>
+                <w:rFonts w:ascii="Arial Narrow" w:hAnsi="Arial Narrow" w:cs="Arial"/>
+                <w:color w:val="000000"/>
+                <w:sz w:val="24"/>
+                <w:szCs w:val="24"/>
+              </w:rPr>
+              <w:t>hal</w:t>
+            </w:r>
+            <w:proofErr w:type="spellEnd"/>
+            <w:r>
+              <w:rPr>
+                <w:rFonts w:ascii="Arial Narrow" w:hAnsi="Arial Narrow" w:cs="Arial"/>
+                <w:color w:val="000000"/>
+                <w:sz w:val="24"/>
+                <w:szCs w:val="24"/>
+              </w:rPr>
+              <w:t xml:space="preserve"> </w:t>
+            </w:r>
+            <w:proofErr w:type="spellStart"/>
+            <w:r>
+              <w:rPr>
+                <w:rFonts w:ascii="Arial Narrow" w:hAnsi="Arial Narrow" w:cs="Arial"/>
+                <w:color w:val="000000"/>
+                <w:sz w:val="24"/>
+                <w:szCs w:val="24"/>
+              </w:rPr>
+              <w:t>tersebut</w:t>
+            </w:r>
+            <w:proofErr w:type="spellEnd"/>
+            <w:r>
+              <w:rPr>
+                <w:rFonts w:ascii="Arial Narrow" w:hAnsi="Arial Narrow" w:cs="Arial"/>
+                <w:color w:val="000000"/>
+                <w:sz w:val="24"/>
+                <w:szCs w:val="24"/>
+              </w:rPr>
+              <w:t xml:space="preserve">, </w:t>
+            </w:r>
+            <w:proofErr w:type="spellStart"/>
             <w:r>
               <w:rPr>
                 <w:rFonts w:ascii="Arial Narrow" w:hAnsi="Arial Narrow" w:cs="Arial"/>
@@ -3428,8 +4674,259 @@
                 <w:sz w:val="24"/>
                 <w:szCs w:val="24"/>
               </w:rPr>
-              <w:t xml:space="preserve">ersama ini diajukan kepada Ketua permohonan izin penyitaan terhadap benda yang berhubungan langsung dengan </w:t>
-            </w:r>
+              <w:t>ersama</w:t>
+            </w:r>
+            <w:proofErr w:type="spellEnd"/>
+            <w:r>
+              <w:rPr>
+                <w:rFonts w:ascii="Arial Narrow" w:hAnsi="Arial Narrow" w:cs="Arial"/>
+                <w:color w:val="000000"/>
+                <w:sz w:val="24"/>
+                <w:szCs w:val="24"/>
+              </w:rPr>
+              <w:t xml:space="preserve"> </w:t>
+            </w:r>
+            <w:proofErr w:type="spellStart"/>
+            <w:r>
+              <w:rPr>
+                <w:rFonts w:ascii="Arial Narrow" w:hAnsi="Arial Narrow" w:cs="Arial"/>
+                <w:color w:val="000000"/>
+                <w:sz w:val="24"/>
+                <w:szCs w:val="24"/>
+              </w:rPr>
+              <w:t>ini</w:t>
+            </w:r>
+            <w:proofErr w:type="spellEnd"/>
+            <w:r>
+              <w:rPr>
+                <w:rFonts w:ascii="Arial Narrow" w:hAnsi="Arial Narrow" w:cs="Arial"/>
+                <w:color w:val="000000"/>
+                <w:sz w:val="24"/>
+                <w:szCs w:val="24"/>
+              </w:rPr>
+              <w:t xml:space="preserve"> </w:t>
+            </w:r>
+            <w:proofErr w:type="spellStart"/>
+            <w:r>
+              <w:rPr>
+                <w:rFonts w:ascii="Arial Narrow" w:hAnsi="Arial Narrow" w:cs="Arial"/>
+                <w:color w:val="000000"/>
+                <w:sz w:val="24"/>
+                <w:szCs w:val="24"/>
+              </w:rPr>
+              <w:t>diajukan</w:t>
+            </w:r>
+            <w:proofErr w:type="spellEnd"/>
+            <w:r>
+              <w:rPr>
+                <w:rFonts w:ascii="Arial Narrow" w:hAnsi="Arial Narrow" w:cs="Arial"/>
+                <w:color w:val="000000"/>
+                <w:sz w:val="24"/>
+                <w:szCs w:val="24"/>
+              </w:rPr>
+              <w:t xml:space="preserve"> </w:t>
+            </w:r>
+            <w:proofErr w:type="spellStart"/>
+            <w:r>
+              <w:rPr>
+                <w:rFonts w:ascii="Arial Narrow" w:hAnsi="Arial Narrow" w:cs="Arial"/>
+                <w:color w:val="000000"/>
+                <w:sz w:val="24"/>
+                <w:szCs w:val="24"/>
+              </w:rPr>
+              <w:t>kepada</w:t>
+            </w:r>
+            <w:proofErr w:type="spellEnd"/>
+            <w:r>
+              <w:rPr>
+                <w:rFonts w:ascii="Arial Narrow" w:hAnsi="Arial Narrow" w:cs="Arial"/>
+                <w:color w:val="000000"/>
+                <w:sz w:val="24"/>
+                <w:szCs w:val="24"/>
+              </w:rPr>
+              <w:t xml:space="preserve"> </w:t>
+            </w:r>
+            <w:proofErr w:type="spellStart"/>
+            <w:r>
+              <w:rPr>
+                <w:rFonts w:ascii="Arial Narrow" w:hAnsi="Arial Narrow" w:cs="Arial"/>
+                <w:color w:val="000000"/>
+                <w:sz w:val="24"/>
+                <w:szCs w:val="24"/>
+              </w:rPr>
+              <w:t>Ketua</w:t>
+            </w:r>
+            <w:proofErr w:type="spellEnd"/>
+            <w:r>
+              <w:rPr>
+                <w:rFonts w:ascii="Arial Narrow" w:hAnsi="Arial Narrow" w:cs="Arial"/>
+                <w:color w:val="000000"/>
+                <w:sz w:val="24"/>
+                <w:szCs w:val="24"/>
+              </w:rPr>
+              <w:t xml:space="preserve"> </w:t>
+            </w:r>
+            <w:proofErr w:type="spellStart"/>
+            <w:r>
+              <w:rPr>
+                <w:rFonts w:ascii="Arial Narrow" w:hAnsi="Arial Narrow" w:cs="Arial"/>
+                <w:color w:val="000000"/>
+                <w:sz w:val="24"/>
+                <w:szCs w:val="24"/>
+              </w:rPr>
+              <w:t>permohonan</w:t>
+            </w:r>
+            <w:proofErr w:type="spellEnd"/>
+            <w:r>
+              <w:rPr>
+                <w:rFonts w:ascii="Arial Narrow" w:hAnsi="Arial Narrow" w:cs="Arial"/>
+                <w:color w:val="000000"/>
+                <w:sz w:val="24"/>
+                <w:szCs w:val="24"/>
+              </w:rPr>
+              <w:t xml:space="preserve"> </w:t>
+            </w:r>
+            <w:proofErr w:type="spellStart"/>
+            <w:r>
+              <w:rPr>
+                <w:rFonts w:ascii="Arial Narrow" w:hAnsi="Arial Narrow" w:cs="Arial"/>
+                <w:color w:val="000000"/>
+                <w:sz w:val="24"/>
+                <w:szCs w:val="24"/>
+              </w:rPr>
+              <w:t>izin</w:t>
+            </w:r>
+            <w:proofErr w:type="spellEnd"/>
+            <w:r>
+              <w:rPr>
+                <w:rFonts w:ascii="Arial Narrow" w:hAnsi="Arial Narrow" w:cs="Arial"/>
+                <w:color w:val="000000"/>
+                <w:sz w:val="24"/>
+                <w:szCs w:val="24"/>
+              </w:rPr>
+              <w:t xml:space="preserve"> </w:t>
+            </w:r>
+            <w:proofErr w:type="spellStart"/>
+            <w:r>
+              <w:rPr>
+                <w:rFonts w:ascii="Arial Narrow" w:hAnsi="Arial Narrow" w:cs="Arial"/>
+                <w:color w:val="000000"/>
+                <w:sz w:val="24"/>
+                <w:szCs w:val="24"/>
+              </w:rPr>
+              <w:t>penyitaan</w:t>
+            </w:r>
+            <w:proofErr w:type="spellEnd"/>
+            <w:r>
+              <w:rPr>
+                <w:rFonts w:ascii="Arial Narrow" w:hAnsi="Arial Narrow" w:cs="Arial"/>
+                <w:color w:val="000000"/>
+                <w:sz w:val="24"/>
+                <w:szCs w:val="24"/>
+              </w:rPr>
+              <w:t xml:space="preserve"> </w:t>
+            </w:r>
+            <w:proofErr w:type="spellStart"/>
+            <w:r>
+              <w:rPr>
+                <w:rFonts w:ascii="Arial Narrow" w:hAnsi="Arial Narrow" w:cs="Arial"/>
+                <w:color w:val="000000"/>
+                <w:sz w:val="24"/>
+                <w:szCs w:val="24"/>
+              </w:rPr>
+              <w:t>terhadap</w:t>
+            </w:r>
+            <w:proofErr w:type="spellEnd"/>
+            <w:r>
+              <w:rPr>
+                <w:rFonts w:ascii="Arial Narrow" w:hAnsi="Arial Narrow" w:cs="Arial"/>
+                <w:color w:val="000000"/>
+                <w:sz w:val="24"/>
+                <w:szCs w:val="24"/>
+              </w:rPr>
+              <w:t xml:space="preserve"> </w:t>
+            </w:r>
+            <w:proofErr w:type="spellStart"/>
+            <w:r>
+              <w:rPr>
+                <w:rFonts w:ascii="Arial Narrow" w:hAnsi="Arial Narrow" w:cs="Arial"/>
+                <w:color w:val="000000"/>
+                <w:sz w:val="24"/>
+                <w:szCs w:val="24"/>
+              </w:rPr>
+              <w:t>benda</w:t>
+            </w:r>
+            <w:proofErr w:type="spellEnd"/>
+            <w:r>
+              <w:rPr>
+                <w:rFonts w:ascii="Arial Narrow" w:hAnsi="Arial Narrow" w:cs="Arial"/>
+                <w:color w:val="000000"/>
+                <w:sz w:val="24"/>
+                <w:szCs w:val="24"/>
+              </w:rPr>
+              <w:t xml:space="preserve"> yang </w:t>
+            </w:r>
+            <w:proofErr w:type="spellStart"/>
+            <w:r>
+              <w:rPr>
+                <w:rFonts w:ascii="Arial Narrow" w:hAnsi="Arial Narrow" w:cs="Arial"/>
+                <w:color w:val="000000"/>
+                <w:sz w:val="24"/>
+                <w:szCs w:val="24"/>
+              </w:rPr>
+              <w:t>berhubungan</w:t>
+            </w:r>
+            <w:proofErr w:type="spellEnd"/>
+            <w:r>
+              <w:rPr>
+                <w:rFonts w:ascii="Arial Narrow" w:hAnsi="Arial Narrow" w:cs="Arial"/>
+                <w:color w:val="000000"/>
+                <w:sz w:val="24"/>
+                <w:szCs w:val="24"/>
+              </w:rPr>
+              <w:t xml:space="preserve"> </w:t>
+            </w:r>
+            <w:proofErr w:type="spellStart"/>
+            <w:r>
+              <w:rPr>
+                <w:rFonts w:ascii="Arial Narrow" w:hAnsi="Arial Narrow" w:cs="Arial"/>
+                <w:color w:val="000000"/>
+                <w:sz w:val="24"/>
+                <w:szCs w:val="24"/>
+              </w:rPr>
+              <w:t>langsung</w:t>
+            </w:r>
+            <w:proofErr w:type="spellEnd"/>
+            <w:r>
+              <w:rPr>
+                <w:rFonts w:ascii="Arial Narrow" w:hAnsi="Arial Narrow" w:cs="Arial"/>
+                <w:color w:val="000000"/>
+                <w:sz w:val="24"/>
+                <w:szCs w:val="24"/>
+              </w:rPr>
+              <w:t xml:space="preserve"> </w:t>
+            </w:r>
+            <w:proofErr w:type="spellStart"/>
+            <w:r>
+              <w:rPr>
+                <w:rFonts w:ascii="Arial Narrow" w:hAnsi="Arial Narrow" w:cs="Arial"/>
+                <w:color w:val="000000"/>
+                <w:sz w:val="24"/>
+                <w:szCs w:val="24"/>
+              </w:rPr>
+              <w:t>dengan</w:t>
+            </w:r>
+            <w:proofErr w:type="spellEnd"/>
+            <w:r>
+              <w:rPr>
+                <w:rFonts w:ascii="Arial Narrow" w:hAnsi="Arial Narrow" w:cs="Arial"/>
+                <w:color w:val="000000"/>
+                <w:sz w:val="24"/>
+                <w:szCs w:val="24"/>
+              </w:rPr>
+              <w:t xml:space="preserve"> </w:t>
+            </w:r>
+            <w:proofErr w:type="spellStart"/>
             <w:r>
               <w:rPr>
                 <w:rFonts w:ascii="Arial Narrow" w:hAnsi="Arial Narrow" w:cs="Arial"/>
@@ -3446,8 +4943,19 @@
                 <w:sz w:val="24"/>
                 <w:szCs w:val="24"/>
               </w:rPr>
-              <w:t xml:space="preserve">indak </w:t>
-            </w:r>
+              <w:t>indak</w:t>
+            </w:r>
+            <w:proofErr w:type="spellEnd"/>
+            <w:r>
+              <w:rPr>
+                <w:rFonts w:ascii="Arial Narrow" w:hAnsi="Arial Narrow" w:cs="Arial"/>
+                <w:color w:val="000000"/>
+                <w:sz w:val="24"/>
+                <w:szCs w:val="24"/>
+              </w:rPr>
+              <w:t xml:space="preserve"> </w:t>
+            </w:r>
+            <w:proofErr w:type="spellStart"/>
             <w:r>
               <w:rPr>
                 <w:rFonts w:ascii="Arial Narrow" w:hAnsi="Arial Narrow" w:cs="Arial"/>
@@ -3464,52 +4972,426 @@
                 <w:sz w:val="24"/>
                 <w:szCs w:val="24"/>
               </w:rPr>
-              <w:t>idana yang sedang dilakukan penyidikan, sebagaimana kelengkapan administrasi izin penyitaan terlampir</w:t>
-            </w:r>
-            <w:r>
-              <w:rPr>
-                <w:rFonts w:ascii="Arial Narrow" w:hAnsi="Arial Narrow" w:cs="Arial"/>
-                <w:color w:val="000000"/>
-                <w:sz w:val="24"/>
-                <w:szCs w:val="24"/>
-              </w:rPr>
-              <w:t>. Untuk</w:t>
-            </w:r>
-            <w:r>
-              <w:rPr>
-                <w:rFonts w:ascii="Arial Narrow" w:hAnsi="Arial Narrow" w:cs="Arial"/>
-                <w:color w:val="000000"/>
-                <w:sz w:val="24"/>
-                <w:szCs w:val="24"/>
-              </w:rPr>
-              <w:t xml:space="preserve"> memudahkan berkomunikasi </w:t>
-            </w:r>
-            <w:r>
-              <w:rPr>
-                <w:rFonts w:ascii="Arial Narrow" w:hAnsi="Arial Narrow" w:cs="Arial"/>
-                <w:color w:val="000000"/>
-                <w:sz w:val="24"/>
-                <w:szCs w:val="24"/>
-              </w:rPr>
-              <w:t xml:space="preserve">dan berkoordinasi </w:t>
-            </w:r>
-            <w:r>
-              <w:rPr>
-                <w:rFonts w:ascii="Arial Narrow" w:hAnsi="Arial Narrow" w:cs="Arial"/>
-                <w:color w:val="000000"/>
-                <w:sz w:val="24"/>
-                <w:szCs w:val="24"/>
-              </w:rPr>
-              <w:t xml:space="preserve">dapat menghubungi </w:t>
-            </w:r>
-            <w:r>
-              <w:rPr>
-                <w:rFonts w:ascii="Arial Narrow" w:hAnsi="Arial Narrow" w:cs="Arial"/>
-                <w:color w:val="000000"/>
-                <w:sz w:val="24"/>
-                <w:szCs w:val="24"/>
-              </w:rPr>
-              <w:t xml:space="preserve">penyidik atas nama ${investigatorName} dengan nomor </w:t>
+              <w:t>idana</w:t>
+            </w:r>
+            <w:proofErr w:type="spellEnd"/>
+            <w:r>
+              <w:rPr>
+                <w:rFonts w:ascii="Arial Narrow" w:hAnsi="Arial Narrow" w:cs="Arial"/>
+                <w:color w:val="000000"/>
+                <w:sz w:val="24"/>
+                <w:szCs w:val="24"/>
+              </w:rPr>
+              <w:t xml:space="preserve"> yang </w:t>
+            </w:r>
+            <w:proofErr w:type="spellStart"/>
+            <w:r>
+              <w:rPr>
+                <w:rFonts w:ascii="Arial Narrow" w:hAnsi="Arial Narrow" w:cs="Arial"/>
+                <w:color w:val="000000"/>
+                <w:sz w:val="24"/>
+                <w:szCs w:val="24"/>
+              </w:rPr>
+              <w:t>sedang</w:t>
+            </w:r>
+            <w:proofErr w:type="spellEnd"/>
+            <w:r>
+              <w:rPr>
+                <w:rFonts w:ascii="Arial Narrow" w:hAnsi="Arial Narrow" w:cs="Arial"/>
+                <w:color w:val="000000"/>
+                <w:sz w:val="24"/>
+                <w:szCs w:val="24"/>
+              </w:rPr>
+              <w:t xml:space="preserve"> </w:t>
+            </w:r>
+            <w:proofErr w:type="spellStart"/>
+            <w:r>
+              <w:rPr>
+                <w:rFonts w:ascii="Arial Narrow" w:hAnsi="Arial Narrow" w:cs="Arial"/>
+                <w:color w:val="000000"/>
+                <w:sz w:val="24"/>
+                <w:szCs w:val="24"/>
+              </w:rPr>
+              <w:t>dilakukan</w:t>
+            </w:r>
+            <w:proofErr w:type="spellEnd"/>
+            <w:r>
+              <w:rPr>
+                <w:rFonts w:ascii="Arial Narrow" w:hAnsi="Arial Narrow" w:cs="Arial"/>
+                <w:color w:val="000000"/>
+                <w:sz w:val="24"/>
+                <w:szCs w:val="24"/>
+              </w:rPr>
+              <w:t xml:space="preserve"> </w:t>
+            </w:r>
+            <w:proofErr w:type="spellStart"/>
+            <w:r>
+              <w:rPr>
+                <w:rFonts w:ascii="Arial Narrow" w:hAnsi="Arial Narrow" w:cs="Arial"/>
+                <w:color w:val="000000"/>
+                <w:sz w:val="24"/>
+                <w:szCs w:val="24"/>
+              </w:rPr>
+              <w:t>penyidikan</w:t>
+            </w:r>
+            <w:proofErr w:type="spellEnd"/>
+            <w:r>
+              <w:rPr>
+                <w:rFonts w:ascii="Arial Narrow" w:hAnsi="Arial Narrow" w:cs="Arial"/>
+                <w:color w:val="000000"/>
+                <w:sz w:val="24"/>
+                <w:szCs w:val="24"/>
+              </w:rPr>
+              <w:t xml:space="preserve">, </w:t>
+            </w:r>
+            <w:proofErr w:type="spellStart"/>
+            <w:r>
+              <w:rPr>
+                <w:rFonts w:ascii="Arial Narrow" w:hAnsi="Arial Narrow" w:cs="Arial"/>
+                <w:color w:val="000000"/>
+                <w:sz w:val="24"/>
+                <w:szCs w:val="24"/>
+              </w:rPr>
+              <w:t>sebagaimana</w:t>
+            </w:r>
+            <w:proofErr w:type="spellEnd"/>
+            <w:r>
+              <w:rPr>
+                <w:rFonts w:ascii="Arial Narrow" w:hAnsi="Arial Narrow" w:cs="Arial"/>
+                <w:color w:val="000000"/>
+                <w:sz w:val="24"/>
+                <w:szCs w:val="24"/>
+              </w:rPr>
+              <w:t xml:space="preserve"> </w:t>
+            </w:r>
+            <w:proofErr w:type="spellStart"/>
+            <w:r>
+              <w:rPr>
+                <w:rFonts w:ascii="Arial Narrow" w:hAnsi="Arial Narrow" w:cs="Arial"/>
+                <w:color w:val="000000"/>
+                <w:sz w:val="24"/>
+                <w:szCs w:val="24"/>
+              </w:rPr>
+              <w:t>kelengkapan</w:t>
+            </w:r>
+            <w:proofErr w:type="spellEnd"/>
+            <w:r>
+              <w:rPr>
+                <w:rFonts w:ascii="Arial Narrow" w:hAnsi="Arial Narrow" w:cs="Arial"/>
+                <w:color w:val="000000"/>
+                <w:sz w:val="24"/>
+                <w:szCs w:val="24"/>
+              </w:rPr>
+              <w:t xml:space="preserve"> </w:t>
+            </w:r>
+            <w:proofErr w:type="spellStart"/>
+            <w:r>
+              <w:rPr>
+                <w:rFonts w:ascii="Arial Narrow" w:hAnsi="Arial Narrow" w:cs="Arial"/>
+                <w:color w:val="000000"/>
+                <w:sz w:val="24"/>
+                <w:szCs w:val="24"/>
+              </w:rPr>
+              <w:t>administrasi</w:t>
+            </w:r>
+            <w:proofErr w:type="spellEnd"/>
+            <w:r>
+              <w:rPr>
+                <w:rFonts w:ascii="Arial Narrow" w:hAnsi="Arial Narrow" w:cs="Arial"/>
+                <w:color w:val="000000"/>
+                <w:sz w:val="24"/>
+                <w:szCs w:val="24"/>
+              </w:rPr>
+              <w:t xml:space="preserve"> </w:t>
+            </w:r>
+            <w:proofErr w:type="spellStart"/>
+            <w:r>
+              <w:rPr>
+                <w:rFonts w:ascii="Arial Narrow" w:hAnsi="Arial Narrow" w:cs="Arial"/>
+                <w:color w:val="000000"/>
+                <w:sz w:val="24"/>
+                <w:szCs w:val="24"/>
+              </w:rPr>
+              <w:t>izin</w:t>
+            </w:r>
+            <w:proofErr w:type="spellEnd"/>
+            <w:r>
+              <w:rPr>
+                <w:rFonts w:ascii="Arial Narrow" w:hAnsi="Arial Narrow" w:cs="Arial"/>
+                <w:color w:val="000000"/>
+                <w:sz w:val="24"/>
+                <w:szCs w:val="24"/>
+              </w:rPr>
+              <w:t xml:space="preserve"> </w:t>
+            </w:r>
+            <w:proofErr w:type="spellStart"/>
+            <w:r>
+              <w:rPr>
+                <w:rFonts w:ascii="Arial Narrow" w:hAnsi="Arial Narrow" w:cs="Arial"/>
+                <w:color w:val="000000"/>
+                <w:sz w:val="24"/>
+                <w:szCs w:val="24"/>
+              </w:rPr>
+              <w:t>penyitaan</w:t>
+            </w:r>
+            <w:proofErr w:type="spellEnd"/>
+            <w:r>
+              <w:rPr>
+                <w:rFonts w:ascii="Arial Narrow" w:hAnsi="Arial Narrow" w:cs="Arial"/>
+                <w:color w:val="000000"/>
+                <w:sz w:val="24"/>
+                <w:szCs w:val="24"/>
+              </w:rPr>
+              <w:t xml:space="preserve"> </w:t>
+            </w:r>
+            <w:proofErr w:type="spellStart"/>
+            <w:r>
+              <w:rPr>
+                <w:rFonts w:ascii="Arial Narrow" w:hAnsi="Arial Narrow" w:cs="Arial"/>
+                <w:color w:val="000000"/>
+                <w:sz w:val="24"/>
+                <w:szCs w:val="24"/>
+              </w:rPr>
+              <w:t>terlampir</w:t>
+            </w:r>
+            <w:proofErr w:type="spellEnd"/>
+            <w:r>
+              <w:rPr>
+                <w:rFonts w:ascii="Arial Narrow" w:hAnsi="Arial Narrow" w:cs="Arial"/>
+                <w:color w:val="000000"/>
+                <w:sz w:val="24"/>
+                <w:szCs w:val="24"/>
+              </w:rPr>
+              <w:t xml:space="preserve">. </w:t>
+            </w:r>
+            <w:proofErr w:type="spellStart"/>
+            <w:r>
+              <w:rPr>
+                <w:rFonts w:ascii="Arial Narrow" w:hAnsi="Arial Narrow" w:cs="Arial"/>
+                <w:color w:val="000000"/>
+                <w:sz w:val="24"/>
+                <w:szCs w:val="24"/>
+              </w:rPr>
+              <w:t>Untuk</w:t>
+            </w:r>
+            <w:proofErr w:type="spellEnd"/>
+            <w:r>
+              <w:rPr>
+                <w:rFonts w:ascii="Arial Narrow" w:hAnsi="Arial Narrow" w:cs="Arial"/>
+                <w:color w:val="000000"/>
+                <w:sz w:val="24"/>
+                <w:szCs w:val="24"/>
+              </w:rPr>
+              <w:t xml:space="preserve"> </w:t>
+            </w:r>
+            <w:proofErr w:type="spellStart"/>
+            <w:r>
+              <w:rPr>
+                <w:rFonts w:ascii="Arial Narrow" w:hAnsi="Arial Narrow" w:cs="Arial"/>
+                <w:color w:val="000000"/>
+                <w:sz w:val="24"/>
+                <w:szCs w:val="24"/>
+              </w:rPr>
+              <w:t>memudahkan</w:t>
+            </w:r>
+            <w:proofErr w:type="spellEnd"/>
+            <w:r>
+              <w:rPr>
+                <w:rFonts w:ascii="Arial Narrow" w:hAnsi="Arial Narrow" w:cs="Arial"/>
+                <w:color w:val="000000"/>
+                <w:sz w:val="24"/>
+                <w:szCs w:val="24"/>
+              </w:rPr>
+              <w:t xml:space="preserve"> </w:t>
+            </w:r>
+            <w:proofErr w:type="spellStart"/>
+            <w:r>
+              <w:rPr>
+                <w:rFonts w:ascii="Arial Narrow" w:hAnsi="Arial Narrow" w:cs="Arial"/>
+                <w:color w:val="000000"/>
+                <w:sz w:val="24"/>
+                <w:szCs w:val="24"/>
+              </w:rPr>
+              <w:t>berkomunikasi</w:t>
+            </w:r>
+            <w:proofErr w:type="spellEnd"/>
+            <w:r>
+              <w:rPr>
+                <w:rFonts w:ascii="Arial Narrow" w:hAnsi="Arial Narrow" w:cs="Arial"/>
+                <w:color w:val="000000"/>
+                <w:sz w:val="24"/>
+                <w:szCs w:val="24"/>
+              </w:rPr>
+              <w:t xml:space="preserve"> </w:t>
+            </w:r>
+            <w:r>
+              <w:rPr>
+                <w:rFonts w:ascii="Arial Narrow" w:hAnsi="Arial Narrow" w:cs="Arial"/>
+                <w:color w:val="000000"/>
+                <w:sz w:val="24"/>
+                <w:szCs w:val="24"/>
+              </w:rPr>
+              <w:t xml:space="preserve">dan </w:t>
+            </w:r>
+            <w:proofErr w:type="spellStart"/>
+            <w:r>
+              <w:rPr>
+                <w:rFonts w:ascii="Arial Narrow" w:hAnsi="Arial Narrow" w:cs="Arial"/>
+                <w:color w:val="000000"/>
+                <w:sz w:val="24"/>
+                <w:szCs w:val="24"/>
+              </w:rPr>
+              <w:t>berkoordinasi</w:t>
+            </w:r>
+            <w:proofErr w:type="spellEnd"/>
+            <w:r>
+              <w:rPr>
+                <w:rFonts w:ascii="Arial Narrow" w:hAnsi="Arial Narrow" w:cs="Arial"/>
+                <w:color w:val="000000"/>
+                <w:sz w:val="24"/>
+                <w:szCs w:val="24"/>
+              </w:rPr>
+              <w:t xml:space="preserve"> </w:t>
+            </w:r>
+            <w:proofErr w:type="spellStart"/>
+            <w:r>
+              <w:rPr>
+                <w:rFonts w:ascii="Arial Narrow" w:hAnsi="Arial Narrow" w:cs="Arial"/>
+                <w:color w:val="000000"/>
+                <w:sz w:val="24"/>
+                <w:szCs w:val="24"/>
+              </w:rPr>
+              <w:t>dapat</w:t>
+            </w:r>
+            <w:proofErr w:type="spellEnd"/>
+            <w:r>
+              <w:rPr>
+                <w:rFonts w:ascii="Arial Narrow" w:hAnsi="Arial Narrow" w:cs="Arial"/>
+                <w:color w:val="000000"/>
+                <w:sz w:val="24"/>
+                <w:szCs w:val="24"/>
+              </w:rPr>
+              <w:t xml:space="preserve"> </w:t>
+            </w:r>
+            <w:proofErr w:type="spellStart"/>
+            <w:r>
+              <w:rPr>
+                <w:rFonts w:ascii="Arial Narrow" w:hAnsi="Arial Narrow" w:cs="Arial"/>
+                <w:color w:val="000000"/>
+                <w:sz w:val="24"/>
+                <w:szCs w:val="24"/>
+              </w:rPr>
+              <w:t>menghubungi</w:t>
+            </w:r>
+            <w:proofErr w:type="spellEnd"/>
+            <w:r>
+              <w:rPr>
+                <w:rFonts w:ascii="Arial Narrow" w:hAnsi="Arial Narrow" w:cs="Arial"/>
+                <w:color w:val="000000"/>
+                <w:sz w:val="24"/>
+                <w:szCs w:val="24"/>
+              </w:rPr>
+              <w:t xml:space="preserve"> </w:t>
+            </w:r>
+            <w:proofErr w:type="spellStart"/>
+            <w:r>
+              <w:rPr>
+                <w:rFonts w:ascii="Arial Narrow" w:hAnsi="Arial Narrow" w:cs="Arial"/>
+                <w:color w:val="000000"/>
+                <w:sz w:val="24"/>
+                <w:szCs w:val="24"/>
+              </w:rPr>
+              <w:t>penyidik</w:t>
+            </w:r>
+            <w:proofErr w:type="spellEnd"/>
+            <w:r>
+              <w:rPr>
+                <w:rFonts w:ascii="Arial Narrow" w:hAnsi="Arial Narrow" w:cs="Arial"/>
+                <w:color w:val="000000"/>
+                <w:sz w:val="24"/>
+                <w:szCs w:val="24"/>
+              </w:rPr>
+              <w:t xml:space="preserve"> </w:t>
+            </w:r>
+            <w:proofErr w:type="spellStart"/>
+            <w:r>
+              <w:rPr>
+                <w:rFonts w:ascii="Arial Narrow" w:hAnsi="Arial Narrow" w:cs="Arial"/>
+                <w:color w:val="000000"/>
+                <w:sz w:val="24"/>
+                <w:szCs w:val="24"/>
+              </w:rPr>
+              <w:t>atas</w:t>
+            </w:r>
+            <w:proofErr w:type="spellEnd"/>
+            <w:r>
+              <w:rPr>
+                <w:rFonts w:ascii="Arial Narrow" w:hAnsi="Arial Narrow" w:cs="Arial"/>
+                <w:color w:val="000000"/>
+                <w:sz w:val="24"/>
+                <w:szCs w:val="24"/>
+              </w:rPr>
+              <w:t xml:space="preserve"> nama ${</w:t>
+            </w:r>
+            <w:proofErr w:type="spellStart"/>
+            <w:r>
+              <w:rPr>
+                <w:rFonts w:ascii="Arial Narrow" w:hAnsi="Arial Narrow" w:cs="Arial"/>
+                <w:color w:val="000000"/>
+                <w:sz w:val="24"/>
+                <w:szCs w:val="24"/>
+              </w:rPr>
+              <w:t>investigatorName</w:t>
+            </w:r>
+            <w:proofErr w:type="spellEnd"/>
+            <w:r>
+              <w:rPr>
+                <w:rFonts w:ascii="Arial Narrow" w:hAnsi="Arial Narrow" w:cs="Arial"/>
+                <w:color w:val="000000"/>
+                <w:sz w:val="24"/>
+                <w:szCs w:val="24"/>
+              </w:rPr>
+              <w:t xml:space="preserve">} </w:t>
+            </w:r>
+            <w:proofErr w:type="spellStart"/>
+            <w:r>
+              <w:rPr>
+                <w:rFonts w:ascii="Arial Narrow" w:hAnsi="Arial Narrow" w:cs="Arial"/>
+                <w:color w:val="000000"/>
+                <w:sz w:val="24"/>
+                <w:szCs w:val="24"/>
+              </w:rPr>
+              <w:t>dengan</w:t>
+            </w:r>
+            <w:proofErr w:type="spellEnd"/>
+            <w:r>
+              <w:rPr>
+                <w:rFonts w:ascii="Arial Narrow" w:hAnsi="Arial Narrow" w:cs="Arial"/>
+                <w:color w:val="000000"/>
+                <w:sz w:val="24"/>
+                <w:szCs w:val="24"/>
+              </w:rPr>
+              <w:t xml:space="preserve"> </w:t>
+            </w:r>
+            <w:proofErr w:type="spellStart"/>
+            <w:r>
+              <w:rPr>
+                <w:rFonts w:ascii="Arial Narrow" w:hAnsi="Arial Narrow" w:cs="Arial"/>
+                <w:color w:val="000000"/>
+                <w:sz w:val="24"/>
+                <w:szCs w:val="24"/>
+              </w:rPr>
+              <w:t>nomor</w:t>
+            </w:r>
+            <w:proofErr w:type="spellEnd"/>
+            <w:r>
+              <w:rPr>
+                <w:rFonts w:ascii="Arial Narrow" w:hAnsi="Arial Narrow" w:cs="Arial"/>
+                <w:color w:val="000000"/>
+                <w:sz w:val="24"/>
+                <w:szCs w:val="24"/>
+              </w:rPr>
+              <w:t xml:space="preserve"> </w:t>
             </w:r>
             <w:r>
               <w:rPr>
@@ -3520,16 +5402,36 @@
                 <w:sz w:val="24"/>
                 <w:szCs w:val="24"/>
               </w:rPr>
-              <w:t>Hp</w:t>
-            </w:r>
-            <w:r>
-              <w:rPr>
-                <w:rFonts w:ascii="Arial Narrow" w:hAnsi="Arial Narrow" w:cs="Arial"/>
-                <w:color w:val="000000"/>
-                <w:sz w:val="24"/>
-                <w:szCs w:val="24"/>
-              </w:rPr>
-              <w:t>. ${investigatorPhoneNumber}.</w:t>
+              <w:t xml:space="preserve">handphone </w:t>
+            </w:r>
+            <w:r>
+              <w:rPr>
+                <w:rFonts w:ascii="Arial Narrow" w:hAnsi="Arial Narrow" w:cs="Arial"/>
+                <w:color w:val="000000"/>
+                <w:sz w:val="24"/>
+                <w:szCs w:val="24"/>
+              </w:rPr>
+              <w:t xml:space="preserve"> ${</w:t>
+            </w:r>
+            <w:proofErr w:type="spellStart"/>
+            <w:r>
+              <w:rPr>
+                <w:rFonts w:ascii="Arial Narrow" w:hAnsi="Arial Narrow" w:cs="Arial"/>
+                <w:color w:val="000000"/>
+                <w:sz w:val="24"/>
+                <w:szCs w:val="24"/>
+              </w:rPr>
+              <w:t>investigatorPhoneNumber</w:t>
+            </w:r>
+            <w:proofErr w:type="spellEnd"/>
+            <w:r>
+              <w:rPr>
+                <w:rFonts w:ascii="Arial Narrow" w:hAnsi="Arial Narrow" w:cs="Arial"/>
+                <w:color w:val="000000"/>
+                <w:sz w:val="24"/>
+                <w:szCs w:val="24"/>
+              </w:rPr>
+              <w:t>}.</w:t>
             </w:r>
           </w:p>
         </w:tc>
@@ -3627,14 +5529,205 @@
                 <w:szCs w:val="24"/>
               </w:rPr>
             </w:pPr>
-            <w:r>
-              <w:rPr>
-                <w:rFonts w:ascii="Arial Narrow" w:hAnsi="Arial Narrow" w:cs="Arial"/>
-                <w:color w:val="000000"/>
-                <w:sz w:val="24"/>
-                <w:szCs w:val="24"/>
-              </w:rPr>
-              <w:t>Demikian untuk menjadi maklum, atas perhatian dan kerjasamanya diucapkan terima kasih.</w:t>
+            <w:proofErr w:type="spellStart"/>
+            <w:r>
+              <w:rPr>
+                <w:rFonts w:ascii="Arial Narrow" w:hAnsi="Arial Narrow" w:cs="Arial"/>
+                <w:color w:val="000000"/>
+                <w:sz w:val="24"/>
+                <w:szCs w:val="24"/>
+              </w:rPr>
+              <w:t>Demikian</w:t>
+            </w:r>
+            <w:proofErr w:type="spellEnd"/>
+            <w:r>
+              <w:rPr>
+                <w:rFonts w:ascii="Arial Narrow" w:hAnsi="Arial Narrow" w:cs="Arial"/>
+                <w:color w:val="000000"/>
+                <w:sz w:val="24"/>
+                <w:szCs w:val="24"/>
+              </w:rPr>
+              <w:t xml:space="preserve"> </w:t>
+            </w:r>
+            <w:proofErr w:type="spellStart"/>
+            <w:r>
+              <w:rPr>
+                <w:rFonts w:ascii="Arial Narrow" w:hAnsi="Arial Narrow" w:cs="Arial"/>
+                <w:color w:val="000000"/>
+                <w:sz w:val="24"/>
+                <w:szCs w:val="24"/>
+              </w:rPr>
+              <w:t>untuk</w:t>
+            </w:r>
+            <w:proofErr w:type="spellEnd"/>
+            <w:r>
+              <w:rPr>
+                <w:rFonts w:ascii="Arial Narrow" w:hAnsi="Arial Narrow" w:cs="Arial"/>
+                <w:color w:val="000000"/>
+                <w:sz w:val="24"/>
+                <w:szCs w:val="24"/>
+              </w:rPr>
+              <w:t xml:space="preserve"> </w:t>
+            </w:r>
+            <w:proofErr w:type="spellStart"/>
+            <w:r>
+              <w:rPr>
+                <w:rFonts w:ascii="Arial Narrow" w:hAnsi="Arial Narrow" w:cs="Arial"/>
+                <w:color w:val="000000"/>
+                <w:sz w:val="24"/>
+                <w:szCs w:val="24"/>
+              </w:rPr>
+              <w:t>menjadi</w:t>
+            </w:r>
+            <w:proofErr w:type="spellEnd"/>
+            <w:r>
+              <w:rPr>
+                <w:rFonts w:ascii="Arial Narrow" w:hAnsi="Arial Narrow" w:cs="Arial"/>
+                <w:color w:val="000000"/>
+                <w:sz w:val="24"/>
+                <w:szCs w:val="24"/>
+              </w:rPr>
+              <w:t xml:space="preserve"> </w:t>
+            </w:r>
+            <w:proofErr w:type="spellStart"/>
+            <w:r>
+              <w:rPr>
+                <w:rFonts w:ascii="Arial Narrow" w:hAnsi="Arial Narrow" w:cs="Arial"/>
+                <w:color w:val="000000"/>
+                <w:sz w:val="24"/>
+                <w:szCs w:val="24"/>
+              </w:rPr>
+              <w:t>maklum</w:t>
+            </w:r>
+            <w:proofErr w:type="spellEnd"/>
+            <w:r>
+              <w:rPr>
+                <w:rFonts w:ascii="Arial Narrow" w:hAnsi="Arial Narrow" w:cs="Arial"/>
+                <w:color w:val="000000"/>
+                <w:sz w:val="24"/>
+                <w:szCs w:val="24"/>
+              </w:rPr>
+              <w:t xml:space="preserve">, </w:t>
+            </w:r>
+            <w:proofErr w:type="spellStart"/>
+            <w:r>
+              <w:rPr>
+                <w:rFonts w:ascii="Arial Narrow" w:hAnsi="Arial Narrow" w:cs="Arial"/>
+                <w:color w:val="000000"/>
+                <w:sz w:val="24"/>
+                <w:szCs w:val="24"/>
+              </w:rPr>
+              <w:t>atas</w:t>
+            </w:r>
+            <w:proofErr w:type="spellEnd"/>
+            <w:r>
+              <w:rPr>
+                <w:rFonts w:ascii="Arial Narrow" w:hAnsi="Arial Narrow" w:cs="Arial"/>
+                <w:color w:val="000000"/>
+                <w:sz w:val="24"/>
+                <w:szCs w:val="24"/>
+              </w:rPr>
+              <w:t xml:space="preserve"> </w:t>
+            </w:r>
+            <w:proofErr w:type="spellStart"/>
+            <w:r>
+              <w:rPr>
+                <w:rFonts w:ascii="Arial Narrow" w:hAnsi="Arial Narrow" w:cs="Arial"/>
+                <w:color w:val="000000"/>
+                <w:sz w:val="24"/>
+                <w:szCs w:val="24"/>
+              </w:rPr>
+              <w:t>perhatian</w:t>
+            </w:r>
+            <w:proofErr w:type="spellEnd"/>
+            <w:r>
+              <w:rPr>
+                <w:rFonts w:ascii="Arial Narrow" w:hAnsi="Arial Narrow" w:cs="Arial"/>
+                <w:color w:val="000000"/>
+                <w:sz w:val="24"/>
+                <w:szCs w:val="24"/>
+              </w:rPr>
+              <w:t xml:space="preserve"> dan </w:t>
+            </w:r>
+            <w:proofErr w:type="spellStart"/>
+            <w:r>
+              <w:rPr>
+                <w:rFonts w:ascii="Arial Narrow" w:hAnsi="Arial Narrow" w:cs="Arial"/>
+                <w:color w:val="000000"/>
+                <w:sz w:val="24"/>
+                <w:szCs w:val="24"/>
+              </w:rPr>
+              <w:t>kerjasamanya</w:t>
+            </w:r>
+            <w:proofErr w:type="spellEnd"/>
+            <w:r>
+              <w:rPr>
+                <w:rFonts w:ascii="Arial Narrow" w:hAnsi="Arial Narrow" w:cs="Arial"/>
+                <w:color w:val="000000"/>
+                <w:sz w:val="24"/>
+                <w:szCs w:val="24"/>
+              </w:rPr>
+              <w:t xml:space="preserve"> </w:t>
+            </w:r>
+            <w:proofErr w:type="spellStart"/>
+            <w:r>
+              <w:rPr>
+                <w:rFonts w:ascii="Arial Narrow" w:hAnsi="Arial Narrow" w:cs="Arial"/>
+                <w:color w:val="000000"/>
+                <w:sz w:val="24"/>
+                <w:szCs w:val="24"/>
+              </w:rPr>
+              <w:t>diucapkan</w:t>
+            </w:r>
+            <w:proofErr w:type="spellEnd"/>
+            <w:r>
+              <w:rPr>
+                <w:rFonts w:ascii="Arial Narrow" w:hAnsi="Arial Narrow" w:cs="Arial"/>
+                <w:color w:val="000000"/>
+                <w:sz w:val="24"/>
+                <w:szCs w:val="24"/>
+              </w:rPr>
+              <w:t xml:space="preserve"> </w:t>
+            </w:r>
+            <w:proofErr w:type="spellStart"/>
+            <w:r>
+              <w:rPr>
+                <w:rFonts w:ascii="Arial Narrow" w:hAnsi="Arial Narrow" w:cs="Arial"/>
+                <w:color w:val="000000"/>
+                <w:sz w:val="24"/>
+                <w:szCs w:val="24"/>
+              </w:rPr>
+              <w:t>terima</w:t>
+            </w:r>
+            <w:proofErr w:type="spellEnd"/>
+            <w:r>
+              <w:rPr>
+                <w:rFonts w:ascii="Arial Narrow" w:hAnsi="Arial Narrow" w:cs="Arial"/>
+                <w:color w:val="000000"/>
+                <w:sz w:val="24"/>
+                <w:szCs w:val="24"/>
+              </w:rPr>
+              <w:t xml:space="preserve"> </w:t>
+            </w:r>
+            <w:proofErr w:type="spellStart"/>
+            <w:r>
+              <w:rPr>
+                <w:rFonts w:ascii="Arial Narrow" w:hAnsi="Arial Narrow" w:cs="Arial"/>
+                <w:color w:val="000000"/>
+                <w:sz w:val="24"/>
+                <w:szCs w:val="24"/>
+              </w:rPr>
+              <w:t>kasih</w:t>
+            </w:r>
+            <w:proofErr w:type="spellEnd"/>
+            <w:r>
+              <w:rPr>
+                <w:rFonts w:ascii="Arial Narrow" w:hAnsi="Arial Narrow" w:cs="Arial"/>
+                <w:color w:val="000000"/>
+                <w:sz w:val="24"/>
+                <w:szCs w:val="24"/>
+              </w:rPr>
+              <w:t>.</w:t>
             </w:r>
           </w:p>
         </w:tc>
@@ -3803,13 +5896,23 @@
                       <w:szCs w:val="24"/>
                     </w:rPr>
                   </w:pPr>
+                  <w:proofErr w:type="spellStart"/>
                   <w:r>
                     <w:rPr>
                       <w:rFonts w:ascii="Arial Narrow" w:hAnsi="Arial Narrow"/>
                       <w:sz w:val="24"/>
                       <w:szCs w:val="24"/>
                     </w:rPr>
-                    <w:t>Tembusan :</w:t>
+                    <w:t>Tembusan</w:t>
+                  </w:r>
+                  <w:proofErr w:type="spellEnd"/>
+                  <w:r>
+                    <w:rPr>
+                      <w:rFonts w:ascii="Arial Narrow" w:hAnsi="Arial Narrow"/>
+                      <w:sz w:val="24"/>
+                      <w:szCs w:val="24"/>
+                    </w:rPr>
+                    <w:t xml:space="preserve"> :</w:t>
                   </w:r>
                 </w:p>
               </w:tc>
@@ -3841,6 +5944,7 @@
                     </w:rPr>
                     <w:t>${</w:t>
                   </w:r>
+                  <w:proofErr w:type="spellStart"/>
                   <w:r>
                     <w:rPr>
                       <w:rFonts w:ascii="Arial Narrow" w:eastAsia="Arial Narrow" w:hAnsi="Arial Narrow"/>
@@ -3901,6 +6005,7 @@
                     </w:rPr>
                     <w:t>teration</w:t>
                   </w:r>
+                  <w:proofErr w:type="spellEnd"/>
                   <w:r>
                     <w:rPr>
                       <w:rFonts w:ascii="Arial Narrow" w:eastAsia="Arial Narrow" w:hAnsi="Arial Narrow"/>
@@ -3931,6 +6036,7 @@
                     </w:rPr>
                     <w:t>${</w:t>
                   </w:r>
+                  <w:proofErr w:type="spellStart"/>
                   <w:r>
                     <w:rPr>
                       <w:rFonts w:ascii="Arial Narrow" w:eastAsia="Arial Narrow" w:hAnsi="Arial Narrow"/>
@@ -3981,6 +6087,7 @@
                     </w:rPr>
                     <w:t>ame</w:t>
                   </w:r>
+                  <w:proofErr w:type="spellEnd"/>
                   <w:r>
                     <w:rPr>
                       <w:rFonts w:ascii="Arial Narrow" w:eastAsia="Arial Narrow" w:hAnsi="Arial Narrow"/>
@@ -4063,7 +6170,29 @@
                       <w:szCs w:val="24"/>
                     </w:rPr>
                     <w:lastRenderedPageBreak/>
-                    <w:t>${signatoryHeadText}</w:t>
+                    <w:t>${</w:t>
+                  </w:r>
+                  <w:proofErr w:type="spellStart"/>
+                  <w:r>
+                    <w:rPr>
+                      <w:rFonts w:ascii="Arial Narrow" w:eastAsia="Arial Narrow" w:hAnsi="Arial Narrow"/>
+                      <w:bCs/>
+                      <w:color w:val="000000"/>
+                      <w:sz w:val="24"/>
+                      <w:szCs w:val="24"/>
+                    </w:rPr>
+                    <w:t>signatoryHeadText</w:t>
+                  </w:r>
+                  <w:proofErr w:type="spellEnd"/>
+                  <w:r>
+                    <w:rPr>
+                      <w:rFonts w:ascii="Arial Narrow" w:eastAsia="Arial Narrow" w:hAnsi="Arial Narrow"/>
+                      <w:bCs/>
+                      <w:color w:val="000000"/>
+                      <w:sz w:val="24"/>
+                      <w:szCs w:val="24"/>
+                    </w:rPr>
+                    <w:t>}</w:t>
                   </w:r>
                 </w:p>
               </w:tc>
@@ -4096,8 +6225,9 @@
                       <w:szCs w:val="24"/>
                     </w:rPr>
                     <w:lastRenderedPageBreak/>
-                    <w:t>${signatory</w:t>
-                  </w:r>
+                    <w:t>${</w:t>
+                  </w:r>
+                  <w:proofErr w:type="spellStart"/>
                   <w:r>
                     <w:rPr>
                       <w:rFonts w:ascii="Arial Narrow" w:eastAsia="Arial Narrow" w:hAnsi="Arial Narrow"/>
@@ -4106,8 +6236,19 @@
                       <w:sz w:val="24"/>
                       <w:szCs w:val="24"/>
                     </w:rPr>
+                    <w:t>signatory</w:t>
+                  </w:r>
+                  <w:r>
+                    <w:rPr>
+                      <w:rFonts w:ascii="Arial Narrow" w:eastAsia="Arial Narrow" w:hAnsi="Arial Narrow"/>
+                      <w:bCs/>
+                      <w:color w:val="000000"/>
+                      <w:sz w:val="24"/>
+                      <w:szCs w:val="24"/>
+                    </w:rPr>
                     <w:t>PositionName</w:t>
                   </w:r>
+                  <w:proofErr w:type="spellEnd"/>
                   <w:r>
                     <w:rPr>
                       <w:rFonts w:ascii="Arial Narrow" w:eastAsia="Arial Narrow" w:hAnsi="Arial Narrow"/>
@@ -4262,7 +6403,29 @@
                             <w:sz w:val="24"/>
                             <w:szCs w:val="24"/>
                           </w:rPr>
-                          <w:t>${signatoryName}</w:t>
+                          <w:t>${</w:t>
+                        </w:r>
+                        <w:proofErr w:type="spellStart"/>
+                        <w:r>
+                          <w:rPr>
+                            <w:rFonts w:ascii="Arial Narrow" w:eastAsia="Arial Narrow" w:hAnsi="Arial Narrow"/>
+                            <w:bCs/>
+                            <w:color w:val="000000"/>
+                            <w:sz w:val="24"/>
+                            <w:szCs w:val="24"/>
+                          </w:rPr>
+                          <w:t>signatoryName</w:t>
+                        </w:r>
+                        <w:proofErr w:type="spellEnd"/>
+                        <w:r>
+                          <w:rPr>
+                            <w:rFonts w:ascii="Arial Narrow" w:eastAsia="Arial Narrow" w:hAnsi="Arial Narrow"/>
+                            <w:bCs/>
+                            <w:color w:val="000000"/>
+                            <w:sz w:val="24"/>
+                            <w:szCs w:val="24"/>
+                          </w:rPr>
+                          <w:t>}</w:t>
                         </w:r>
                       </w:p>
                     </w:tc>
@@ -4298,7 +6461,29 @@
                             <w:sz w:val="24"/>
                             <w:szCs w:val="24"/>
                           </w:rPr>
-                          <w:t>${signatoryRankName}</w:t>
+                          <w:t>${</w:t>
+                        </w:r>
+                        <w:proofErr w:type="spellStart"/>
+                        <w:r>
+                          <w:rPr>
+                            <w:rFonts w:ascii="Arial Narrow" w:eastAsia="Arial Narrow" w:hAnsi="Arial Narrow"/>
+                            <w:bCs/>
+                            <w:color w:val="000000"/>
+                            <w:sz w:val="24"/>
+                            <w:szCs w:val="24"/>
+                          </w:rPr>
+                          <w:t>signatoryRankName</w:t>
+                        </w:r>
+                        <w:proofErr w:type="spellEnd"/>
+                        <w:r>
+                          <w:rPr>
+                            <w:rFonts w:ascii="Arial Narrow" w:eastAsia="Arial Narrow" w:hAnsi="Arial Narrow"/>
+                            <w:bCs/>
+                            <w:color w:val="000000"/>
+                            <w:sz w:val="24"/>
+                            <w:szCs w:val="24"/>
+                          </w:rPr>
+                          <w:t>}</w:t>
                         </w:r>
                         <w:r>
                           <w:rPr>
@@ -4320,6 +6505,7 @@
                           </w:rPr>
                           <w:t>${</w:t>
                         </w:r>
+                        <w:proofErr w:type="spellStart"/>
                         <w:r>
                           <w:rPr>
                             <w:rFonts w:ascii="Arial Narrow" w:eastAsia="Arial Narrow" w:hAnsi="Arial Narrow"/>
@@ -4330,6 +6516,7 @@
                           </w:rPr>
                           <w:t>signatoryRegisterNumber</w:t>
                         </w:r>
+                        <w:proofErr w:type="spellEnd"/>
                         <w:r>
                           <w:rPr>
                             <w:rFonts w:ascii="Arial Narrow" w:eastAsia="Arial Narrow" w:hAnsi="Arial Narrow"/>

</xml_diff>